<commit_message>
docs: campaign chapters in GDD, game design document and CLAUDE.md
</commit_message>
<xml_diff>
--- a/docs/ГДД_2026-09-30.docx
+++ b/docs/ГДД_2026-09-30.docx
@@ -1775,6 +1775,261 @@
     <w:p>
       <w:pPr>
         <w:pStyle w:val="af"/>
+        <w:numPr>
+          <w:ilvl w:val="0"/>
+          <w:numId w:val="14"/>
+        </w:numPr>
+        <w:spacing w:before="0" w:beforeAutospacing="0" w:after="0" w:afterAutospacing="0"/>
+        <w:jc w:val="both"/>
+      </w:pPr>
+      <w:r>
+        <w:rPr>
+          <w:color w:val="000000"/>
+        </w:rPr>
+        <w:t xml:space="preserve">Кампания разделена на 4 главы по 5 уровней. Каждая глава вводит одну новую механику на своей локации: первый уровень главы знакомит с ней, дальше сложность растет к финалу главы, а следующая глава начинается легче финала предыдущей.</w:t>
+      </w:r>
+    </w:p>
+    <w:p>
+      <w:pPr>
+        <w:pStyle w:val="af"/>
+        <w:numPr>
+          <w:ilvl w:val="1"/>
+          <w:numId w:val="14"/>
+        </w:numPr>
+        <w:spacing w:before="0" w:beforeAutospacing="0" w:after="0" w:afterAutospacing="0"/>
+        <w:jc w:val="both"/>
+      </w:pPr>
+      <w:r>
+        <w:rPr>
+          <w:color w:val="000000"/>
+        </w:rPr>
+        <w:t xml:space="preserve">Глава 1 «Первая уборка», уровни 1-5: основы и обмен;</w:t>
+      </w:r>
+    </w:p>
+    <w:p>
+      <w:pPr>
+        <w:pStyle w:val="af"/>
+        <w:numPr>
+          <w:ilvl w:val="1"/>
+          <w:numId w:val="14"/>
+        </w:numPr>
+        <w:spacing w:before="0" w:beforeAutospacing="0" w:after="0" w:afterAutospacing="0"/>
+        <w:jc w:val="both"/>
+      </w:pPr>
+      <w:r>
+        <w:rPr>
+          <w:color w:val="000000"/>
+        </w:rPr>
+        <w:t xml:space="preserve">Глава 2 «Всему свое место», уровни 6-10: полка-фильтр;</w:t>
+      </w:r>
+    </w:p>
+    <w:p>
+      <w:pPr>
+        <w:pStyle w:val="af"/>
+        <w:numPr>
+          <w:ilvl w:val="1"/>
+          <w:numId w:val="14"/>
+        </w:numPr>
+        <w:spacing w:before="0" w:beforeAutospacing="0" w:after="0" w:afterAutospacing="0"/>
+        <w:jc w:val="both"/>
+      </w:pPr>
+      <w:r>
+        <w:rPr>
+          <w:color w:val="000000"/>
+        </w:rPr>
+        <w:t xml:space="preserve">Глава 3 «Пыльные полки», уровни 11-15: закрытые полки;</w:t>
+      </w:r>
+    </w:p>
+    <w:p>
+      <w:pPr>
+        <w:pStyle w:val="af"/>
+        <w:numPr>
+          <w:ilvl w:val="1"/>
+          <w:numId w:val="14"/>
+        </w:numPr>
+        <w:spacing w:before="0" w:beforeAutospacing="0" w:after="0" w:afterAutospacing="0"/>
+        <w:jc w:val="both"/>
+      </w:pPr>
+      <w:r>
+        <w:rPr>
+          <w:color w:val="000000"/>
+        </w:rPr>
+        <w:t xml:space="preserve">Глава 4 «Цех игрушек», уровни 16-20: конвейеры. Названия глав пока черновые.</w:t>
+      </w:r>
+    </w:p>
+    <w:p>
+      <w:pPr>
+        <w:pStyle w:val="af"/>
+        <w:numPr>
+          <w:ilvl w:val="0"/>
+          <w:numId w:val="14"/>
+        </w:numPr>
+        <w:spacing w:before="0" w:beforeAutospacing="0" w:after="0" w:afterAutospacing="0"/>
+        <w:jc w:val="both"/>
+      </w:pPr>
+      <w:r>
+        <w:rPr>
+          <w:color w:val="000000"/>
+        </w:rPr>
+        <w:t xml:space="preserve">Полка-фильтр. На полке висит табличка с 1-3 типами предметов, положить на такую полку можно только эти типы. Предметы, которые уже лежат на полке, забираются как обычно, мэтч собирается как обычно.</w:t>
+      </w:r>
+    </w:p>
+    <w:p>
+      <w:pPr>
+        <w:pStyle w:val="af"/>
+        <w:numPr>
+          <w:ilvl w:val="1"/>
+          <w:numId w:val="14"/>
+        </w:numPr>
+        <w:spacing w:before="0" w:beforeAutospacing="0" w:after="0" w:afterAutospacing="0"/>
+        <w:jc w:val="both"/>
+      </w:pPr>
+      <w:r>
+        <w:rPr>
+          <w:color w:val="000000"/>
+        </w:rPr>
+        <w:t xml:space="preserve">Когда игрок берет предмет, неподходящие таблички тускнеют, а табличка под предметом покачивается;</w:t>
+      </w:r>
+    </w:p>
+    <w:p>
+      <w:pPr>
+        <w:pStyle w:val="af"/>
+        <w:numPr>
+          <w:ilvl w:val="1"/>
+          <w:numId w:val="14"/>
+        </w:numPr>
+        <w:spacing w:before="0" w:beforeAutospacing="0" w:after="0" w:afterAutospacing="0"/>
+        <w:jc w:val="both"/>
+      </w:pPr>
+      <w:r>
+        <w:rPr>
+          <w:color w:val="000000"/>
+        </w:rPr>
+        <w:t xml:space="preserve">Если отпустить предмет над неподходящей полкой, он возвращается назад, табличка вздрагивает и звучит мягкий стук;</w:t>
+      </w:r>
+    </w:p>
+    <w:p>
+      <w:pPr>
+        <w:pStyle w:val="af"/>
+        <w:numPr>
+          <w:ilvl w:val="1"/>
+          <w:numId w:val="14"/>
+        </w:numPr>
+        <w:spacing w:before="0" w:beforeAutospacing="0" w:after="0" w:afterAutospacing="0"/>
+        <w:jc w:val="both"/>
+      </w:pPr>
+      <w:r>
+        <w:rPr>
+          <w:color w:val="000000"/>
+        </w:rPr>
+        <w:t xml:space="preserve">На первом уровне главы показывается подсказка с правилом. В финале главы таблички принимают несколько типов по смыслу: игрушки и декор.</w:t>
+      </w:r>
+    </w:p>
+    <w:p>
+      <w:pPr>
+        <w:pStyle w:val="af"/>
+        <w:numPr>
+          <w:ilvl w:val="0"/>
+          <w:numId w:val="14"/>
+        </w:numPr>
+        <w:spacing w:before="0" w:beforeAutospacing="0" w:after="0" w:afterAutospacing="0"/>
+        <w:jc w:val="both"/>
+      </w:pPr>
+      <w:r>
+        <w:rPr>
+          <w:color w:val="000000"/>
+        </w:rPr>
+        <w:t xml:space="preserve">Номера уровней изменились. Уровни с закрытыми полками и конвейерами переехали на 11-15 и 16-20, в каждую из этих глав перед финалом добавлен новый уровень, в первую главу добавлен новый 5-й уровень. Прежние уровни 5-12 убраны из кампании. Прогресс игроков переносится: пройденные уровни получают новые номера, записи убранных уровней удаляются.</w:t>
+      </w:r>
+    </w:p>
+    <w:p>
+      <w:pPr>
+        <w:pStyle w:val="af"/>
+        <w:numPr>
+          <w:ilvl w:val="0"/>
+          <w:numId w:val="14"/>
+        </w:numPr>
+        <w:spacing w:before="0" w:beforeAutospacing="0" w:after="0" w:afterAutospacing="0"/>
+        <w:jc w:val="both"/>
+      </w:pPr>
+      <w:r>
+        <w:rPr>
+          <w:color w:val="000000"/>
+        </w:rPr>
+        <w:t xml:space="preserve">Уровень открывается, когда пройдены все предыдущие. Бесконечный уровень открывается после 5-го уровня, то есть после первой главы.</w:t>
+      </w:r>
+    </w:p>
+    <w:p>
+      <w:pPr>
+        <w:pStyle w:val="af"/>
+        <w:numPr>
+          <w:ilvl w:val="0"/>
+          <w:numId w:val="14"/>
+        </w:numPr>
+        <w:spacing w:before="0" w:beforeAutospacing="0" w:after="0" w:afterAutospacing="0"/>
+        <w:jc w:val="both"/>
+      </w:pPr>
+      <w:r>
+        <w:rPr>
+          <w:color w:val="000000"/>
+        </w:rPr>
+        <w:t xml:space="preserve">Меню выбора уровня разбито по главам. У каждой главы своя подложка с заголовком: номер и название главы, значок механики, ее описание, сколько уровней пройдено и сколько звезд собрано. Закрытая глава приглушена и показывает, после какого уровня она откроется.</w:t>
+      </w:r>
+    </w:p>
+    <w:p>
+      <w:pPr>
+        <w:pStyle w:val="af"/>
+        <w:numPr>
+          <w:ilvl w:val="1"/>
+          <w:numId w:val="14"/>
+        </w:numPr>
+        <w:spacing w:before="0" w:beforeAutospacing="0" w:after="0" w:afterAutospacing="0"/>
+        <w:jc w:val="both"/>
+      </w:pPr>
+      <w:r>
+        <w:rPr>
+          <w:color w:val="000000"/>
+        </w:rPr>
+        <w:t xml:space="preserve">На карточке уровня есть наклейка со значком механики и количеством ее элементов (сколько фильтров, закрытых полок или конвейеров), на первом уровне главы лента «НОВОЕ»;</w:t>
+      </w:r>
+    </w:p>
+    <w:p>
+      <w:pPr>
+        <w:pStyle w:val="af"/>
+        <w:numPr>
+          <w:ilvl w:val="1"/>
+          <w:numId w:val="14"/>
+        </w:numPr>
+        <w:spacing w:before="0" w:beforeAutospacing="0" w:after="0" w:afterAutospacing="0"/>
+        <w:jc w:val="both"/>
+      </w:pPr>
+      <w:r>
+        <w:rPr>
+          <w:color w:val="000000"/>
+        </w:rPr>
+        <w:t xml:space="preserve">Текущий уровень подсвечен, вместо рекорда на нем кнопка «Играть». При открытии меню список прокручивается к текущей главе;</w:t>
+      </w:r>
+    </w:p>
+    <w:p>
+      <w:pPr>
+        <w:pStyle w:val="af"/>
+        <w:numPr>
+          <w:ilvl w:val="1"/>
+          <w:numId w:val="14"/>
+        </w:numPr>
+        <w:spacing w:before="0" w:beforeAutospacing="0" w:after="0" w:afterAutospacing="0"/>
+        <w:jc w:val="both"/>
+      </w:pPr>
+      <w:r>
+        <w:rPr>
+          <w:color w:val="000000"/>
+        </w:rPr>
+        <w:t xml:space="preserve">Карточка бесконечного уровня стоит над списком глав и видна всегда.</w:t>
+      </w:r>
+    </w:p>
+    <w:p>
+      <w:pPr>
+        <w:pStyle w:val="af"/>
         <w:spacing w:before="0" w:beforeAutospacing="0" w:after="0" w:afterAutospacing="0"/>
       </w:pPr>
     </w:p>
@@ -4729,6 +4984,2973 @@
           <w:color w:val="000000"/>
         </w:rPr>
         <w:t xml:space="preserve">Локация это новый набор шкафов и полок. Для уровней 13-16 указано стартовое количество предметов. Время на звезды стартовое и будет уточняться по плейтестам. Цель баланса: первый уровень с первой попытки проходят не меньше 90% игроков, 12-й уровень 60-70%.</w:t>
+      </w:r>
+    </w:p>
+    <w:p>
+      <w:pPr>
+        <w:pStyle w:val="af"/>
+        <w:spacing w:before="0" w:beforeAutospacing="0" w:after="0" w:afterAutospacing="0"/>
+        <w:ind w:firstLine="709"/>
+        <w:jc w:val="both"/>
+      </w:pPr>
+      <w:r>
+        <w:rPr>
+          <w:color w:val="000000"/>
+        </w:rPr>
+        <w:t xml:space="preserve">Таблица выше описывает кампанию до разделения на главы. Ниже актуальные уровни по главам.</w:t>
+      </w:r>
+    </w:p>
+    <w:tbl>
+      <w:tblPr>
+        <w:tblW w:w="9355" w:type="dxa"/>
+        <w:jc w:val="center"/>
+        <w:tblBorders>
+          <w:top w:val="single" w:sz="4" w:space="0" w:color="000000"/>
+          <w:left w:val="single" w:sz="4" w:space="0" w:color="000000"/>
+          <w:bottom w:val="single" w:sz="4" w:space="0" w:color="000000"/>
+          <w:right w:val="single" w:sz="4" w:space="0" w:color="000000"/>
+          <w:insideH w:val="single" w:sz="4" w:space="0" w:color="000000"/>
+          <w:insideV w:val="single" w:sz="4" w:space="0" w:color="000000"/>
+        </w:tblBorders>
+        <w:tblLayout w:type="fixed"/>
+        <w:tblLook w:val="04A0" w:firstRow="1" w:lastRow="0" w:firstColumn="1" w:lastColumn="0" w:noHBand="0" w:noVBand="1"/>
+      </w:tblPr>
+      <w:tblGrid>
+        <w:gridCol w:w="1150"/>
+        <w:gridCol w:w="1150"/>
+        <w:gridCol w:w="2505"/>
+        <w:gridCol w:w="1350"/>
+        <w:gridCol w:w="1100"/>
+        <w:gridCol w:w="1100"/>
+        <w:gridCol w:w="1000"/>
+      </w:tblGrid>
+      <w:tr>
+        <w:trPr>
+          <w:tblHeader/>
+        </w:trPr>
+        <w:tc>
+          <w:tcPr>
+            <w:tcW w:w="1150" w:type="dxa"/>
+          </w:tcPr>
+          <w:p>
+            <w:pPr>
+              <w:pStyle w:val="af"/>
+              <w:spacing w:before="0" w:beforeAutospacing="0" w:after="0" w:afterAutospacing="0"/>
+              <w:jc w:val="center"/>
+            </w:pPr>
+            <w:r>
+              <w:rPr>
+                <w:b/>
+                <w:color w:val="000000"/>
+                <w:sz w:val="22"/>
+              </w:rPr>
+              <w:t xml:space="preserve">Уровень</w:t>
+            </w:r>
+          </w:p>
+        </w:tc>
+        <w:tc>
+          <w:tcPr>
+            <w:tcW w:w="1150" w:type="dxa"/>
+          </w:tcPr>
+          <w:p>
+            <w:pPr>
+              <w:pStyle w:val="af"/>
+              <w:spacing w:before="0" w:beforeAutospacing="0" w:after="0" w:afterAutospacing="0"/>
+              <w:jc w:val="center"/>
+            </w:pPr>
+            <w:r>
+              <w:rPr>
+                <w:b/>
+                <w:color w:val="000000"/>
+                <w:sz w:val="22"/>
+              </w:rPr>
+              <w:t xml:space="preserve">Глава</w:t>
+            </w:r>
+          </w:p>
+        </w:tc>
+        <w:tc>
+          <w:tcPr>
+            <w:tcW w:w="2505" w:type="dxa"/>
+          </w:tcPr>
+          <w:p>
+            <w:pPr>
+              <w:pStyle w:val="af"/>
+              <w:spacing w:before="0" w:beforeAutospacing="0" w:after="0" w:afterAutospacing="0"/>
+              <w:jc w:val="center"/>
+            </w:pPr>
+            <w:r>
+              <w:rPr>
+                <w:b/>
+                <w:color w:val="000000"/>
+                <w:sz w:val="22"/>
+              </w:rPr>
+              <w:t xml:space="preserve">Что нового</w:t>
+            </w:r>
+          </w:p>
+        </w:tc>
+        <w:tc>
+          <w:tcPr>
+            <w:tcW w:w="1350" w:type="dxa"/>
+          </w:tcPr>
+          <w:p>
+            <w:pPr>
+              <w:pStyle w:val="af"/>
+              <w:spacing w:before="0" w:beforeAutospacing="0" w:after="0" w:afterAutospacing="0"/>
+              <w:jc w:val="center"/>
+            </w:pPr>
+            <w:r>
+              <w:rPr>
+                <w:b/>
+                <w:color w:val="000000"/>
+                <w:sz w:val="22"/>
+              </w:rPr>
+              <w:t xml:space="preserve">Предметов</w:t>
+            </w:r>
+          </w:p>
+        </w:tc>
+        <w:tc>
+          <w:tcPr>
+            <w:tcW w:w="1100" w:type="dxa"/>
+          </w:tcPr>
+          <w:p>
+            <w:pPr>
+              <w:pStyle w:val="af"/>
+              <w:spacing w:before="0" w:beforeAutospacing="0" w:after="0" w:afterAutospacing="0"/>
+              <w:jc w:val="center"/>
+            </w:pPr>
+            <w:r>
+              <w:rPr>
+                <w:b/>
+                <w:color w:val="000000"/>
+                <w:sz w:val="22"/>
+              </w:rPr>
+              <w:t xml:space="preserve">3 звезды</w:t>
+            </w:r>
+          </w:p>
+        </w:tc>
+        <w:tc>
+          <w:tcPr>
+            <w:tcW w:w="1100" w:type="dxa"/>
+          </w:tcPr>
+          <w:p>
+            <w:pPr>
+              <w:pStyle w:val="af"/>
+              <w:spacing w:before="0" w:beforeAutospacing="0" w:after="0" w:afterAutospacing="0"/>
+              <w:jc w:val="center"/>
+            </w:pPr>
+            <w:r>
+              <w:rPr>
+                <w:b/>
+                <w:color w:val="000000"/>
+                <w:sz w:val="22"/>
+              </w:rPr>
+              <w:t xml:space="preserve">2 звезды</w:t>
+            </w:r>
+          </w:p>
+        </w:tc>
+        <w:tc>
+          <w:tcPr>
+            <w:tcW w:w="1000" w:type="dxa"/>
+          </w:tcPr>
+          <w:p>
+            <w:pPr>
+              <w:pStyle w:val="af"/>
+              <w:spacing w:before="0" w:beforeAutospacing="0" w:after="0" w:afterAutospacing="0"/>
+              <w:jc w:val="center"/>
+            </w:pPr>
+            <w:r>
+              <w:rPr>
+                <w:b/>
+                <w:color w:val="000000"/>
+                <w:sz w:val="22"/>
+              </w:rPr>
+              <w:t xml:space="preserve">Лимит</w:t>
+            </w:r>
+          </w:p>
+        </w:tc>
+      </w:tr>
+      <w:tr>
+        <w:trPr>
+          <w:cantSplit/>
+        </w:trPr>
+        <w:tc>
+          <w:tcPr>
+            <w:tcW w:w="1150" w:type="dxa"/>
+          </w:tcPr>
+          <w:p>
+            <w:pPr>
+              <w:pStyle w:val="af"/>
+              <w:spacing w:before="0" w:beforeAutospacing="0" w:after="0" w:afterAutospacing="0"/>
+              <w:jc w:val="center"/>
+            </w:pPr>
+            <w:r>
+              <w:rPr>
+                <w:color w:val="000000"/>
+                <w:sz w:val="22"/>
+              </w:rPr>
+              <w:t xml:space="preserve">1</w:t>
+            </w:r>
+          </w:p>
+        </w:tc>
+        <w:tc>
+          <w:tcPr>
+            <w:tcW w:w="1150" w:type="dxa"/>
+          </w:tcPr>
+          <w:p>
+            <w:pPr>
+              <w:pStyle w:val="af"/>
+              <w:spacing w:before="0" w:beforeAutospacing="0" w:after="0" w:afterAutospacing="0"/>
+              <w:jc w:val="center"/>
+            </w:pPr>
+            <w:r>
+              <w:rPr>
+                <w:color w:val="000000"/>
+                <w:sz w:val="22"/>
+              </w:rPr>
+              <w:t xml:space="preserve">1</w:t>
+            </w:r>
+          </w:p>
+        </w:tc>
+        <w:tc>
+          <w:tcPr>
+            <w:tcW w:w="2505" w:type="dxa"/>
+          </w:tcPr>
+          <w:p>
+            <w:pPr>
+              <w:pStyle w:val="af"/>
+              <w:spacing w:before="0" w:beforeAutospacing="0" w:after="0" w:afterAutospacing="0"/>
+              <w:jc w:val="left"/>
+            </w:pPr>
+            <w:r>
+              <w:rPr>
+                <w:color w:val="000000"/>
+                <w:sz w:val="22"/>
+              </w:rPr>
+              <w:t xml:space="preserve">мяч, мишка, растение, лампа</w:t>
+            </w:r>
+          </w:p>
+        </w:tc>
+        <w:tc>
+          <w:tcPr>
+            <w:tcW w:w="1350" w:type="dxa"/>
+          </w:tcPr>
+          <w:p>
+            <w:pPr>
+              <w:pStyle w:val="af"/>
+              <w:spacing w:before="0" w:beforeAutospacing="0" w:after="0" w:afterAutospacing="0"/>
+              <w:jc w:val="center"/>
+            </w:pPr>
+            <w:r>
+              <w:rPr>
+                <w:color w:val="000000"/>
+                <w:sz w:val="22"/>
+              </w:rPr>
+              <w:t xml:space="preserve">51</w:t>
+            </w:r>
+          </w:p>
+        </w:tc>
+        <w:tc>
+          <w:tcPr>
+            <w:tcW w:w="1100" w:type="dxa"/>
+          </w:tcPr>
+          <w:p>
+            <w:pPr>
+              <w:pStyle w:val="af"/>
+              <w:spacing w:before="0" w:beforeAutospacing="0" w:after="0" w:afterAutospacing="0"/>
+              <w:jc w:val="center"/>
+            </w:pPr>
+            <w:r>
+              <w:rPr>
+                <w:color w:val="000000"/>
+                <w:sz w:val="22"/>
+              </w:rPr>
+              <w:t xml:space="preserve">0:25</w:t>
+            </w:r>
+          </w:p>
+        </w:tc>
+        <w:tc>
+          <w:tcPr>
+            <w:tcW w:w="1100" w:type="dxa"/>
+          </w:tcPr>
+          <w:p>
+            <w:pPr>
+              <w:pStyle w:val="af"/>
+              <w:spacing w:before="0" w:beforeAutospacing="0" w:after="0" w:afterAutospacing="0"/>
+              <w:jc w:val="center"/>
+            </w:pPr>
+            <w:r>
+              <w:rPr>
+                <w:color w:val="000000"/>
+                <w:sz w:val="22"/>
+              </w:rPr>
+              <w:t xml:space="preserve">0:40</w:t>
+            </w:r>
+          </w:p>
+        </w:tc>
+        <w:tc>
+          <w:tcPr>
+            <w:tcW w:w="1000" w:type="dxa"/>
+          </w:tcPr>
+          <w:p>
+            <w:pPr>
+              <w:pStyle w:val="af"/>
+              <w:spacing w:before="0" w:beforeAutospacing="0" w:after="0" w:afterAutospacing="0"/>
+              <w:jc w:val="center"/>
+            </w:pPr>
+            <w:r>
+              <w:rPr>
+                <w:color w:val="000000"/>
+                <w:sz w:val="22"/>
+              </w:rPr>
+              <w:t xml:space="preserve">0:55</w:t>
+            </w:r>
+          </w:p>
+        </w:tc>
+      </w:tr>
+      <w:tr>
+        <w:trPr>
+          <w:cantSplit/>
+        </w:trPr>
+        <w:tc>
+          <w:tcPr>
+            <w:tcW w:w="1150" w:type="dxa"/>
+          </w:tcPr>
+          <w:p>
+            <w:pPr>
+              <w:pStyle w:val="af"/>
+              <w:spacing w:before="0" w:beforeAutospacing="0" w:after="0" w:afterAutospacing="0"/>
+              <w:jc w:val="center"/>
+            </w:pPr>
+            <w:r>
+              <w:rPr>
+                <w:color w:val="000000"/>
+                <w:sz w:val="22"/>
+              </w:rPr>
+              <w:t xml:space="preserve">2</w:t>
+            </w:r>
+          </w:p>
+        </w:tc>
+        <w:tc>
+          <w:tcPr>
+            <w:tcW w:w="1150" w:type="dxa"/>
+          </w:tcPr>
+          <w:p>
+            <w:pPr>
+              <w:pStyle w:val="af"/>
+              <w:spacing w:before="0" w:beforeAutospacing="0" w:after="0" w:afterAutospacing="0"/>
+              <w:jc w:val="center"/>
+            </w:pPr>
+            <w:r>
+              <w:rPr>
+                <w:color w:val="000000"/>
+                <w:sz w:val="22"/>
+              </w:rPr>
+              <w:t xml:space="preserve">1</w:t>
+            </w:r>
+          </w:p>
+        </w:tc>
+        <w:tc>
+          <w:tcPr>
+            <w:tcW w:w="2505" w:type="dxa"/>
+          </w:tcPr>
+          <w:p>
+            <w:pPr>
+              <w:pStyle w:val="af"/>
+              <w:spacing w:before="0" w:beforeAutospacing="0" w:after="0" w:afterAutospacing="0"/>
+              <w:jc w:val="left"/>
+            </w:pPr>
+            <w:r>
+              <w:rPr>
+                <w:color w:val="000000"/>
+                <w:sz w:val="22"/>
+              </w:rPr>
+              <w:t xml:space="preserve">+ глобус</w:t>
+            </w:r>
+          </w:p>
+        </w:tc>
+        <w:tc>
+          <w:tcPr>
+            <w:tcW w:w="1350" w:type="dxa"/>
+          </w:tcPr>
+          <w:p>
+            <w:pPr>
+              <w:pStyle w:val="af"/>
+              <w:spacing w:before="0" w:beforeAutospacing="0" w:after="0" w:afterAutospacing="0"/>
+              <w:jc w:val="center"/>
+            </w:pPr>
+            <w:r>
+              <w:rPr>
+                <w:color w:val="000000"/>
+                <w:sz w:val="22"/>
+              </w:rPr>
+              <w:t xml:space="preserve">57</w:t>
+            </w:r>
+          </w:p>
+        </w:tc>
+        <w:tc>
+          <w:tcPr>
+            <w:tcW w:w="1100" w:type="dxa"/>
+          </w:tcPr>
+          <w:p>
+            <w:pPr>
+              <w:pStyle w:val="af"/>
+              <w:spacing w:before="0" w:beforeAutospacing="0" w:after="0" w:afterAutospacing="0"/>
+              <w:jc w:val="center"/>
+            </w:pPr>
+            <w:r>
+              <w:rPr>
+                <w:color w:val="000000"/>
+                <w:sz w:val="22"/>
+              </w:rPr>
+              <w:t xml:space="preserve">0:30</w:t>
+            </w:r>
+          </w:p>
+        </w:tc>
+        <w:tc>
+          <w:tcPr>
+            <w:tcW w:w="1100" w:type="dxa"/>
+          </w:tcPr>
+          <w:p>
+            <w:pPr>
+              <w:pStyle w:val="af"/>
+              <w:spacing w:before="0" w:beforeAutospacing="0" w:after="0" w:afterAutospacing="0"/>
+              <w:jc w:val="center"/>
+            </w:pPr>
+            <w:r>
+              <w:rPr>
+                <w:color w:val="000000"/>
+                <w:sz w:val="22"/>
+              </w:rPr>
+              <w:t xml:space="preserve">0:45</w:t>
+            </w:r>
+          </w:p>
+        </w:tc>
+        <w:tc>
+          <w:tcPr>
+            <w:tcW w:w="1000" w:type="dxa"/>
+          </w:tcPr>
+          <w:p>
+            <w:pPr>
+              <w:pStyle w:val="af"/>
+              <w:spacing w:before="0" w:beforeAutospacing="0" w:after="0" w:afterAutospacing="0"/>
+              <w:jc w:val="center"/>
+            </w:pPr>
+            <w:r>
+              <w:rPr>
+                <w:color w:val="000000"/>
+                <w:sz w:val="22"/>
+              </w:rPr>
+              <w:t xml:space="preserve">1:00</w:t>
+            </w:r>
+          </w:p>
+        </w:tc>
+      </w:tr>
+      <w:tr>
+        <w:trPr>
+          <w:cantSplit/>
+        </w:trPr>
+        <w:tc>
+          <w:tcPr>
+            <w:tcW w:w="1150" w:type="dxa"/>
+          </w:tcPr>
+          <w:p>
+            <w:pPr>
+              <w:pStyle w:val="af"/>
+              <w:spacing w:before="0" w:beforeAutospacing="0" w:after="0" w:afterAutospacing="0"/>
+              <w:jc w:val="center"/>
+            </w:pPr>
+            <w:r>
+              <w:rPr>
+                <w:color w:val="000000"/>
+                <w:sz w:val="22"/>
+              </w:rPr>
+              <w:t xml:space="preserve">3</w:t>
+            </w:r>
+          </w:p>
+        </w:tc>
+        <w:tc>
+          <w:tcPr>
+            <w:tcW w:w="1150" w:type="dxa"/>
+          </w:tcPr>
+          <w:p>
+            <w:pPr>
+              <w:pStyle w:val="af"/>
+              <w:spacing w:before="0" w:beforeAutospacing="0" w:after="0" w:afterAutospacing="0"/>
+              <w:jc w:val="center"/>
+            </w:pPr>
+            <w:r>
+              <w:rPr>
+                <w:color w:val="000000"/>
+                <w:sz w:val="22"/>
+              </w:rPr>
+              <w:t xml:space="preserve">1</w:t>
+            </w:r>
+          </w:p>
+        </w:tc>
+        <w:tc>
+          <w:tcPr>
+            <w:tcW w:w="2505" w:type="dxa"/>
+          </w:tcPr>
+          <w:p>
+            <w:pPr>
+              <w:pStyle w:val="af"/>
+              <w:spacing w:before="0" w:beforeAutospacing="0" w:after="0" w:afterAutospacing="0"/>
+              <w:jc w:val="left"/>
+            </w:pPr>
+            <w:r>
+              <w:rPr>
+                <w:color w:val="000000"/>
+                <w:sz w:val="22"/>
+              </w:rPr>
+              <w:t xml:space="preserve"/>
+            </w:r>
+          </w:p>
+        </w:tc>
+        <w:tc>
+          <w:tcPr>
+            <w:tcW w:w="1350" w:type="dxa"/>
+          </w:tcPr>
+          <w:p>
+            <w:pPr>
+              <w:pStyle w:val="af"/>
+              <w:spacing w:before="0" w:beforeAutospacing="0" w:after="0" w:afterAutospacing="0"/>
+              <w:jc w:val="center"/>
+            </w:pPr>
+            <w:r>
+              <w:rPr>
+                <w:color w:val="000000"/>
+                <w:sz w:val="22"/>
+              </w:rPr>
+              <w:t xml:space="preserve">60</w:t>
+            </w:r>
+          </w:p>
+        </w:tc>
+        <w:tc>
+          <w:tcPr>
+            <w:tcW w:w="1100" w:type="dxa"/>
+          </w:tcPr>
+          <w:p>
+            <w:pPr>
+              <w:pStyle w:val="af"/>
+              <w:spacing w:before="0" w:beforeAutospacing="0" w:after="0" w:afterAutospacing="0"/>
+              <w:jc w:val="center"/>
+            </w:pPr>
+            <w:r>
+              <w:rPr>
+                <w:color w:val="000000"/>
+                <w:sz w:val="22"/>
+              </w:rPr>
+              <w:t xml:space="preserve">0:30</w:t>
+            </w:r>
+          </w:p>
+        </w:tc>
+        <w:tc>
+          <w:tcPr>
+            <w:tcW w:w="1100" w:type="dxa"/>
+          </w:tcPr>
+          <w:p>
+            <w:pPr>
+              <w:pStyle w:val="af"/>
+              <w:spacing w:before="0" w:beforeAutospacing="0" w:after="0" w:afterAutospacing="0"/>
+              <w:jc w:val="center"/>
+            </w:pPr>
+            <w:r>
+              <w:rPr>
+                <w:color w:val="000000"/>
+                <w:sz w:val="22"/>
+              </w:rPr>
+              <w:t xml:space="preserve">0:45</w:t>
+            </w:r>
+          </w:p>
+        </w:tc>
+        <w:tc>
+          <w:tcPr>
+            <w:tcW w:w="1000" w:type="dxa"/>
+          </w:tcPr>
+          <w:p>
+            <w:pPr>
+              <w:pStyle w:val="af"/>
+              <w:spacing w:before="0" w:beforeAutospacing="0" w:after="0" w:afterAutospacing="0"/>
+              <w:jc w:val="center"/>
+            </w:pPr>
+            <w:r>
+              <w:rPr>
+                <w:color w:val="000000"/>
+                <w:sz w:val="22"/>
+              </w:rPr>
+              <w:t xml:space="preserve">1:00</w:t>
+            </w:r>
+          </w:p>
+        </w:tc>
+      </w:tr>
+      <w:tr>
+        <w:trPr>
+          <w:cantSplit/>
+        </w:trPr>
+        <w:tc>
+          <w:tcPr>
+            <w:tcW w:w="1150" w:type="dxa"/>
+          </w:tcPr>
+          <w:p>
+            <w:pPr>
+              <w:pStyle w:val="af"/>
+              <w:spacing w:before="0" w:beforeAutospacing="0" w:after="0" w:afterAutospacing="0"/>
+              <w:jc w:val="center"/>
+            </w:pPr>
+            <w:r>
+              <w:rPr>
+                <w:color w:val="000000"/>
+                <w:sz w:val="22"/>
+              </w:rPr>
+              <w:t xml:space="preserve">4</w:t>
+            </w:r>
+          </w:p>
+        </w:tc>
+        <w:tc>
+          <w:tcPr>
+            <w:tcW w:w="1150" w:type="dxa"/>
+          </w:tcPr>
+          <w:p>
+            <w:pPr>
+              <w:pStyle w:val="af"/>
+              <w:spacing w:before="0" w:beforeAutospacing="0" w:after="0" w:afterAutospacing="0"/>
+              <w:jc w:val="center"/>
+            </w:pPr>
+            <w:r>
+              <w:rPr>
+                <w:color w:val="000000"/>
+                <w:sz w:val="22"/>
+              </w:rPr>
+              <w:t xml:space="preserve">1</w:t>
+            </w:r>
+          </w:p>
+        </w:tc>
+        <w:tc>
+          <w:tcPr>
+            <w:tcW w:w="2505" w:type="dxa"/>
+          </w:tcPr>
+          <w:p>
+            <w:pPr>
+              <w:pStyle w:val="af"/>
+              <w:spacing w:before="0" w:beforeAutospacing="0" w:after="0" w:afterAutospacing="0"/>
+              <w:jc w:val="left"/>
+            </w:pPr>
+            <w:r>
+              <w:rPr>
+                <w:color w:val="000000"/>
+                <w:sz w:val="22"/>
+              </w:rPr>
+              <w:t xml:space="preserve">+ декор</w:t>
+            </w:r>
+          </w:p>
+        </w:tc>
+        <w:tc>
+          <w:tcPr>
+            <w:tcW w:w="1350" w:type="dxa"/>
+          </w:tcPr>
+          <w:p>
+            <w:pPr>
+              <w:pStyle w:val="af"/>
+              <w:spacing w:before="0" w:beforeAutospacing="0" w:after="0" w:afterAutospacing="0"/>
+              <w:jc w:val="center"/>
+            </w:pPr>
+            <w:r>
+              <w:rPr>
+                <w:color w:val="000000"/>
+                <w:sz w:val="22"/>
+              </w:rPr>
+              <w:t xml:space="preserve">66</w:t>
+            </w:r>
+          </w:p>
+        </w:tc>
+        <w:tc>
+          <w:tcPr>
+            <w:tcW w:w="1100" w:type="dxa"/>
+          </w:tcPr>
+          <w:p>
+            <w:pPr>
+              <w:pStyle w:val="af"/>
+              <w:spacing w:before="0" w:beforeAutospacing="0" w:after="0" w:afterAutospacing="0"/>
+              <w:jc w:val="center"/>
+            </w:pPr>
+            <w:r>
+              <w:rPr>
+                <w:color w:val="000000"/>
+                <w:sz w:val="22"/>
+              </w:rPr>
+              <w:t xml:space="preserve">0:35</w:t>
+            </w:r>
+          </w:p>
+        </w:tc>
+        <w:tc>
+          <w:tcPr>
+            <w:tcW w:w="1100" w:type="dxa"/>
+          </w:tcPr>
+          <w:p>
+            <w:pPr>
+              <w:pStyle w:val="af"/>
+              <w:spacing w:before="0" w:beforeAutospacing="0" w:after="0" w:afterAutospacing="0"/>
+              <w:jc w:val="center"/>
+            </w:pPr>
+            <w:r>
+              <w:rPr>
+                <w:color w:val="000000"/>
+                <w:sz w:val="22"/>
+              </w:rPr>
+              <w:t xml:space="preserve">0:55</w:t>
+            </w:r>
+          </w:p>
+        </w:tc>
+        <w:tc>
+          <w:tcPr>
+            <w:tcW w:w="1000" w:type="dxa"/>
+          </w:tcPr>
+          <w:p>
+            <w:pPr>
+              <w:pStyle w:val="af"/>
+              <w:spacing w:before="0" w:beforeAutospacing="0" w:after="0" w:afterAutospacing="0"/>
+              <w:jc w:val="center"/>
+            </w:pPr>
+            <w:r>
+              <w:rPr>
+                <w:color w:val="000000"/>
+                <w:sz w:val="22"/>
+              </w:rPr>
+              <w:t xml:space="preserve">1:05</w:t>
+            </w:r>
+          </w:p>
+        </w:tc>
+      </w:tr>
+      <w:tr>
+        <w:trPr>
+          <w:cantSplit/>
+        </w:trPr>
+        <w:tc>
+          <w:tcPr>
+            <w:tcW w:w="1150" w:type="dxa"/>
+          </w:tcPr>
+          <w:p>
+            <w:pPr>
+              <w:pStyle w:val="af"/>
+              <w:spacing w:before="0" w:beforeAutospacing="0" w:after="0" w:afterAutospacing="0"/>
+              <w:jc w:val="center"/>
+            </w:pPr>
+            <w:r>
+              <w:rPr>
+                <w:color w:val="000000"/>
+                <w:sz w:val="22"/>
+              </w:rPr>
+              <w:t xml:space="preserve">5</w:t>
+            </w:r>
+          </w:p>
+        </w:tc>
+        <w:tc>
+          <w:tcPr>
+            <w:tcW w:w="1150" w:type="dxa"/>
+          </w:tcPr>
+          <w:p>
+            <w:pPr>
+              <w:pStyle w:val="af"/>
+              <w:spacing w:before="0" w:beforeAutospacing="0" w:after="0" w:afterAutospacing="0"/>
+              <w:jc w:val="center"/>
+            </w:pPr>
+            <w:r>
+              <w:rPr>
+                <w:color w:val="000000"/>
+                <w:sz w:val="22"/>
+              </w:rPr>
+              <w:t xml:space="preserve">1</w:t>
+            </w:r>
+          </w:p>
+        </w:tc>
+        <w:tc>
+          <w:tcPr>
+            <w:tcW w:w="2505" w:type="dxa"/>
+          </w:tcPr>
+          <w:p>
+            <w:pPr>
+              <w:pStyle w:val="af"/>
+              <w:spacing w:before="0" w:beforeAutospacing="0" w:after="0" w:afterAutospacing="0"/>
+              <w:jc w:val="left"/>
+            </w:pPr>
+            <w:r>
+              <w:rPr>
+                <w:color w:val="000000"/>
+                <w:sz w:val="22"/>
+              </w:rPr>
+              <w:t xml:space="preserve"/>
+            </w:r>
+          </w:p>
+        </w:tc>
+        <w:tc>
+          <w:tcPr>
+            <w:tcW w:w="1350" w:type="dxa"/>
+          </w:tcPr>
+          <w:p>
+            <w:pPr>
+              <w:pStyle w:val="af"/>
+              <w:spacing w:before="0" w:beforeAutospacing="0" w:after="0" w:afterAutospacing="0"/>
+              <w:jc w:val="center"/>
+            </w:pPr>
+            <w:r>
+              <w:rPr>
+                <w:color w:val="000000"/>
+                <w:sz w:val="22"/>
+              </w:rPr>
+              <w:t xml:space="preserve">72</w:t>
+            </w:r>
+          </w:p>
+        </w:tc>
+        <w:tc>
+          <w:tcPr>
+            <w:tcW w:w="1100" w:type="dxa"/>
+          </w:tcPr>
+          <w:p>
+            <w:pPr>
+              <w:pStyle w:val="af"/>
+              <w:spacing w:before="0" w:beforeAutospacing="0" w:after="0" w:afterAutospacing="0"/>
+              <w:jc w:val="center"/>
+            </w:pPr>
+            <w:r>
+              <w:rPr>
+                <w:color w:val="000000"/>
+                <w:sz w:val="22"/>
+              </w:rPr>
+              <w:t xml:space="preserve">1:00</w:t>
+            </w:r>
+          </w:p>
+        </w:tc>
+        <w:tc>
+          <w:tcPr>
+            <w:tcW w:w="1100" w:type="dxa"/>
+          </w:tcPr>
+          <w:p>
+            <w:pPr>
+              <w:pStyle w:val="af"/>
+              <w:spacing w:before="0" w:beforeAutospacing="0" w:after="0" w:afterAutospacing="0"/>
+              <w:jc w:val="center"/>
+            </w:pPr>
+            <w:r>
+              <w:rPr>
+                <w:color w:val="000000"/>
+                <w:sz w:val="22"/>
+              </w:rPr>
+              <w:t xml:space="preserve">0:40</w:t>
+            </w:r>
+          </w:p>
+        </w:tc>
+        <w:tc>
+          <w:tcPr>
+            <w:tcW w:w="1000" w:type="dxa"/>
+          </w:tcPr>
+          <w:p>
+            <w:pPr>
+              <w:pStyle w:val="af"/>
+              <w:spacing w:before="0" w:beforeAutospacing="0" w:after="0" w:afterAutospacing="0"/>
+              <w:jc w:val="center"/>
+            </w:pPr>
+            <w:r>
+              <w:rPr>
+                <w:color w:val="000000"/>
+                <w:sz w:val="22"/>
+              </w:rPr>
+              <w:t xml:space="preserve">1:15</w:t>
+            </w:r>
+          </w:p>
+        </w:tc>
+      </w:tr>
+      <w:tr>
+        <w:trPr>
+          <w:cantSplit/>
+        </w:trPr>
+        <w:tc>
+          <w:tcPr>
+            <w:tcW w:w="1150" w:type="dxa"/>
+          </w:tcPr>
+          <w:p>
+            <w:pPr>
+              <w:pStyle w:val="af"/>
+              <w:spacing w:before="0" w:beforeAutospacing="0" w:after="0" w:afterAutospacing="0"/>
+              <w:jc w:val="center"/>
+            </w:pPr>
+            <w:r>
+              <w:rPr>
+                <w:color w:val="000000"/>
+                <w:sz w:val="22"/>
+              </w:rPr>
+              <w:t xml:space="preserve">6</w:t>
+            </w:r>
+          </w:p>
+        </w:tc>
+        <w:tc>
+          <w:tcPr>
+            <w:tcW w:w="1150" w:type="dxa"/>
+          </w:tcPr>
+          <w:p>
+            <w:pPr>
+              <w:pStyle w:val="af"/>
+              <w:spacing w:before="0" w:beforeAutospacing="0" w:after="0" w:afterAutospacing="0"/>
+              <w:jc w:val="center"/>
+            </w:pPr>
+            <w:r>
+              <w:rPr>
+                <w:color w:val="000000"/>
+                <w:sz w:val="22"/>
+              </w:rPr>
+              <w:t xml:space="preserve">2</w:t>
+            </w:r>
+          </w:p>
+        </w:tc>
+        <w:tc>
+          <w:tcPr>
+            <w:tcW w:w="2505" w:type="dxa"/>
+          </w:tcPr>
+          <w:p>
+            <w:pPr>
+              <w:pStyle w:val="af"/>
+              <w:spacing w:before="0" w:beforeAutospacing="0" w:after="0" w:afterAutospacing="0"/>
+              <w:jc w:val="left"/>
+            </w:pPr>
+            <w:r>
+              <w:rPr>
+                <w:color w:val="000000"/>
+                <w:sz w:val="22"/>
+              </w:rPr>
+              <w:t xml:space="preserve">фильтр: мяч</w:t>
+            </w:r>
+          </w:p>
+        </w:tc>
+        <w:tc>
+          <w:tcPr>
+            <w:tcW w:w="1350" w:type="dxa"/>
+          </w:tcPr>
+          <w:p>
+            <w:pPr>
+              <w:pStyle w:val="af"/>
+              <w:spacing w:before="0" w:beforeAutospacing="0" w:after="0" w:afterAutospacing="0"/>
+              <w:jc w:val="center"/>
+            </w:pPr>
+            <w:r>
+              <w:rPr>
+                <w:color w:val="000000"/>
+                <w:sz w:val="22"/>
+              </w:rPr>
+              <w:t xml:space="preserve">48</w:t>
+            </w:r>
+          </w:p>
+        </w:tc>
+        <w:tc>
+          <w:tcPr>
+            <w:tcW w:w="1100" w:type="dxa"/>
+          </w:tcPr>
+          <w:p>
+            <w:pPr>
+              <w:pStyle w:val="af"/>
+              <w:spacing w:before="0" w:beforeAutospacing="0" w:after="0" w:afterAutospacing="0"/>
+              <w:jc w:val="center"/>
+            </w:pPr>
+            <w:r>
+              <w:rPr>
+                <w:color w:val="000000"/>
+                <w:sz w:val="22"/>
+              </w:rPr>
+              <w:t xml:space="preserve">1:00</w:t>
+            </w:r>
+          </w:p>
+        </w:tc>
+        <w:tc>
+          <w:tcPr>
+            <w:tcW w:w="1100" w:type="dxa"/>
+          </w:tcPr>
+          <w:p>
+            <w:pPr>
+              <w:pStyle w:val="af"/>
+              <w:spacing w:before="0" w:beforeAutospacing="0" w:after="0" w:afterAutospacing="0"/>
+              <w:jc w:val="center"/>
+            </w:pPr>
+            <w:r>
+              <w:rPr>
+                <w:color w:val="000000"/>
+                <w:sz w:val="22"/>
+              </w:rPr>
+              <w:t xml:space="preserve">0:40</w:t>
+            </w:r>
+          </w:p>
+        </w:tc>
+        <w:tc>
+          <w:tcPr>
+            <w:tcW w:w="1000" w:type="dxa"/>
+          </w:tcPr>
+          <w:p>
+            <w:pPr>
+              <w:pStyle w:val="af"/>
+              <w:spacing w:before="0" w:beforeAutospacing="0" w:after="0" w:afterAutospacing="0"/>
+              <w:jc w:val="center"/>
+            </w:pPr>
+            <w:r>
+              <w:rPr>
+                <w:color w:val="000000"/>
+                <w:sz w:val="22"/>
+              </w:rPr>
+              <w:t xml:space="preserve">1:15</w:t>
+            </w:r>
+          </w:p>
+        </w:tc>
+      </w:tr>
+      <w:tr>
+        <w:trPr>
+          <w:cantSplit/>
+        </w:trPr>
+        <w:tc>
+          <w:tcPr>
+            <w:tcW w:w="1150" w:type="dxa"/>
+          </w:tcPr>
+          <w:p>
+            <w:pPr>
+              <w:pStyle w:val="af"/>
+              <w:spacing w:before="0" w:beforeAutospacing="0" w:after="0" w:afterAutospacing="0"/>
+              <w:jc w:val="center"/>
+            </w:pPr>
+            <w:r>
+              <w:rPr>
+                <w:color w:val="000000"/>
+                <w:sz w:val="22"/>
+              </w:rPr>
+              <w:t xml:space="preserve">7</w:t>
+            </w:r>
+          </w:p>
+        </w:tc>
+        <w:tc>
+          <w:tcPr>
+            <w:tcW w:w="1150" w:type="dxa"/>
+          </w:tcPr>
+          <w:p>
+            <w:pPr>
+              <w:pStyle w:val="af"/>
+              <w:spacing w:before="0" w:beforeAutospacing="0" w:after="0" w:afterAutospacing="0"/>
+              <w:jc w:val="center"/>
+            </w:pPr>
+            <w:r>
+              <w:rPr>
+                <w:color w:val="000000"/>
+                <w:sz w:val="22"/>
+              </w:rPr>
+              <w:t xml:space="preserve">2</w:t>
+            </w:r>
+          </w:p>
+        </w:tc>
+        <w:tc>
+          <w:tcPr>
+            <w:tcW w:w="2505" w:type="dxa"/>
+          </w:tcPr>
+          <w:p>
+            <w:pPr>
+              <w:pStyle w:val="af"/>
+              <w:spacing w:before="0" w:beforeAutospacing="0" w:after="0" w:afterAutospacing="0"/>
+              <w:jc w:val="left"/>
+            </w:pPr>
+            <w:r>
+              <w:rPr>
+                <w:color w:val="000000"/>
+                <w:sz w:val="22"/>
+              </w:rPr>
+              <w:t xml:space="preserve">+ игрушка; фильтры: мишка, лампа</w:t>
+            </w:r>
+          </w:p>
+        </w:tc>
+        <w:tc>
+          <w:tcPr>
+            <w:tcW w:w="1350" w:type="dxa"/>
+          </w:tcPr>
+          <w:p>
+            <w:pPr>
+              <w:pStyle w:val="af"/>
+              <w:spacing w:before="0" w:beforeAutospacing="0" w:after="0" w:afterAutospacing="0"/>
+              <w:jc w:val="center"/>
+            </w:pPr>
+            <w:r>
+              <w:rPr>
+                <w:color w:val="000000"/>
+                <w:sz w:val="22"/>
+              </w:rPr>
+              <w:t xml:space="preserve">51</w:t>
+            </w:r>
+          </w:p>
+        </w:tc>
+        <w:tc>
+          <w:tcPr>
+            <w:tcW w:w="1100" w:type="dxa"/>
+          </w:tcPr>
+          <w:p>
+            <w:pPr>
+              <w:pStyle w:val="af"/>
+              <w:spacing w:before="0" w:beforeAutospacing="0" w:after="0" w:afterAutospacing="0"/>
+              <w:jc w:val="center"/>
+            </w:pPr>
+            <w:r>
+              <w:rPr>
+                <w:color w:val="000000"/>
+                <w:sz w:val="22"/>
+              </w:rPr>
+              <w:t xml:space="preserve">0:45</w:t>
+            </w:r>
+          </w:p>
+        </w:tc>
+        <w:tc>
+          <w:tcPr>
+            <w:tcW w:w="1100" w:type="dxa"/>
+          </w:tcPr>
+          <w:p>
+            <w:pPr>
+              <w:pStyle w:val="af"/>
+              <w:spacing w:before="0" w:beforeAutospacing="0" w:after="0" w:afterAutospacing="0"/>
+              <w:jc w:val="center"/>
+            </w:pPr>
+            <w:r>
+              <w:rPr>
+                <w:color w:val="000000"/>
+                <w:sz w:val="22"/>
+              </w:rPr>
+              <w:t xml:space="preserve">1:05</w:t>
+            </w:r>
+          </w:p>
+        </w:tc>
+        <w:tc>
+          <w:tcPr>
+            <w:tcW w:w="1000" w:type="dxa"/>
+          </w:tcPr>
+          <w:p>
+            <w:pPr>
+              <w:pStyle w:val="af"/>
+              <w:spacing w:before="0" w:beforeAutospacing="0" w:after="0" w:afterAutospacing="0"/>
+              <w:jc w:val="center"/>
+            </w:pPr>
+            <w:r>
+              <w:rPr>
+                <w:color w:val="000000"/>
+                <w:sz w:val="22"/>
+              </w:rPr>
+              <w:t xml:space="preserve">1:20</w:t>
+            </w:r>
+          </w:p>
+        </w:tc>
+      </w:tr>
+      <w:tr>
+        <w:trPr>
+          <w:cantSplit/>
+        </w:trPr>
+        <w:tc>
+          <w:tcPr>
+            <w:tcW w:w="1150" w:type="dxa"/>
+          </w:tcPr>
+          <w:p>
+            <w:pPr>
+              <w:pStyle w:val="af"/>
+              <w:spacing w:before="0" w:beforeAutospacing="0" w:after="0" w:afterAutospacing="0"/>
+              <w:jc w:val="center"/>
+            </w:pPr>
+            <w:r>
+              <w:rPr>
+                <w:color w:val="000000"/>
+                <w:sz w:val="22"/>
+              </w:rPr>
+              <w:t xml:space="preserve">8</w:t>
+            </w:r>
+          </w:p>
+        </w:tc>
+        <w:tc>
+          <w:tcPr>
+            <w:tcW w:w="1150" w:type="dxa"/>
+          </w:tcPr>
+          <w:p>
+            <w:pPr>
+              <w:pStyle w:val="af"/>
+              <w:spacing w:before="0" w:beforeAutospacing="0" w:after="0" w:afterAutospacing="0"/>
+              <w:jc w:val="center"/>
+            </w:pPr>
+            <w:r>
+              <w:rPr>
+                <w:color w:val="000000"/>
+                <w:sz w:val="22"/>
+              </w:rPr>
+              <w:t xml:space="preserve">2</w:t>
+            </w:r>
+          </w:p>
+        </w:tc>
+        <w:tc>
+          <w:tcPr>
+            <w:tcW w:w="2505" w:type="dxa"/>
+          </w:tcPr>
+          <w:p>
+            <w:pPr>
+              <w:pStyle w:val="af"/>
+              <w:spacing w:before="0" w:beforeAutospacing="0" w:after="0" w:afterAutospacing="0"/>
+              <w:jc w:val="left"/>
+            </w:pPr>
+            <w:r>
+              <w:rPr>
+                <w:color w:val="000000"/>
+                <w:sz w:val="22"/>
+              </w:rPr>
+              <w:t xml:space="preserve">фильтры: мяч и игрушка, растение</w:t>
+            </w:r>
+          </w:p>
+        </w:tc>
+        <w:tc>
+          <w:tcPr>
+            <w:tcW w:w="1350" w:type="dxa"/>
+          </w:tcPr>
+          <w:p>
+            <w:pPr>
+              <w:pStyle w:val="af"/>
+              <w:spacing w:before="0" w:beforeAutospacing="0" w:after="0" w:afterAutospacing="0"/>
+              <w:jc w:val="center"/>
+            </w:pPr>
+            <w:r>
+              <w:rPr>
+                <w:color w:val="000000"/>
+                <w:sz w:val="22"/>
+              </w:rPr>
+              <w:t xml:space="preserve">54</w:t>
+            </w:r>
+          </w:p>
+        </w:tc>
+        <w:tc>
+          <w:tcPr>
+            <w:tcW w:w="1100" w:type="dxa"/>
+          </w:tcPr>
+          <w:p>
+            <w:pPr>
+              <w:pStyle w:val="af"/>
+              <w:spacing w:before="0" w:beforeAutospacing="0" w:after="0" w:afterAutospacing="0"/>
+              <w:jc w:val="center"/>
+            </w:pPr>
+            <w:r>
+              <w:rPr>
+                <w:color w:val="000000"/>
+                <w:sz w:val="22"/>
+              </w:rPr>
+              <w:t xml:space="preserve">0:50</w:t>
+            </w:r>
+          </w:p>
+        </w:tc>
+        <w:tc>
+          <w:tcPr>
+            <w:tcW w:w="1100" w:type="dxa"/>
+          </w:tcPr>
+          <w:p>
+            <w:pPr>
+              <w:pStyle w:val="af"/>
+              <w:spacing w:before="0" w:beforeAutospacing="0" w:after="0" w:afterAutospacing="0"/>
+              <w:jc w:val="center"/>
+            </w:pPr>
+            <w:r>
+              <w:rPr>
+                <w:color w:val="000000"/>
+                <w:sz w:val="22"/>
+              </w:rPr>
+              <w:t xml:space="preserve">1:10</w:t>
+            </w:r>
+          </w:p>
+        </w:tc>
+        <w:tc>
+          <w:tcPr>
+            <w:tcW w:w="1000" w:type="dxa"/>
+          </w:tcPr>
+          <w:p>
+            <w:pPr>
+              <w:pStyle w:val="af"/>
+              <w:spacing w:before="0" w:beforeAutospacing="0" w:after="0" w:afterAutospacing="0"/>
+              <w:jc w:val="center"/>
+            </w:pPr>
+            <w:r>
+              <w:rPr>
+                <w:color w:val="000000"/>
+                <w:sz w:val="22"/>
+              </w:rPr>
+              <w:t xml:space="preserve">1:30</w:t>
+            </w:r>
+          </w:p>
+        </w:tc>
+      </w:tr>
+      <w:tr>
+        <w:trPr>
+          <w:cantSplit/>
+        </w:trPr>
+        <w:tc>
+          <w:tcPr>
+            <w:tcW w:w="1150" w:type="dxa"/>
+          </w:tcPr>
+          <w:p>
+            <w:pPr>
+              <w:pStyle w:val="af"/>
+              <w:spacing w:before="0" w:beforeAutospacing="0" w:after="0" w:afterAutospacing="0"/>
+              <w:jc w:val="center"/>
+            </w:pPr>
+            <w:r>
+              <w:rPr>
+                <w:color w:val="000000"/>
+                <w:sz w:val="22"/>
+              </w:rPr>
+              <w:t xml:space="preserve">9</w:t>
+            </w:r>
+          </w:p>
+        </w:tc>
+        <w:tc>
+          <w:tcPr>
+            <w:tcW w:w="1150" w:type="dxa"/>
+          </w:tcPr>
+          <w:p>
+            <w:pPr>
+              <w:pStyle w:val="af"/>
+              <w:spacing w:before="0" w:beforeAutospacing="0" w:after="0" w:afterAutospacing="0"/>
+              <w:jc w:val="center"/>
+            </w:pPr>
+            <w:r>
+              <w:rPr>
+                <w:color w:val="000000"/>
+                <w:sz w:val="22"/>
+              </w:rPr>
+              <w:t xml:space="preserve">2</w:t>
+            </w:r>
+          </w:p>
+        </w:tc>
+        <w:tc>
+          <w:tcPr>
+            <w:tcW w:w="2505" w:type="dxa"/>
+          </w:tcPr>
+          <w:p>
+            <w:pPr>
+              <w:pStyle w:val="af"/>
+              <w:spacing w:before="0" w:beforeAutospacing="0" w:after="0" w:afterAutospacing="0"/>
+              <w:jc w:val="left"/>
+            </w:pPr>
+            <w:r>
+              <w:rPr>
+                <w:color w:val="000000"/>
+                <w:sz w:val="22"/>
+              </w:rPr>
+              <w:t xml:space="preserve">3 фильтра</w:t>
+            </w:r>
+          </w:p>
+        </w:tc>
+        <w:tc>
+          <w:tcPr>
+            <w:tcW w:w="1350" w:type="dxa"/>
+          </w:tcPr>
+          <w:p>
+            <w:pPr>
+              <w:pStyle w:val="af"/>
+              <w:spacing w:before="0" w:beforeAutospacing="0" w:after="0" w:afterAutospacing="0"/>
+              <w:jc w:val="center"/>
+            </w:pPr>
+            <w:r>
+              <w:rPr>
+                <w:color w:val="000000"/>
+                <w:sz w:val="22"/>
+              </w:rPr>
+              <w:t xml:space="preserve">57</w:t>
+            </w:r>
+          </w:p>
+        </w:tc>
+        <w:tc>
+          <w:tcPr>
+            <w:tcW w:w="1100" w:type="dxa"/>
+          </w:tcPr>
+          <w:p>
+            <w:pPr>
+              <w:pStyle w:val="af"/>
+              <w:spacing w:before="0" w:beforeAutospacing="0" w:after="0" w:afterAutospacing="0"/>
+              <w:jc w:val="center"/>
+            </w:pPr>
+            <w:r>
+              <w:rPr>
+                <w:color w:val="000000"/>
+                <w:sz w:val="22"/>
+              </w:rPr>
+              <w:t xml:space="preserve">0:55</w:t>
+            </w:r>
+          </w:p>
+        </w:tc>
+        <w:tc>
+          <w:tcPr>
+            <w:tcW w:w="1100" w:type="dxa"/>
+          </w:tcPr>
+          <w:p>
+            <w:pPr>
+              <w:pStyle w:val="af"/>
+              <w:spacing w:before="0" w:beforeAutospacing="0" w:after="0" w:afterAutospacing="0"/>
+              <w:jc w:val="center"/>
+            </w:pPr>
+            <w:r>
+              <w:rPr>
+                <w:color w:val="000000"/>
+                <w:sz w:val="22"/>
+              </w:rPr>
+              <w:t xml:space="preserve">1:20</w:t>
+            </w:r>
+          </w:p>
+        </w:tc>
+        <w:tc>
+          <w:tcPr>
+            <w:tcW w:w="1000" w:type="dxa"/>
+          </w:tcPr>
+          <w:p>
+            <w:pPr>
+              <w:pStyle w:val="af"/>
+              <w:spacing w:before="0" w:beforeAutospacing="0" w:after="0" w:afterAutospacing="0"/>
+              <w:jc w:val="center"/>
+            </w:pPr>
+            <w:r>
+              <w:rPr>
+                <w:color w:val="000000"/>
+                <w:sz w:val="22"/>
+              </w:rPr>
+              <w:t xml:space="preserve">1:40</w:t>
+            </w:r>
+          </w:p>
+        </w:tc>
+      </w:tr>
+      <w:tr>
+        <w:trPr>
+          <w:cantSplit/>
+        </w:trPr>
+        <w:tc>
+          <w:tcPr>
+            <w:tcW w:w="1150" w:type="dxa"/>
+          </w:tcPr>
+          <w:p>
+            <w:pPr>
+              <w:pStyle w:val="af"/>
+              <w:spacing w:before="0" w:beforeAutospacing="0" w:after="0" w:afterAutospacing="0"/>
+              <w:jc w:val="center"/>
+            </w:pPr>
+            <w:r>
+              <w:rPr>
+                <w:color w:val="000000"/>
+                <w:sz w:val="22"/>
+              </w:rPr>
+              <w:t xml:space="preserve">10</w:t>
+            </w:r>
+          </w:p>
+        </w:tc>
+        <w:tc>
+          <w:tcPr>
+            <w:tcW w:w="1150" w:type="dxa"/>
+          </w:tcPr>
+          <w:p>
+            <w:pPr>
+              <w:pStyle w:val="af"/>
+              <w:spacing w:before="0" w:beforeAutospacing="0" w:after="0" w:afterAutospacing="0"/>
+              <w:jc w:val="center"/>
+            </w:pPr>
+            <w:r>
+              <w:rPr>
+                <w:color w:val="000000"/>
+                <w:sz w:val="22"/>
+              </w:rPr>
+              <w:t xml:space="preserve">2</w:t>
+            </w:r>
+          </w:p>
+        </w:tc>
+        <w:tc>
+          <w:tcPr>
+            <w:tcW w:w="2505" w:type="dxa"/>
+          </w:tcPr>
+          <w:p>
+            <w:pPr>
+              <w:pStyle w:val="af"/>
+              <w:spacing w:before="0" w:beforeAutospacing="0" w:after="0" w:afterAutospacing="0"/>
+              <w:jc w:val="left"/>
+            </w:pPr>
+            <w:r>
+              <w:rPr>
+                <w:color w:val="000000"/>
+                <w:sz w:val="22"/>
+              </w:rPr>
+              <w:t xml:space="preserve">фильтры «игрушки» и «декор»</w:t>
+            </w:r>
+          </w:p>
+        </w:tc>
+        <w:tc>
+          <w:tcPr>
+            <w:tcW w:w="1350" w:type="dxa"/>
+          </w:tcPr>
+          <w:p>
+            <w:pPr>
+              <w:pStyle w:val="af"/>
+              <w:spacing w:before="0" w:beforeAutospacing="0" w:after="0" w:afterAutospacing="0"/>
+              <w:jc w:val="center"/>
+            </w:pPr>
+            <w:r>
+              <w:rPr>
+                <w:color w:val="000000"/>
+                <w:sz w:val="22"/>
+              </w:rPr>
+              <w:t xml:space="preserve">60</w:t>
+            </w:r>
+          </w:p>
+        </w:tc>
+        <w:tc>
+          <w:tcPr>
+            <w:tcW w:w="1100" w:type="dxa"/>
+          </w:tcPr>
+          <w:p>
+            <w:pPr>
+              <w:pStyle w:val="af"/>
+              <w:spacing w:before="0" w:beforeAutospacing="0" w:after="0" w:afterAutospacing="0"/>
+              <w:jc w:val="center"/>
+            </w:pPr>
+            <w:r>
+              <w:rPr>
+                <w:color w:val="000000"/>
+                <w:sz w:val="22"/>
+              </w:rPr>
+              <w:t xml:space="preserve">1:00</w:t>
+            </w:r>
+          </w:p>
+        </w:tc>
+        <w:tc>
+          <w:tcPr>
+            <w:tcW w:w="1100" w:type="dxa"/>
+          </w:tcPr>
+          <w:p>
+            <w:pPr>
+              <w:pStyle w:val="af"/>
+              <w:spacing w:before="0" w:beforeAutospacing="0" w:after="0" w:afterAutospacing="0"/>
+              <w:jc w:val="center"/>
+            </w:pPr>
+            <w:r>
+              <w:rPr>
+                <w:color w:val="000000"/>
+                <w:sz w:val="22"/>
+              </w:rPr>
+              <w:t xml:space="preserve">1:25</w:t>
+            </w:r>
+          </w:p>
+        </w:tc>
+        <w:tc>
+          <w:tcPr>
+            <w:tcW w:w="1000" w:type="dxa"/>
+          </w:tcPr>
+          <w:p>
+            <w:pPr>
+              <w:pStyle w:val="af"/>
+              <w:spacing w:before="0" w:beforeAutospacing="0" w:after="0" w:afterAutospacing="0"/>
+              <w:jc w:val="center"/>
+            </w:pPr>
+            <w:r>
+              <w:rPr>
+                <w:color w:val="000000"/>
+                <w:sz w:val="22"/>
+              </w:rPr>
+              <w:t xml:space="preserve">1:45</w:t>
+            </w:r>
+          </w:p>
+        </w:tc>
+      </w:tr>
+      <w:tr>
+        <w:trPr>
+          <w:cantSplit/>
+        </w:trPr>
+        <w:tc>
+          <w:tcPr>
+            <w:tcW w:w="1150" w:type="dxa"/>
+          </w:tcPr>
+          <w:p>
+            <w:pPr>
+              <w:pStyle w:val="af"/>
+              <w:spacing w:before="0" w:beforeAutospacing="0" w:after="0" w:afterAutospacing="0"/>
+              <w:jc w:val="center"/>
+            </w:pPr>
+            <w:r>
+              <w:rPr>
+                <w:color w:val="000000"/>
+                <w:sz w:val="22"/>
+              </w:rPr>
+              <w:t xml:space="preserve">11</w:t>
+            </w:r>
+          </w:p>
+        </w:tc>
+        <w:tc>
+          <w:tcPr>
+            <w:tcW w:w="1150" w:type="dxa"/>
+          </w:tcPr>
+          <w:p>
+            <w:pPr>
+              <w:pStyle w:val="af"/>
+              <w:spacing w:before="0" w:beforeAutospacing="0" w:after="0" w:afterAutospacing="0"/>
+              <w:jc w:val="center"/>
+            </w:pPr>
+            <w:r>
+              <w:rPr>
+                <w:color w:val="000000"/>
+                <w:sz w:val="22"/>
+              </w:rPr>
+              <w:t xml:space="preserve">3</w:t>
+            </w:r>
+          </w:p>
+        </w:tc>
+        <w:tc>
+          <w:tcPr>
+            <w:tcW w:w="2505" w:type="dxa"/>
+          </w:tcPr>
+          <w:p>
+            <w:pPr>
+              <w:pStyle w:val="af"/>
+              <w:spacing w:before="0" w:beforeAutospacing="0" w:after="0" w:afterAutospacing="0"/>
+              <w:jc w:val="left"/>
+            </w:pPr>
+            <w:r>
+              <w:rPr>
+                <w:color w:val="000000"/>
+                <w:sz w:val="22"/>
+              </w:rPr>
+              <w:t xml:space="preserve">+ поезд; 1 закрытая полка</w:t>
+            </w:r>
+          </w:p>
+        </w:tc>
+        <w:tc>
+          <w:tcPr>
+            <w:tcW w:w="1350" w:type="dxa"/>
+          </w:tcPr>
+          <w:p>
+            <w:pPr>
+              <w:pStyle w:val="af"/>
+              <w:spacing w:before="0" w:beforeAutospacing="0" w:after="0" w:afterAutospacing="0"/>
+              <w:jc w:val="center"/>
+            </w:pPr>
+            <w:r>
+              <w:rPr>
+                <w:color w:val="000000"/>
+                <w:sz w:val="22"/>
+              </w:rPr>
+              <w:t xml:space="preserve">66</w:t>
+            </w:r>
+          </w:p>
+        </w:tc>
+        <w:tc>
+          <w:tcPr>
+            <w:tcW w:w="1100" w:type="dxa"/>
+          </w:tcPr>
+          <w:p>
+            <w:pPr>
+              <w:pStyle w:val="af"/>
+              <w:spacing w:before="0" w:beforeAutospacing="0" w:after="0" w:afterAutospacing="0"/>
+              <w:jc w:val="center"/>
+            </w:pPr>
+            <w:r>
+              <w:rPr>
+                <w:color w:val="000000"/>
+                <w:sz w:val="22"/>
+              </w:rPr>
+              <w:t xml:space="preserve">1:30</w:t>
+            </w:r>
+          </w:p>
+        </w:tc>
+        <w:tc>
+          <w:tcPr>
+            <w:tcW w:w="1100" w:type="dxa"/>
+          </w:tcPr>
+          <w:p>
+            <w:pPr>
+              <w:pStyle w:val="af"/>
+              <w:spacing w:before="0" w:beforeAutospacing="0" w:after="0" w:afterAutospacing="0"/>
+              <w:jc w:val="center"/>
+            </w:pPr>
+            <w:r>
+              <w:rPr>
+                <w:color w:val="000000"/>
+                <w:sz w:val="22"/>
+              </w:rPr>
+              <w:t xml:space="preserve">2:00</w:t>
+            </w:r>
+          </w:p>
+        </w:tc>
+        <w:tc>
+          <w:tcPr>
+            <w:tcW w:w="1000" w:type="dxa"/>
+          </w:tcPr>
+          <w:p>
+            <w:pPr>
+              <w:pStyle w:val="af"/>
+              <w:spacing w:before="0" w:beforeAutospacing="0" w:after="0" w:afterAutospacing="0"/>
+              <w:jc w:val="center"/>
+            </w:pPr>
+            <w:r>
+              <w:rPr>
+                <w:color w:val="000000"/>
+                <w:sz w:val="22"/>
+              </w:rPr>
+              <w:t xml:space="preserve">2:30</w:t>
+            </w:r>
+          </w:p>
+        </w:tc>
+      </w:tr>
+      <w:tr>
+        <w:trPr>
+          <w:cantSplit/>
+        </w:trPr>
+        <w:tc>
+          <w:tcPr>
+            <w:tcW w:w="1150" w:type="dxa"/>
+          </w:tcPr>
+          <w:p>
+            <w:pPr>
+              <w:pStyle w:val="af"/>
+              <w:spacing w:before="0" w:beforeAutospacing="0" w:after="0" w:afterAutospacing="0"/>
+              <w:jc w:val="center"/>
+            </w:pPr>
+            <w:r>
+              <w:rPr>
+                <w:color w:val="000000"/>
+                <w:sz w:val="22"/>
+              </w:rPr>
+              <w:t xml:space="preserve">12</w:t>
+            </w:r>
+          </w:p>
+        </w:tc>
+        <w:tc>
+          <w:tcPr>
+            <w:tcW w:w="1150" w:type="dxa"/>
+          </w:tcPr>
+          <w:p>
+            <w:pPr>
+              <w:pStyle w:val="af"/>
+              <w:spacing w:before="0" w:beforeAutospacing="0" w:after="0" w:afterAutospacing="0"/>
+              <w:jc w:val="center"/>
+            </w:pPr>
+            <w:r>
+              <w:rPr>
+                <w:color w:val="000000"/>
+                <w:sz w:val="22"/>
+              </w:rPr>
+              <w:t xml:space="preserve">3</w:t>
+            </w:r>
+          </w:p>
+        </w:tc>
+        <w:tc>
+          <w:tcPr>
+            <w:tcW w:w="2505" w:type="dxa"/>
+          </w:tcPr>
+          <w:p>
+            <w:pPr>
+              <w:pStyle w:val="af"/>
+              <w:spacing w:before="0" w:beforeAutospacing="0" w:after="0" w:afterAutospacing="0"/>
+              <w:jc w:val="left"/>
+            </w:pPr>
+            <w:r>
+              <w:rPr>
+                <w:color w:val="000000"/>
+                <w:sz w:val="22"/>
+              </w:rPr>
+              <w:t xml:space="preserve">2 закрытые полки</w:t>
+            </w:r>
+          </w:p>
+        </w:tc>
+        <w:tc>
+          <w:tcPr>
+            <w:tcW w:w="1350" w:type="dxa"/>
+          </w:tcPr>
+          <w:p>
+            <w:pPr>
+              <w:pStyle w:val="af"/>
+              <w:spacing w:before="0" w:beforeAutospacing="0" w:after="0" w:afterAutospacing="0"/>
+              <w:jc w:val="center"/>
+            </w:pPr>
+            <w:r>
+              <w:rPr>
+                <w:color w:val="000000"/>
+                <w:sz w:val="22"/>
+              </w:rPr>
+              <w:t xml:space="preserve">60</w:t>
+            </w:r>
+          </w:p>
+        </w:tc>
+        <w:tc>
+          <w:tcPr>
+            <w:tcW w:w="1100" w:type="dxa"/>
+          </w:tcPr>
+          <w:p>
+            <w:pPr>
+              <w:pStyle w:val="af"/>
+              <w:spacing w:before="0" w:beforeAutospacing="0" w:after="0" w:afterAutospacing="0"/>
+              <w:jc w:val="center"/>
+            </w:pPr>
+            <w:r>
+              <w:rPr>
+                <w:color w:val="000000"/>
+                <w:sz w:val="22"/>
+              </w:rPr>
+              <w:t xml:space="preserve">1:45</w:t>
+            </w:r>
+          </w:p>
+        </w:tc>
+        <w:tc>
+          <w:tcPr>
+            <w:tcW w:w="1100" w:type="dxa"/>
+          </w:tcPr>
+          <w:p>
+            <w:pPr>
+              <w:pStyle w:val="af"/>
+              <w:spacing w:before="0" w:beforeAutospacing="0" w:after="0" w:afterAutospacing="0"/>
+              <w:jc w:val="center"/>
+            </w:pPr>
+            <w:r>
+              <w:rPr>
+                <w:color w:val="000000"/>
+                <w:sz w:val="22"/>
+              </w:rPr>
+              <w:t xml:space="preserve">2:15</w:t>
+            </w:r>
+          </w:p>
+        </w:tc>
+        <w:tc>
+          <w:tcPr>
+            <w:tcW w:w="1000" w:type="dxa"/>
+          </w:tcPr>
+          <w:p>
+            <w:pPr>
+              <w:pStyle w:val="af"/>
+              <w:spacing w:before="0" w:beforeAutospacing="0" w:after="0" w:afterAutospacing="0"/>
+              <w:jc w:val="center"/>
+            </w:pPr>
+            <w:r>
+              <w:rPr>
+                <w:color w:val="000000"/>
+                <w:sz w:val="22"/>
+              </w:rPr>
+              <w:t xml:space="preserve">2:50</w:t>
+            </w:r>
+          </w:p>
+        </w:tc>
+      </w:tr>
+      <w:tr>
+        <w:trPr>
+          <w:cantSplit/>
+        </w:trPr>
+        <w:tc>
+          <w:tcPr>
+            <w:tcW w:w="1150" w:type="dxa"/>
+          </w:tcPr>
+          <w:p>
+            <w:pPr>
+              <w:pStyle w:val="af"/>
+              <w:spacing w:before="0" w:beforeAutospacing="0" w:after="0" w:afterAutospacing="0"/>
+              <w:jc w:val="center"/>
+            </w:pPr>
+            <w:r>
+              <w:rPr>
+                <w:color w:val="000000"/>
+                <w:sz w:val="22"/>
+              </w:rPr>
+              <w:t xml:space="preserve">13</w:t>
+            </w:r>
+          </w:p>
+        </w:tc>
+        <w:tc>
+          <w:tcPr>
+            <w:tcW w:w="1150" w:type="dxa"/>
+          </w:tcPr>
+          <w:p>
+            <w:pPr>
+              <w:pStyle w:val="af"/>
+              <w:spacing w:before="0" w:beforeAutospacing="0" w:after="0" w:afterAutospacing="0"/>
+              <w:jc w:val="center"/>
+            </w:pPr>
+            <w:r>
+              <w:rPr>
+                <w:color w:val="000000"/>
+                <w:sz w:val="22"/>
+              </w:rPr>
+              <w:t xml:space="preserve">3</w:t>
+            </w:r>
+          </w:p>
+        </w:tc>
+        <w:tc>
+          <w:tcPr>
+            <w:tcW w:w="2505" w:type="dxa"/>
+          </w:tcPr>
+          <w:p>
+            <w:pPr>
+              <w:pStyle w:val="af"/>
+              <w:spacing w:before="0" w:beforeAutospacing="0" w:after="0" w:afterAutospacing="0"/>
+              <w:jc w:val="left"/>
+            </w:pPr>
+            <w:r>
+              <w:rPr>
+                <w:color w:val="000000"/>
+                <w:sz w:val="22"/>
+              </w:rPr>
+              <w:t xml:space="preserve">2 закрытые полки</w:t>
+            </w:r>
+          </w:p>
+        </w:tc>
+        <w:tc>
+          <w:tcPr>
+            <w:tcW w:w="1350" w:type="dxa"/>
+          </w:tcPr>
+          <w:p>
+            <w:pPr>
+              <w:pStyle w:val="af"/>
+              <w:spacing w:before="0" w:beforeAutospacing="0" w:after="0" w:afterAutospacing="0"/>
+              <w:jc w:val="center"/>
+            </w:pPr>
+            <w:r>
+              <w:rPr>
+                <w:color w:val="000000"/>
+                <w:sz w:val="22"/>
+              </w:rPr>
+              <w:t xml:space="preserve">60</w:t>
+            </w:r>
+          </w:p>
+        </w:tc>
+        <w:tc>
+          <w:tcPr>
+            <w:tcW w:w="1100" w:type="dxa"/>
+          </w:tcPr>
+          <w:p>
+            <w:pPr>
+              <w:pStyle w:val="af"/>
+              <w:spacing w:before="0" w:beforeAutospacing="0" w:after="0" w:afterAutospacing="0"/>
+              <w:jc w:val="center"/>
+            </w:pPr>
+            <w:r>
+              <w:rPr>
+                <w:color w:val="000000"/>
+                <w:sz w:val="22"/>
+              </w:rPr>
+              <w:t xml:space="preserve">1:55</w:t>
+            </w:r>
+          </w:p>
+        </w:tc>
+        <w:tc>
+          <w:tcPr>
+            <w:tcW w:w="1100" w:type="dxa"/>
+          </w:tcPr>
+          <w:p>
+            <w:pPr>
+              <w:pStyle w:val="af"/>
+              <w:spacing w:before="0" w:beforeAutospacing="0" w:after="0" w:afterAutospacing="0"/>
+              <w:jc w:val="center"/>
+            </w:pPr>
+            <w:r>
+              <w:rPr>
+                <w:color w:val="000000"/>
+                <w:sz w:val="22"/>
+              </w:rPr>
+              <w:t xml:space="preserve">2:25</w:t>
+            </w:r>
+          </w:p>
+        </w:tc>
+        <w:tc>
+          <w:tcPr>
+            <w:tcW w:w="1000" w:type="dxa"/>
+          </w:tcPr>
+          <w:p>
+            <w:pPr>
+              <w:pStyle w:val="af"/>
+              <w:spacing w:before="0" w:beforeAutospacing="0" w:after="0" w:afterAutospacing="0"/>
+              <w:jc w:val="center"/>
+            </w:pPr>
+            <w:r>
+              <w:rPr>
+                <w:color w:val="000000"/>
+                <w:sz w:val="22"/>
+              </w:rPr>
+              <w:t xml:space="preserve">3:00</w:t>
+            </w:r>
+          </w:p>
+        </w:tc>
+      </w:tr>
+      <w:tr>
+        <w:trPr>
+          <w:cantSplit/>
+        </w:trPr>
+        <w:tc>
+          <w:tcPr>
+            <w:tcW w:w="1150" w:type="dxa"/>
+          </w:tcPr>
+          <w:p>
+            <w:pPr>
+              <w:pStyle w:val="af"/>
+              <w:spacing w:before="0" w:beforeAutospacing="0" w:after="0" w:afterAutospacing="0"/>
+              <w:jc w:val="center"/>
+            </w:pPr>
+            <w:r>
+              <w:rPr>
+                <w:color w:val="000000"/>
+                <w:sz w:val="22"/>
+              </w:rPr>
+              <w:t xml:space="preserve">14</w:t>
+            </w:r>
+          </w:p>
+        </w:tc>
+        <w:tc>
+          <w:tcPr>
+            <w:tcW w:w="1150" w:type="dxa"/>
+          </w:tcPr>
+          <w:p>
+            <w:pPr>
+              <w:pStyle w:val="af"/>
+              <w:spacing w:before="0" w:beforeAutospacing="0" w:after="0" w:afterAutospacing="0"/>
+              <w:jc w:val="center"/>
+            </w:pPr>
+            <w:r>
+              <w:rPr>
+                <w:color w:val="000000"/>
+                <w:sz w:val="22"/>
+              </w:rPr>
+              <w:t xml:space="preserve">3</w:t>
+            </w:r>
+          </w:p>
+        </w:tc>
+        <w:tc>
+          <w:tcPr>
+            <w:tcW w:w="2505" w:type="dxa"/>
+          </w:tcPr>
+          <w:p>
+            <w:pPr>
+              <w:pStyle w:val="af"/>
+              <w:spacing w:before="0" w:beforeAutospacing="0" w:after="0" w:afterAutospacing="0"/>
+              <w:jc w:val="left"/>
+            </w:pPr>
+            <w:r>
+              <w:rPr>
+                <w:color w:val="000000"/>
+                <w:sz w:val="22"/>
+              </w:rPr>
+              <w:t xml:space="preserve">2 закрытые полки</w:t>
+            </w:r>
+          </w:p>
+        </w:tc>
+        <w:tc>
+          <w:tcPr>
+            <w:tcW w:w="1350" w:type="dxa"/>
+          </w:tcPr>
+          <w:p>
+            <w:pPr>
+              <w:pStyle w:val="af"/>
+              <w:spacing w:before="0" w:beforeAutospacing="0" w:after="0" w:afterAutospacing="0"/>
+              <w:jc w:val="center"/>
+            </w:pPr>
+            <w:r>
+              <w:rPr>
+                <w:color w:val="000000"/>
+                <w:sz w:val="22"/>
+              </w:rPr>
+              <w:t xml:space="preserve">57</w:t>
+            </w:r>
+          </w:p>
+        </w:tc>
+        <w:tc>
+          <w:tcPr>
+            <w:tcW w:w="1100" w:type="dxa"/>
+          </w:tcPr>
+          <w:p>
+            <w:pPr>
+              <w:pStyle w:val="af"/>
+              <w:spacing w:before="0" w:beforeAutospacing="0" w:after="0" w:afterAutospacing="0"/>
+              <w:jc w:val="center"/>
+            </w:pPr>
+            <w:r>
+              <w:rPr>
+                <w:color w:val="000000"/>
+                <w:sz w:val="22"/>
+              </w:rPr>
+              <w:t xml:space="preserve">1:55</w:t>
+            </w:r>
+          </w:p>
+        </w:tc>
+        <w:tc>
+          <w:tcPr>
+            <w:tcW w:w="1100" w:type="dxa"/>
+          </w:tcPr>
+          <w:p>
+            <w:pPr>
+              <w:pStyle w:val="af"/>
+              <w:spacing w:before="0" w:beforeAutospacing="0" w:after="0" w:afterAutospacing="0"/>
+              <w:jc w:val="center"/>
+            </w:pPr>
+            <w:r>
+              <w:rPr>
+                <w:color w:val="000000"/>
+                <w:sz w:val="22"/>
+              </w:rPr>
+              <w:t xml:space="preserve">2:30</w:t>
+            </w:r>
+          </w:p>
+        </w:tc>
+        <w:tc>
+          <w:tcPr>
+            <w:tcW w:w="1000" w:type="dxa"/>
+          </w:tcPr>
+          <w:p>
+            <w:pPr>
+              <w:pStyle w:val="af"/>
+              <w:spacing w:before="0" w:beforeAutospacing="0" w:after="0" w:afterAutospacing="0"/>
+              <w:jc w:val="center"/>
+            </w:pPr>
+            <w:r>
+              <w:rPr>
+                <w:color w:val="000000"/>
+                <w:sz w:val="22"/>
+              </w:rPr>
+              <w:t xml:space="preserve">3:10</w:t>
+            </w:r>
+          </w:p>
+        </w:tc>
+      </w:tr>
+      <w:tr>
+        <w:trPr>
+          <w:cantSplit/>
+        </w:trPr>
+        <w:tc>
+          <w:tcPr>
+            <w:tcW w:w="1150" w:type="dxa"/>
+          </w:tcPr>
+          <w:p>
+            <w:pPr>
+              <w:pStyle w:val="af"/>
+              <w:spacing w:before="0" w:beforeAutospacing="0" w:after="0" w:afterAutospacing="0"/>
+              <w:jc w:val="center"/>
+            </w:pPr>
+            <w:r>
+              <w:rPr>
+                <w:color w:val="000000"/>
+                <w:sz w:val="22"/>
+              </w:rPr>
+              <w:t xml:space="preserve">15</w:t>
+            </w:r>
+          </w:p>
+        </w:tc>
+        <w:tc>
+          <w:tcPr>
+            <w:tcW w:w="1150" w:type="dxa"/>
+          </w:tcPr>
+          <w:p>
+            <w:pPr>
+              <w:pStyle w:val="af"/>
+              <w:spacing w:before="0" w:beforeAutospacing="0" w:after="0" w:afterAutospacing="0"/>
+              <w:jc w:val="center"/>
+            </w:pPr>
+            <w:r>
+              <w:rPr>
+                <w:color w:val="000000"/>
+                <w:sz w:val="22"/>
+              </w:rPr>
+              <w:t xml:space="preserve">3</w:t>
+            </w:r>
+          </w:p>
+        </w:tc>
+        <w:tc>
+          <w:tcPr>
+            <w:tcW w:w="2505" w:type="dxa"/>
+          </w:tcPr>
+          <w:p>
+            <w:pPr>
+              <w:pStyle w:val="af"/>
+              <w:spacing w:before="0" w:beforeAutospacing="0" w:after="0" w:afterAutospacing="0"/>
+              <w:jc w:val="left"/>
+            </w:pPr>
+            <w:r>
+              <w:rPr>
+                <w:color w:val="000000"/>
+                <w:sz w:val="22"/>
+              </w:rPr>
+              <w:t xml:space="preserve">3 закрытые полки</w:t>
+            </w:r>
+          </w:p>
+        </w:tc>
+        <w:tc>
+          <w:tcPr>
+            <w:tcW w:w="1350" w:type="dxa"/>
+          </w:tcPr>
+          <w:p>
+            <w:pPr>
+              <w:pStyle w:val="af"/>
+              <w:spacing w:before="0" w:beforeAutospacing="0" w:after="0" w:afterAutospacing="0"/>
+              <w:jc w:val="center"/>
+            </w:pPr>
+            <w:r>
+              <w:rPr>
+                <w:color w:val="000000"/>
+                <w:sz w:val="22"/>
+              </w:rPr>
+              <w:t xml:space="preserve">54</w:t>
+            </w:r>
+          </w:p>
+        </w:tc>
+        <w:tc>
+          <w:tcPr>
+            <w:tcW w:w="1100" w:type="dxa"/>
+          </w:tcPr>
+          <w:p>
+            <w:pPr>
+              <w:pStyle w:val="af"/>
+              <w:spacing w:before="0" w:beforeAutospacing="0" w:after="0" w:afterAutospacing="0"/>
+              <w:jc w:val="center"/>
+            </w:pPr>
+            <w:r>
+              <w:rPr>
+                <w:color w:val="000000"/>
+                <w:sz w:val="22"/>
+              </w:rPr>
+              <w:t xml:space="preserve">2:05</w:t>
+            </w:r>
+          </w:p>
+        </w:tc>
+        <w:tc>
+          <w:tcPr>
+            <w:tcW w:w="1100" w:type="dxa"/>
+          </w:tcPr>
+          <w:p>
+            <w:pPr>
+              <w:pStyle w:val="af"/>
+              <w:spacing w:before="0" w:beforeAutospacing="0" w:after="0" w:afterAutospacing="0"/>
+              <w:jc w:val="center"/>
+            </w:pPr>
+            <w:r>
+              <w:rPr>
+                <w:color w:val="000000"/>
+                <w:sz w:val="22"/>
+              </w:rPr>
+              <w:t xml:space="preserve">2:40</w:t>
+            </w:r>
+          </w:p>
+        </w:tc>
+        <w:tc>
+          <w:tcPr>
+            <w:tcW w:w="1000" w:type="dxa"/>
+          </w:tcPr>
+          <w:p>
+            <w:pPr>
+              <w:pStyle w:val="af"/>
+              <w:spacing w:before="0" w:beforeAutospacing="0" w:after="0" w:afterAutospacing="0"/>
+              <w:jc w:val="center"/>
+            </w:pPr>
+            <w:r>
+              <w:rPr>
+                <w:color w:val="000000"/>
+                <w:sz w:val="22"/>
+              </w:rPr>
+              <w:t xml:space="preserve">3:20</w:t>
+            </w:r>
+          </w:p>
+        </w:tc>
+      </w:tr>
+      <w:tr>
+        <w:trPr>
+          <w:cantSplit/>
+        </w:trPr>
+        <w:tc>
+          <w:tcPr>
+            <w:tcW w:w="1150" w:type="dxa"/>
+          </w:tcPr>
+          <w:p>
+            <w:pPr>
+              <w:pStyle w:val="af"/>
+              <w:spacing w:before="0" w:beforeAutospacing="0" w:after="0" w:afterAutospacing="0"/>
+              <w:jc w:val="center"/>
+            </w:pPr>
+            <w:r>
+              <w:rPr>
+                <w:color w:val="000000"/>
+                <w:sz w:val="22"/>
+              </w:rPr>
+              <w:t xml:space="preserve">16</w:t>
+            </w:r>
+          </w:p>
+        </w:tc>
+        <w:tc>
+          <w:tcPr>
+            <w:tcW w:w="1150" w:type="dxa"/>
+          </w:tcPr>
+          <w:p>
+            <w:pPr>
+              <w:pStyle w:val="af"/>
+              <w:spacing w:before="0" w:beforeAutospacing="0" w:after="0" w:afterAutospacing="0"/>
+              <w:jc w:val="center"/>
+            </w:pPr>
+            <w:r>
+              <w:rPr>
+                <w:color w:val="000000"/>
+                <w:sz w:val="22"/>
+              </w:rPr>
+              <w:t xml:space="preserve">4</w:t>
+            </w:r>
+          </w:p>
+        </w:tc>
+        <w:tc>
+          <w:tcPr>
+            <w:tcW w:w="2505" w:type="dxa"/>
+          </w:tcPr>
+          <w:p>
+            <w:pPr>
+              <w:pStyle w:val="af"/>
+              <w:spacing w:before="0" w:beforeAutospacing="0" w:after="0" w:afterAutospacing="0"/>
+              <w:jc w:val="left"/>
+            </w:pPr>
+            <w:r>
+              <w:rPr>
+                <w:color w:val="000000"/>
+                <w:sz w:val="22"/>
+              </w:rPr>
+              <w:t xml:space="preserve">2 конвейера</w:t>
+            </w:r>
+          </w:p>
+        </w:tc>
+        <w:tc>
+          <w:tcPr>
+            <w:tcW w:w="1350" w:type="dxa"/>
+          </w:tcPr>
+          <w:p>
+            <w:pPr>
+              <w:pStyle w:val="af"/>
+              <w:spacing w:before="0" w:beforeAutospacing="0" w:after="0" w:afterAutospacing="0"/>
+              <w:jc w:val="center"/>
+            </w:pPr>
+            <w:r>
+              <w:rPr>
+                <w:color w:val="000000"/>
+                <w:sz w:val="22"/>
+              </w:rPr>
+              <w:t xml:space="preserve">72</w:t>
+            </w:r>
+          </w:p>
+        </w:tc>
+        <w:tc>
+          <w:tcPr>
+            <w:tcW w:w="1100" w:type="dxa"/>
+          </w:tcPr>
+          <w:p>
+            <w:pPr>
+              <w:pStyle w:val="af"/>
+              <w:spacing w:before="0" w:beforeAutospacing="0" w:after="0" w:afterAutospacing="0"/>
+              <w:jc w:val="center"/>
+            </w:pPr>
+            <w:r>
+              <w:rPr>
+                <w:color w:val="000000"/>
+                <w:sz w:val="22"/>
+              </w:rPr>
+              <w:t xml:space="preserve">1:05</w:t>
+            </w:r>
+          </w:p>
+        </w:tc>
+        <w:tc>
+          <w:tcPr>
+            <w:tcW w:w="1100" w:type="dxa"/>
+          </w:tcPr>
+          <w:p>
+            <w:pPr>
+              <w:pStyle w:val="af"/>
+              <w:spacing w:before="0" w:beforeAutospacing="0" w:after="0" w:afterAutospacing="0"/>
+              <w:jc w:val="center"/>
+            </w:pPr>
+            <w:r>
+              <w:rPr>
+                <w:color w:val="000000"/>
+                <w:sz w:val="22"/>
+              </w:rPr>
+              <w:t xml:space="preserve">1:30</w:t>
+            </w:r>
+          </w:p>
+        </w:tc>
+        <w:tc>
+          <w:tcPr>
+            <w:tcW w:w="1000" w:type="dxa"/>
+          </w:tcPr>
+          <w:p>
+            <w:pPr>
+              <w:pStyle w:val="af"/>
+              <w:spacing w:before="0" w:beforeAutospacing="0" w:after="0" w:afterAutospacing="0"/>
+              <w:jc w:val="center"/>
+            </w:pPr>
+            <w:r>
+              <w:rPr>
+                <w:color w:val="000000"/>
+                <w:sz w:val="22"/>
+              </w:rPr>
+              <w:t xml:space="preserve">1:55</w:t>
+            </w:r>
+          </w:p>
+        </w:tc>
+      </w:tr>
+      <w:tr>
+        <w:trPr>
+          <w:cantSplit/>
+        </w:trPr>
+        <w:tc>
+          <w:tcPr>
+            <w:tcW w:w="1150" w:type="dxa"/>
+          </w:tcPr>
+          <w:p>
+            <w:pPr>
+              <w:pStyle w:val="af"/>
+              <w:spacing w:before="0" w:beforeAutospacing="0" w:after="0" w:afterAutospacing="0"/>
+              <w:jc w:val="center"/>
+            </w:pPr>
+            <w:r>
+              <w:rPr>
+                <w:color w:val="000000"/>
+                <w:sz w:val="22"/>
+              </w:rPr>
+              <w:t xml:space="preserve">17</w:t>
+            </w:r>
+          </w:p>
+        </w:tc>
+        <w:tc>
+          <w:tcPr>
+            <w:tcW w:w="1150" w:type="dxa"/>
+          </w:tcPr>
+          <w:p>
+            <w:pPr>
+              <w:pStyle w:val="af"/>
+              <w:spacing w:before="0" w:beforeAutospacing="0" w:after="0" w:afterAutospacing="0"/>
+              <w:jc w:val="center"/>
+            </w:pPr>
+            <w:r>
+              <w:rPr>
+                <w:color w:val="000000"/>
+                <w:sz w:val="22"/>
+              </w:rPr>
+              <w:t xml:space="preserve">4</w:t>
+            </w:r>
+          </w:p>
+        </w:tc>
+        <w:tc>
+          <w:tcPr>
+            <w:tcW w:w="2505" w:type="dxa"/>
+          </w:tcPr>
+          <w:p>
+            <w:pPr>
+              <w:pStyle w:val="af"/>
+              <w:spacing w:before="0" w:beforeAutospacing="0" w:after="0" w:afterAutospacing="0"/>
+              <w:jc w:val="left"/>
+            </w:pPr>
+            <w:r>
+              <w:rPr>
+                <w:color w:val="000000"/>
+                <w:sz w:val="22"/>
+              </w:rPr>
+              <w:t xml:space="preserve">3 конвейера</w:t>
+            </w:r>
+          </w:p>
+        </w:tc>
+        <w:tc>
+          <w:tcPr>
+            <w:tcW w:w="1350" w:type="dxa"/>
+          </w:tcPr>
+          <w:p>
+            <w:pPr>
+              <w:pStyle w:val="af"/>
+              <w:spacing w:before="0" w:beforeAutospacing="0" w:after="0" w:afterAutospacing="0"/>
+              <w:jc w:val="center"/>
+            </w:pPr>
+            <w:r>
+              <w:rPr>
+                <w:color w:val="000000"/>
+                <w:sz w:val="22"/>
+              </w:rPr>
+              <w:t xml:space="preserve">87</w:t>
+            </w:r>
+          </w:p>
+        </w:tc>
+        <w:tc>
+          <w:tcPr>
+            <w:tcW w:w="1100" w:type="dxa"/>
+          </w:tcPr>
+          <w:p>
+            <w:pPr>
+              <w:pStyle w:val="af"/>
+              <w:spacing w:before="0" w:beforeAutospacing="0" w:after="0" w:afterAutospacing="0"/>
+              <w:jc w:val="center"/>
+            </w:pPr>
+            <w:r>
+              <w:rPr>
+                <w:color w:val="000000"/>
+                <w:sz w:val="22"/>
+              </w:rPr>
+              <w:t xml:space="preserve">1:15</w:t>
+            </w:r>
+          </w:p>
+        </w:tc>
+        <w:tc>
+          <w:tcPr>
+            <w:tcW w:w="1100" w:type="dxa"/>
+          </w:tcPr>
+          <w:p>
+            <w:pPr>
+              <w:pStyle w:val="af"/>
+              <w:spacing w:before="0" w:beforeAutospacing="0" w:after="0" w:afterAutospacing="0"/>
+              <w:jc w:val="center"/>
+            </w:pPr>
+            <w:r>
+              <w:rPr>
+                <w:color w:val="000000"/>
+                <w:sz w:val="22"/>
+              </w:rPr>
+              <w:t xml:space="preserve">1:35</w:t>
+            </w:r>
+          </w:p>
+        </w:tc>
+        <w:tc>
+          <w:tcPr>
+            <w:tcW w:w="1000" w:type="dxa"/>
+          </w:tcPr>
+          <w:p>
+            <w:pPr>
+              <w:pStyle w:val="af"/>
+              <w:spacing w:before="0" w:beforeAutospacing="0" w:after="0" w:afterAutospacing="0"/>
+              <w:jc w:val="center"/>
+            </w:pPr>
+            <w:r>
+              <w:rPr>
+                <w:color w:val="000000"/>
+                <w:sz w:val="22"/>
+              </w:rPr>
+              <w:t xml:space="preserve">2:00</w:t>
+            </w:r>
+          </w:p>
+        </w:tc>
+      </w:tr>
+      <w:tr>
+        <w:trPr>
+          <w:cantSplit/>
+        </w:trPr>
+        <w:tc>
+          <w:tcPr>
+            <w:tcW w:w="1150" w:type="dxa"/>
+          </w:tcPr>
+          <w:p>
+            <w:pPr>
+              <w:pStyle w:val="af"/>
+              <w:spacing w:before="0" w:beforeAutospacing="0" w:after="0" w:afterAutospacing="0"/>
+              <w:jc w:val="center"/>
+            </w:pPr>
+            <w:r>
+              <w:rPr>
+                <w:color w:val="000000"/>
+                <w:sz w:val="22"/>
+              </w:rPr>
+              <w:t xml:space="preserve">18</w:t>
+            </w:r>
+          </w:p>
+        </w:tc>
+        <w:tc>
+          <w:tcPr>
+            <w:tcW w:w="1150" w:type="dxa"/>
+          </w:tcPr>
+          <w:p>
+            <w:pPr>
+              <w:pStyle w:val="af"/>
+              <w:spacing w:before="0" w:beforeAutospacing="0" w:after="0" w:afterAutospacing="0"/>
+              <w:jc w:val="center"/>
+            </w:pPr>
+            <w:r>
+              <w:rPr>
+                <w:color w:val="000000"/>
+                <w:sz w:val="22"/>
+              </w:rPr>
+              <w:t xml:space="preserve">4</w:t>
+            </w:r>
+          </w:p>
+        </w:tc>
+        <w:tc>
+          <w:tcPr>
+            <w:tcW w:w="2505" w:type="dxa"/>
+          </w:tcPr>
+          <w:p>
+            <w:pPr>
+              <w:pStyle w:val="af"/>
+              <w:spacing w:before="0" w:beforeAutospacing="0" w:after="0" w:afterAutospacing="0"/>
+              <w:jc w:val="left"/>
+            </w:pPr>
+            <w:r>
+              <w:rPr>
+                <w:color w:val="000000"/>
+                <w:sz w:val="22"/>
+              </w:rPr>
+              <w:t xml:space="preserve">3 конвейера</w:t>
+            </w:r>
+          </w:p>
+        </w:tc>
+        <w:tc>
+          <w:tcPr>
+            <w:tcW w:w="1350" w:type="dxa"/>
+          </w:tcPr>
+          <w:p>
+            <w:pPr>
+              <w:pStyle w:val="af"/>
+              <w:spacing w:before="0" w:beforeAutospacing="0" w:after="0" w:afterAutospacing="0"/>
+              <w:jc w:val="center"/>
+            </w:pPr>
+            <w:r>
+              <w:rPr>
+                <w:color w:val="000000"/>
+                <w:sz w:val="22"/>
+              </w:rPr>
+              <w:t xml:space="preserve">93</w:t>
+            </w:r>
+          </w:p>
+        </w:tc>
+        <w:tc>
+          <w:tcPr>
+            <w:tcW w:w="1100" w:type="dxa"/>
+          </w:tcPr>
+          <w:p>
+            <w:pPr>
+              <w:pStyle w:val="af"/>
+              <w:spacing w:before="0" w:beforeAutospacing="0" w:after="0" w:afterAutospacing="0"/>
+              <w:jc w:val="center"/>
+            </w:pPr>
+            <w:r>
+              <w:rPr>
+                <w:color w:val="000000"/>
+                <w:sz w:val="22"/>
+              </w:rPr>
+              <w:t xml:space="preserve">1:25</w:t>
+            </w:r>
+          </w:p>
+        </w:tc>
+        <w:tc>
+          <w:tcPr>
+            <w:tcW w:w="1100" w:type="dxa"/>
+          </w:tcPr>
+          <w:p>
+            <w:pPr>
+              <w:pStyle w:val="af"/>
+              <w:spacing w:before="0" w:beforeAutospacing="0" w:after="0" w:afterAutospacing="0"/>
+              <w:jc w:val="center"/>
+            </w:pPr>
+            <w:r>
+              <w:rPr>
+                <w:color w:val="000000"/>
+                <w:sz w:val="22"/>
+              </w:rPr>
+              <w:t xml:space="preserve">1:50</w:t>
+            </w:r>
+          </w:p>
+        </w:tc>
+        <w:tc>
+          <w:tcPr>
+            <w:tcW w:w="1000" w:type="dxa"/>
+          </w:tcPr>
+          <w:p>
+            <w:pPr>
+              <w:pStyle w:val="af"/>
+              <w:spacing w:before="0" w:beforeAutospacing="0" w:after="0" w:afterAutospacing="0"/>
+              <w:jc w:val="center"/>
+            </w:pPr>
+            <w:r>
+              <w:rPr>
+                <w:color w:val="000000"/>
+                <w:sz w:val="22"/>
+              </w:rPr>
+              <w:t xml:space="preserve">2:00</w:t>
+            </w:r>
+          </w:p>
+        </w:tc>
+      </w:tr>
+      <w:tr>
+        <w:trPr>
+          <w:cantSplit/>
+        </w:trPr>
+        <w:tc>
+          <w:tcPr>
+            <w:tcW w:w="1150" w:type="dxa"/>
+          </w:tcPr>
+          <w:p>
+            <w:pPr>
+              <w:pStyle w:val="af"/>
+              <w:spacing w:before="0" w:beforeAutospacing="0" w:after="0" w:afterAutospacing="0"/>
+              <w:jc w:val="center"/>
+            </w:pPr>
+            <w:r>
+              <w:rPr>
+                <w:color w:val="000000"/>
+                <w:sz w:val="22"/>
+              </w:rPr>
+              <w:t xml:space="preserve">19</w:t>
+            </w:r>
+          </w:p>
+        </w:tc>
+        <w:tc>
+          <w:tcPr>
+            <w:tcW w:w="1150" w:type="dxa"/>
+          </w:tcPr>
+          <w:p>
+            <w:pPr>
+              <w:pStyle w:val="af"/>
+              <w:spacing w:before="0" w:beforeAutospacing="0" w:after="0" w:afterAutospacing="0"/>
+              <w:jc w:val="center"/>
+            </w:pPr>
+            <w:r>
+              <w:rPr>
+                <w:color w:val="000000"/>
+                <w:sz w:val="22"/>
+              </w:rPr>
+              <w:t xml:space="preserve">4</w:t>
+            </w:r>
+          </w:p>
+        </w:tc>
+        <w:tc>
+          <w:tcPr>
+            <w:tcW w:w="2505" w:type="dxa"/>
+          </w:tcPr>
+          <w:p>
+            <w:pPr>
+              <w:pStyle w:val="af"/>
+              <w:spacing w:before="0" w:beforeAutospacing="0" w:after="0" w:afterAutospacing="0"/>
+              <w:jc w:val="left"/>
+            </w:pPr>
+            <w:r>
+              <w:rPr>
+                <w:color w:val="000000"/>
+                <w:sz w:val="22"/>
+              </w:rPr>
+              <w:t xml:space="preserve">3 конвейера</w:t>
+            </w:r>
+          </w:p>
+        </w:tc>
+        <w:tc>
+          <w:tcPr>
+            <w:tcW w:w="1350" w:type="dxa"/>
+          </w:tcPr>
+          <w:p>
+            <w:pPr>
+              <w:pStyle w:val="af"/>
+              <w:spacing w:before="0" w:beforeAutospacing="0" w:after="0" w:afterAutospacing="0"/>
+              <w:jc w:val="center"/>
+            </w:pPr>
+            <w:r>
+              <w:rPr>
+                <w:color w:val="000000"/>
+                <w:sz w:val="22"/>
+              </w:rPr>
+              <w:t xml:space="preserve">96</w:t>
+            </w:r>
+          </w:p>
+        </w:tc>
+        <w:tc>
+          <w:tcPr>
+            <w:tcW w:w="1100" w:type="dxa"/>
+          </w:tcPr>
+          <w:p>
+            <w:pPr>
+              <w:pStyle w:val="af"/>
+              <w:spacing w:before="0" w:beforeAutospacing="0" w:after="0" w:afterAutospacing="0"/>
+              <w:jc w:val="center"/>
+            </w:pPr>
+            <w:r>
+              <w:rPr>
+                <w:color w:val="000000"/>
+                <w:sz w:val="22"/>
+              </w:rPr>
+              <w:t xml:space="preserve">1:25</w:t>
+            </w:r>
+          </w:p>
+        </w:tc>
+        <w:tc>
+          <w:tcPr>
+            <w:tcW w:w="1100" w:type="dxa"/>
+          </w:tcPr>
+          <w:p>
+            <w:pPr>
+              <w:pStyle w:val="af"/>
+              <w:spacing w:before="0" w:beforeAutospacing="0" w:after="0" w:afterAutospacing="0"/>
+              <w:jc w:val="center"/>
+            </w:pPr>
+            <w:r>
+              <w:rPr>
+                <w:color w:val="000000"/>
+                <w:sz w:val="22"/>
+              </w:rPr>
+              <w:t xml:space="preserve">1:50</w:t>
+            </w:r>
+          </w:p>
+        </w:tc>
+        <w:tc>
+          <w:tcPr>
+            <w:tcW w:w="1000" w:type="dxa"/>
+          </w:tcPr>
+          <w:p>
+            <w:pPr>
+              <w:pStyle w:val="af"/>
+              <w:spacing w:before="0" w:beforeAutospacing="0" w:after="0" w:afterAutospacing="0"/>
+              <w:jc w:val="center"/>
+            </w:pPr>
+            <w:r>
+              <w:rPr>
+                <w:color w:val="000000"/>
+                <w:sz w:val="22"/>
+              </w:rPr>
+              <w:t xml:space="preserve">2:00</w:t>
+            </w:r>
+          </w:p>
+        </w:tc>
+      </w:tr>
+      <w:tr>
+        <w:trPr>
+          <w:cantSplit/>
+        </w:trPr>
+        <w:tc>
+          <w:tcPr>
+            <w:tcW w:w="1150" w:type="dxa"/>
+          </w:tcPr>
+          <w:p>
+            <w:pPr>
+              <w:pStyle w:val="af"/>
+              <w:spacing w:before="0" w:beforeAutospacing="0" w:after="0" w:afterAutospacing="0"/>
+              <w:jc w:val="center"/>
+            </w:pPr>
+            <w:r>
+              <w:rPr>
+                <w:color w:val="000000"/>
+                <w:sz w:val="22"/>
+              </w:rPr>
+              <w:t xml:space="preserve">20</w:t>
+            </w:r>
+          </w:p>
+        </w:tc>
+        <w:tc>
+          <w:tcPr>
+            <w:tcW w:w="1150" w:type="dxa"/>
+          </w:tcPr>
+          <w:p>
+            <w:pPr>
+              <w:pStyle w:val="af"/>
+              <w:spacing w:before="0" w:beforeAutospacing="0" w:after="0" w:afterAutospacing="0"/>
+              <w:jc w:val="center"/>
+            </w:pPr>
+            <w:r>
+              <w:rPr>
+                <w:color w:val="000000"/>
+                <w:sz w:val="22"/>
+              </w:rPr>
+              <w:t xml:space="preserve">4</w:t>
+            </w:r>
+          </w:p>
+        </w:tc>
+        <w:tc>
+          <w:tcPr>
+            <w:tcW w:w="2505" w:type="dxa"/>
+          </w:tcPr>
+          <w:p>
+            <w:pPr>
+              <w:pStyle w:val="af"/>
+              <w:spacing w:before="0" w:beforeAutospacing="0" w:after="0" w:afterAutospacing="0"/>
+              <w:jc w:val="left"/>
+            </w:pPr>
+            <w:r>
+              <w:rPr>
+                <w:color w:val="000000"/>
+                <w:sz w:val="22"/>
+              </w:rPr>
+              <w:t xml:space="preserve">4 конвейера</w:t>
+            </w:r>
+          </w:p>
+        </w:tc>
+        <w:tc>
+          <w:tcPr>
+            <w:tcW w:w="1350" w:type="dxa"/>
+          </w:tcPr>
+          <w:p>
+            <w:pPr>
+              <w:pStyle w:val="af"/>
+              <w:spacing w:before="0" w:beforeAutospacing="0" w:after="0" w:afterAutospacing="0"/>
+              <w:jc w:val="center"/>
+            </w:pPr>
+            <w:r>
+              <w:rPr>
+                <w:color w:val="000000"/>
+                <w:sz w:val="22"/>
+              </w:rPr>
+              <w:t xml:space="preserve">102</w:t>
+            </w:r>
+          </w:p>
+        </w:tc>
+        <w:tc>
+          <w:tcPr>
+            <w:tcW w:w="1100" w:type="dxa"/>
+          </w:tcPr>
+          <w:p>
+            <w:pPr>
+              <w:pStyle w:val="af"/>
+              <w:spacing w:before="0" w:beforeAutospacing="0" w:after="0" w:afterAutospacing="0"/>
+              <w:jc w:val="center"/>
+            </w:pPr>
+            <w:r>
+              <w:rPr>
+                <w:color w:val="000000"/>
+                <w:sz w:val="22"/>
+              </w:rPr>
+              <w:t xml:space="preserve">1:30</w:t>
+            </w:r>
+          </w:p>
+        </w:tc>
+        <w:tc>
+          <w:tcPr>
+            <w:tcW w:w="1100" w:type="dxa"/>
+          </w:tcPr>
+          <w:p>
+            <w:pPr>
+              <w:pStyle w:val="af"/>
+              <w:spacing w:before="0" w:beforeAutospacing="0" w:after="0" w:afterAutospacing="0"/>
+              <w:jc w:val="center"/>
+            </w:pPr>
+            <w:r>
+              <w:rPr>
+                <w:color w:val="000000"/>
+                <w:sz w:val="22"/>
+              </w:rPr>
+              <w:t xml:space="preserve">1:50</w:t>
+            </w:r>
+          </w:p>
+        </w:tc>
+        <w:tc>
+          <w:tcPr>
+            <w:tcW w:w="1000" w:type="dxa"/>
+          </w:tcPr>
+          <w:p>
+            <w:pPr>
+              <w:pStyle w:val="af"/>
+              <w:spacing w:before="0" w:beforeAutospacing="0" w:after="0" w:afterAutospacing="0"/>
+              <w:jc w:val="center"/>
+            </w:pPr>
+            <w:r>
+              <w:rPr>
+                <w:color w:val="000000"/>
+                <w:sz w:val="22"/>
+              </w:rPr>
+              <w:t xml:space="preserve">2:00</w:t>
+            </w:r>
+          </w:p>
+        </w:tc>
+      </w:tr>
+    </w:tbl>
+    <w:p>
+      <w:pPr>
+        <w:ind w:firstLine="0"/>
+        <w:jc w:val="center"/>
+      </w:pPr>
+      <w:r>
+        <w:t xml:space="preserve">Уровни кампании по главам</w:t>
+      </w:r>
+    </w:p>
+    <w:p>
+      <w:pPr>
+        <w:pStyle w:val="af"/>
+        <w:spacing w:before="0" w:beforeAutospacing="0" w:after="0" w:afterAutospacing="0"/>
+        <w:ind w:firstLine="709"/>
+        <w:jc w:val="both"/>
+      </w:pPr>
+      <w:r>
+        <w:rPr>
+          <w:color w:val="000000"/>
+        </w:rPr>
+        <w:t xml:space="preserve">Для уровней 11-15 указано стартовое количество предметов. Время на звезды стартовое и будет уточняться по плейтестам. Количество предметов с 6-го уровня будет пересмотрено после плейтеста глав.</w:t>
       </w:r>
     </w:p>
     <w:sectPr>

</xml_diff>

<commit_message>
docs: box rule in GDD, game design document, chapter decisions and plan statuses
</commit_message>
<xml_diff>
--- a/docs/ГДД_2026-09-30.docx
+++ b/docs/ГДД_2026-09-30.docx
@@ -2030,6 +2030,108 @@
     <w:p>
       <w:pPr>
         <w:pStyle w:val="af"/>
+        <w:numPr>
+          <w:ilvl w:val="0"/>
+          <w:numId w:val="14"/>
+        </w:numPr>
+        <w:spacing w:before="0" w:beforeAutospacing="0" w:after="0" w:afterAutospacing="0"/>
+        <w:jc w:val="both"/>
+      </w:pPr>
+      <w:r>
+        <w:rPr>
+          <w:color w:val="000000"/>
+        </w:rPr>
+        <w:t xml:space="preserve">Правило полки-фильтра изменено: предметы с таблички собираются только на этой полке. На плейтесте фильтр можно было не замечать без потерь, теперь полка с табличкой становится коробкой для своих предметов.</w:t>
+      </w:r>
+    </w:p>
+    <w:p>
+      <w:pPr>
+        <w:pStyle w:val="af"/>
+        <w:numPr>
+          <w:ilvl w:val="1"/>
+          <w:numId w:val="14"/>
+        </w:numPr>
+        <w:spacing w:before="0" w:beforeAutospacing="0" w:after="0" w:afterAutospacing="0"/>
+        <w:jc w:val="both"/>
+      </w:pPr>
+      <w:r>
+        <w:rPr>
+          <w:color w:val="000000"/>
+        </w:rPr>
+        <w:t xml:space="preserve">Три одинаковых предмета с таблички на обычной полке не исчезают, их нужно разобрать обычными ходами. Остальные предметы собираются где угодно, в том числе на полке-фильтре;</w:t>
+      </w:r>
+    </w:p>
+    <w:p>
+      <w:pPr>
+        <w:pStyle w:val="af"/>
+        <w:numPr>
+          <w:ilvl w:val="1"/>
+          <w:numId w:val="14"/>
+        </w:numPr>
+        <w:spacing w:before="0" w:beforeAutospacing="0" w:after="0" w:afterAutospacing="0"/>
+        <w:jc w:val="both"/>
+      </w:pPr>
+      <w:r>
+        <w:rPr>
+          <w:color w:val="000000"/>
+        </w:rPr>
+        <w:t xml:space="preserve">Если после хода на обычной полке встала такая тройка, табличка ее полки пульсирует и звучит мягкий звук. Первые три раза за уровень сами предметы еще и резко трясутся из стороны в сторону;</w:t>
+      </w:r>
+    </w:p>
+    <w:p>
+      <w:pPr>
+        <w:pStyle w:val="af"/>
+        <w:numPr>
+          <w:ilvl w:val="1"/>
+          <w:numId w:val="14"/>
+        </w:numPr>
+        <w:spacing w:before="0" w:beforeAutospacing="0" w:after="0" w:afterAutospacing="0"/>
+        <w:jc w:val="both"/>
+      </w:pPr>
+      <w:r>
+        <w:rPr>
+          <w:color w:val="000000"/>
+        </w:rPr>
+        <w:t xml:space="preserve">Когда игрок берет предмет с таблички, табличка его полки увеличивается. Подсказка ведет такие предметы на их полку и не предлагает собирать их на чужой;</w:t>
+      </w:r>
+    </w:p>
+    <w:p>
+      <w:pPr>
+        <w:pStyle w:val="af"/>
+        <w:numPr>
+          <w:ilvl w:val="1"/>
+          <w:numId w:val="14"/>
+        </w:numPr>
+        <w:spacing w:before="0" w:beforeAutospacing="0" w:after="0" w:afterAutospacing="0"/>
+        <w:jc w:val="both"/>
+      </w:pPr>
+      <w:r>
+        <w:rPr>
+          <w:color w:val="000000"/>
+        </w:rPr>
+        <w:t xml:space="preserve">На табличке под каждой иконкой карамельный круг, иконки обведены темным контуром, чтобы светлые и темные предметы читались одинаково. Обводку самих предметов пробовали и убрали: при нескольких табличках подсвечено слишком много предметов;</w:t>
+      </w:r>
+    </w:p>
+    <w:p>
+      <w:pPr>
+        <w:pStyle w:val="af"/>
+        <w:numPr>
+          <w:ilvl w:val="1"/>
+          <w:numId w:val="14"/>
+        </w:numPr>
+        <w:spacing w:before="0" w:beforeAutospacing="0" w:after="0" w:afterAutospacing="0"/>
+        <w:jc w:val="both"/>
+      </w:pPr>
+      <w:r>
+        <w:rPr>
+          <w:color w:val="000000"/>
+        </w:rPr>
+        <w:t xml:space="preserve">Финал главы переделан: на уровне 10 четыре таблички (мяч и игрушка, декор, растение и лампа, мишка) вместо двух табличек по смыслу. Подсказка на первом уровне главы: «Предметы с таблички собираются только на этой полке».</w:t>
+      </w:r>
+    </w:p>
+    <w:p>
+      <w:pPr>
+        <w:pStyle w:val="af"/>
         <w:spacing w:before="0" w:beforeAutospacing="0" w:after="0" w:afterAutospacing="0"/>
       </w:pPr>
     </w:p>
@@ -6468,7 +6570,7 @@
                 <w:color w:val="000000"/>
                 <w:sz w:val="22"/>
               </w:rPr>
-              <w:t xml:space="preserve">фильтры «игрушки» и «декор»</w:t>
+              <w:t xml:space="preserve">4 фильтра</w:t>
             </w:r>
           </w:p>
         </w:tc>

</xml_diff>

<commit_message>
docs: chapter 4 with boxes in GDD, game design document, chapter decisions and filter plan
</commit_message>
<xml_diff>
--- a/docs/ГДД_2026-09-30.docx
+++ b/docs/ГДД_2026-09-30.docx
@@ -2132,6 +2132,74 @@
     <w:p>
       <w:pPr>
         <w:pStyle w:val="af"/>
+        <w:numPr>
+          <w:ilvl w:val="0"/>
+          <w:numId w:val="14"/>
+        </w:numPr>
+        <w:spacing w:before="0" w:beforeAutospacing="0" w:after="0" w:afterAutospacing="0"/>
+        <w:jc w:val="both"/>
+      </w:pPr>
+      <w:r>
+        <w:rPr>
+          <w:color w:val="000000"/>
+        </w:rPr>
+        <w:t xml:space="preserve">Финал главы 4 изменен: на уровне 20 к конвейерам добавлена полка-фильтр. Одна табличка с лампой висит на обычной полке рядом с лентами, игрок применяет правило второй главы в условиях четвертой.</w:t>
+      </w:r>
+    </w:p>
+    <w:p>
+      <w:pPr>
+        <w:pStyle w:val="af"/>
+        <w:numPr>
+          <w:ilvl w:val="1"/>
+          <w:numId w:val="14"/>
+        </w:numPr>
+        <w:spacing w:before="0" w:beforeAutospacing="0" w:after="0" w:afterAutospacing="0"/>
+        <w:jc w:val="both"/>
+      </w:pPr>
+      <w:r>
+        <w:rPr>
+          <w:color w:val="000000"/>
+        </w:rPr>
+        <w:t xml:space="preserve">Лента не кладет предметы на полку с табличкой, а лампы на ленте не собираются, они только проезжают. Если сдвиг ленты собрал три лампы, срабатывает тот же отклик, что и для тройки на обычной полке;</w:t>
+      </w:r>
+    </w:p>
+    <w:p>
+      <w:pPr>
+        <w:pStyle w:val="af"/>
+        <w:numPr>
+          <w:ilvl w:val="1"/>
+          <w:numId w:val="14"/>
+        </w:numPr>
+        <w:spacing w:before="0" w:beforeAutospacing="0" w:after="0" w:afterAutospacing="0"/>
+        <w:jc w:val="both"/>
+      </w:pPr>
+      <w:r>
+        <w:rPr>
+          <w:color w:val="000000"/>
+        </w:rPr>
+        <w:t xml:space="preserve">Чтобы лампы на полке не стояли готовыми рядами, в раскладку уровня добавлены 3 обмена, как в главе 2. Обмен в раскладке не дает мэтча, поэтому ленты не сдвигает;</w:t>
+      </w:r>
+    </w:p>
+    <w:p>
+      <w:pPr>
+        <w:pStyle w:val="af"/>
+        <w:numPr>
+          <w:ilvl w:val="1"/>
+          <w:numId w:val="14"/>
+        </w:numPr>
+        <w:spacing w:before="0" w:beforeAutospacing="0" w:after="0" w:afterAutospacing="0"/>
+        <w:jc w:val="both"/>
+      </w:pPr>
+      <w:r>
+        <w:rPr>
+          <w:color w:val="000000"/>
+        </w:rPr>
+        <w:t xml:space="preserve">На карточке уровня 20 под наклейкой конвейеров стоит вторая наклейка с фильтром. Подсказку с правилом на этом уровне повторно не показываем.</w:t>
+      </w:r>
+    </w:p>
+    <w:p>
+      <w:pPr>
+        <w:pStyle w:val="af"/>
         <w:spacing w:before="0" w:beforeAutospacing="0" w:after="0" w:afterAutospacing="0"/>
       </w:pPr>
     </w:p>
@@ -5918,26 +5986,26 @@
                 <w:color w:val="000000"/>
                 <w:sz w:val="22"/>
               </w:rPr>
+              <w:t xml:space="preserve">0:40</w:t>
+            </w:r>
+          </w:p>
+        </w:tc>
+        <w:tc>
+          <w:tcPr>
+            <w:tcW w:w="1100" w:type="dxa"/>
+          </w:tcPr>
+          <w:p>
+            <w:pPr>
+              <w:pStyle w:val="af"/>
+              <w:spacing w:before="0" w:beforeAutospacing="0" w:after="0" w:afterAutospacing="0"/>
+              <w:jc w:val="center"/>
+            </w:pPr>
+            <w:r>
+              <w:rPr>
+                <w:color w:val="000000"/>
+                <w:sz w:val="22"/>
+              </w:rPr>
               <w:t xml:space="preserve">1:00</w:t>
-            </w:r>
-          </w:p>
-        </w:tc>
-        <w:tc>
-          <w:tcPr>
-            <w:tcW w:w="1100" w:type="dxa"/>
-          </w:tcPr>
-          <w:p>
-            <w:pPr>
-              <w:pStyle w:val="af"/>
-              <w:spacing w:before="0" w:beforeAutospacing="0" w:after="0" w:afterAutospacing="0"/>
-              <w:jc w:val="center"/>
-            </w:pPr>
-            <w:r>
-              <w:rPr>
-                <w:color w:val="000000"/>
-                <w:sz w:val="22"/>
-              </w:rPr>
-              <w:t xml:space="preserve">0:40</w:t>
             </w:r>
           </w:p>
         </w:tc>
@@ -6056,26 +6124,26 @@
                 <w:color w:val="000000"/>
                 <w:sz w:val="22"/>
               </w:rPr>
+              <w:t xml:space="preserve">0:40</w:t>
+            </w:r>
+          </w:p>
+        </w:tc>
+        <w:tc>
+          <w:tcPr>
+            <w:tcW w:w="1100" w:type="dxa"/>
+          </w:tcPr>
+          <w:p>
+            <w:pPr>
+              <w:pStyle w:val="af"/>
+              <w:spacing w:before="0" w:beforeAutospacing="0" w:after="0" w:afterAutospacing="0"/>
+              <w:jc w:val="center"/>
+            </w:pPr>
+            <w:r>
+              <w:rPr>
+                <w:color w:val="000000"/>
+                <w:sz w:val="22"/>
+              </w:rPr>
               <w:t xml:space="preserve">1:00</w:t>
-            </w:r>
-          </w:p>
-        </w:tc>
-        <w:tc>
-          <w:tcPr>
-            <w:tcW w:w="1100" w:type="dxa"/>
-          </w:tcPr>
-          <w:p>
-            <w:pPr>
-              <w:pStyle w:val="af"/>
-              <w:spacing w:before="0" w:beforeAutospacing="0" w:after="0" w:afterAutospacing="0"/>
-              <w:jc w:val="center"/>
-            </w:pPr>
-            <w:r>
-              <w:rPr>
-                <w:color w:val="000000"/>
-                <w:sz w:val="22"/>
-              </w:rPr>
-              <w:t xml:space="preserve">0:40</w:t>
             </w:r>
           </w:p>
         </w:tc>
@@ -7950,7 +8018,7 @@
                 <w:color w:val="000000"/>
                 <w:sz w:val="22"/>
               </w:rPr>
-              <w:t xml:space="preserve">4 конвейера</w:t>
+              <w:t xml:space="preserve">4 конвейера, фильтр: лампа</w:t>
             </w:r>
           </w:p>
         </w:tc>

</xml_diff>

<commit_message>
feat: defeat window styled like victory window
</commit_message>
<xml_diff>
--- a/docs/ГДД_2026-09-30.docx
+++ b/docs/ГДД_2026-09-30.docx
@@ -2195,6 +2195,57 @@
           <w:color w:val="000000"/>
         </w:rPr>
         <w:t xml:space="preserve">На карточке уровня 20 под наклейкой конвейеров стоит вторая наклейка с фильтром. Подсказку с правилом на этом уровне повторно не показываем.</w:t>
+      </w:r>
+    </w:p>
+    <w:p>
+      <w:pPr>
+        <w:pStyle w:val="af"/>
+        <w:numPr>
+          <w:ilvl w:val="0"/>
+          <w:numId w:val="14"/>
+        </w:numPr>
+        <w:spacing w:before="0" w:beforeAutospacing="0" w:after="0" w:afterAutospacing="0"/>
+        <w:jc w:val="both"/>
+      </w:pPr>
+      <w:r>
+        <w:rPr>
+          <w:color w:val="000000"/>
+        </w:rPr>
+        <w:t xml:space="preserve">Окно поражения переделано в стиле окна победы. Сверху на панели оранжевая плашка «Время вышло», под ней часы на медленно вращающихся лучах и фраза «Еще попытка, и все получится!».</w:t>
+      </w:r>
+    </w:p>
+    <w:p>
+      <w:pPr>
+        <w:pStyle w:val="af"/>
+        <w:numPr>
+          <w:ilvl w:val="1"/>
+          <w:numId w:val="14"/>
+        </w:numPr>
+        <w:spacing w:before="0" w:beforeAutospacing="0" w:after="0" w:afterAutospacing="0"/>
+        <w:jc w:val="both"/>
+      </w:pPr>
+      <w:r>
+        <w:rPr>
+          <w:color w:val="000000"/>
+        </w:rPr>
+        <w:t xml:space="preserve">Вместо числа оставшихся предметов показывается полоса «Собрано N / M»: сколько предметов игрок успел собрать из всех, что были на уровне. Полоса заполняется при появлении окна, часы в этот момент вздрагивают;</w:t>
+      </w:r>
+    </w:p>
+    <w:p>
+      <w:pPr>
+        <w:pStyle w:val="af"/>
+        <w:numPr>
+          <w:ilvl w:val="1"/>
+          <w:numId w:val="14"/>
+        </w:numPr>
+        <w:spacing w:before="0" w:beforeAutospacing="0" w:after="0" w:afterAutospacing="0"/>
+        <w:jc w:val="both"/>
+      </w:pPr>
+      <w:r>
+        <w:rPr>
+          <w:color w:val="000000"/>
+        </w:rPr>
+        <w:t xml:space="preserve">Главная кнопка «Попробовать снова» выделена ярким цветом, «В меню» второстепенная. Рядом с очками показывается лучший счет уровня.</w:t>
       </w:r>
     </w:p>
     <w:p>

</xml_diff>

<commit_message>
chore: WebGL build, final checks and chapter 5 docs
</commit_message>
<xml_diff>
--- a/docs/ГДД_2026-09-30.docx
+++ b/docs/ГДД_2026-09-30.docx
@@ -2251,6 +2251,125 @@
     <w:p>
       <w:pPr>
         <w:pStyle w:val="af"/>
+        <w:numPr>
+          <w:ilvl w:val="0"/>
+          <w:numId w:val="14"/>
+        </w:numPr>
+        <w:spacing w:before="0" w:beforeAutospacing="0" w:after="0" w:afterAutospacing="0"/>
+        <w:jc w:val="both"/>
+      </w:pPr>
+      <w:r>
+        <w:rPr>
+          <w:color w:val="000000"/>
+        </w:rPr>
+        <w:t xml:space="preserve">Добавлена глава 5 Хранилище, уровни 21-25, на новой локации банковского хранилища: полки с ключами и сейфы.</w:t>
+      </w:r>
+    </w:p>
+    <w:p>
+      <w:pPr>
+        <w:pStyle w:val="af"/>
+        <w:numPr>
+          <w:ilvl w:val="1"/>
+          <w:numId w:val="14"/>
+        </w:numPr>
+        <w:spacing w:before="0" w:beforeAutospacing="0" w:after="0" w:afterAutospacing="0"/>
+        <w:jc w:val="both"/>
+      </w:pPr>
+      <w:r>
+        <w:rPr>
+          <w:color w:val="000000"/>
+        </w:rPr>
+        <w:t xml:space="preserve">Часть полок стоит за решеткой с замком, это сейфы. Предметы в сейфе видно, но брать их, класть на сейф и меняться с ним нельзя, мэтч за решеткой не собирается;</w:t>
+      </w:r>
+    </w:p>
+    <w:p>
+      <w:pPr>
+        <w:pStyle w:val="af"/>
+        <w:numPr>
+          <w:ilvl w:val="1"/>
+          <w:numId w:val="14"/>
+        </w:numPr>
+        <w:spacing w:before="0" w:beforeAutospacing="0" w:after="0" w:afterAutospacing="0"/>
+        <w:jc w:val="both"/>
+      </w:pPr>
+      <w:r>
+        <w:rPr>
+          <w:color w:val="000000"/>
+        </w:rPr>
+        <w:t xml:space="preserve">Ключ лежит в очереди одной из колонок обычной полки, перед ним минимум один предмет. Когда ключ оказывается впереди, он сам улетает в замок своего сейфа, решетка поднимается, и сейф навсегда становится обычной полкой. На ключе и замке одинаковый знак, по нему видно, какой сейф откроется;</w:t>
+      </w:r>
+    </w:p>
+    <w:p>
+      <w:pPr>
+        <w:pStyle w:val="af"/>
+        <w:numPr>
+          <w:ilvl w:val="1"/>
+          <w:numId w:val="14"/>
+        </w:numPr>
+        <w:spacing w:before="0" w:beforeAutospacing="0" w:after="0" w:afterAutospacing="0"/>
+        <w:jc w:val="both"/>
+      </w:pPr>
+      <w:r>
+        <w:rPr>
+          <w:color w:val="000000"/>
+        </w:rPr>
+        <w:t xml:space="preserve">Сбор ключа не считается ходом: не дает очков, комбо и времени. Полка ключа освобождается сразу, сейф становится доступен после открытия решетки, примерно через полторы секунды;</w:t>
+      </w:r>
+    </w:p>
+    <w:p>
+      <w:pPr>
+        <w:pStyle w:val="af"/>
+        <w:numPr>
+          <w:ilvl w:val="1"/>
+          <w:numId w:val="14"/>
+        </w:numPr>
+        <w:spacing w:before="0" w:beforeAutospacing="0" w:after="0" w:afterAutospacing="0"/>
+        <w:jc w:val="both"/>
+      </w:pPr>
+      <w:r>
+        <w:rPr>
+          <w:color w:val="000000"/>
+        </w:rPr>
+        <w:t xml:space="preserve">По главе растет число сейфов (1, 2, 3, 4, 4) и глубина ключа в очереди, но не больше 3 предметов перед ним. Время на звезды подобрано по двум плейтестам, все попытки прошли на 3 звезды;</w:t>
+      </w:r>
+    </w:p>
+    <w:p>
+      <w:pPr>
+        <w:pStyle w:val="af"/>
+        <w:numPr>
+          <w:ilvl w:val="1"/>
+          <w:numId w:val="14"/>
+        </w:numPr>
+        <w:spacing w:before="0" w:beforeAutospacing="0" w:after="0" w:afterAutospacing="0"/>
+        <w:jc w:val="both"/>
+      </w:pPr>
+      <w:r>
+        <w:rPr>
+          <w:color w:val="000000"/>
+        </w:rPr>
+        <w:t xml:space="preserve">Ключ темный, за ним золотое свечение. Ключ выходит вперед, по дуге перелетает в замок и проворачивается, решетка сворачивается вверх, предметы сейфа подпрыгивают волной. При наведении предмета на сейф решетка вздрагивает. Подсказка с правилом не нужна: на плейтесте сбор понятен без объяснений;</w:t>
+      </w:r>
+    </w:p>
+    <w:p>
+      <w:pPr>
+        <w:pStyle w:val="af"/>
+        <w:numPr>
+          <w:ilvl w:val="1"/>
+          <w:numId w:val="14"/>
+        </w:numPr>
+        <w:spacing w:before="0" w:beforeAutospacing="0" w:after="0" w:afterAutospacing="0"/>
+        <w:jc w:val="both"/>
+      </w:pPr>
+      <w:r>
+        <w:rPr>
+          <w:color w:val="000000"/>
+        </w:rPr>
+        <w:t xml:space="preserve">Ключ внутри другого сейфа (цепочка ключей) пока отложен.</w:t>
+      </w:r>
+    </w:p>
+    <w:p>
+      <w:pPr>
+        <w:pStyle w:val="af"/>
         <w:spacing w:before="0" w:beforeAutospacing="0" w:after="0" w:afterAutospacing="0"/>
       </w:pPr>
     </w:p>
@@ -8146,6 +8265,696 @@
                 <w:sz w:val="22"/>
               </w:rPr>
               <w:t xml:space="preserve">2:00</w:t>
+            </w:r>
+          </w:p>
+        </w:tc>
+      </w:tr>
+      <w:tr>
+        <w:trPr>
+          <w:cantSplit/>
+        </w:trPr>
+        <w:tc>
+          <w:tcPr>
+            <w:tcW w:w="1150" w:type="dxa"/>
+          </w:tcPr>
+          <w:p>
+            <w:pPr>
+              <w:pStyle w:val="af"/>
+              <w:spacing w:before="0" w:beforeAutospacing="0" w:after="0" w:afterAutospacing="0"/>
+              <w:jc w:val="center"/>
+            </w:pPr>
+            <w:r>
+              <w:rPr>
+                <w:color w:val="000000"/>
+                <w:sz w:val="22"/>
+              </w:rPr>
+              <w:t xml:space="preserve">21</w:t>
+            </w:r>
+          </w:p>
+        </w:tc>
+        <w:tc>
+          <w:tcPr>
+            <w:tcW w:w="1150" w:type="dxa"/>
+          </w:tcPr>
+          <w:p>
+            <w:pPr>
+              <w:pStyle w:val="af"/>
+              <w:spacing w:before="0" w:beforeAutospacing="0" w:after="0" w:afterAutospacing="0"/>
+              <w:jc w:val="center"/>
+            </w:pPr>
+            <w:r>
+              <w:rPr>
+                <w:color w:val="000000"/>
+                <w:sz w:val="22"/>
+              </w:rPr>
+              <w:t xml:space="preserve">5</w:t>
+            </w:r>
+          </w:p>
+        </w:tc>
+        <w:tc>
+          <w:tcPr>
+            <w:tcW w:w="2505" w:type="dxa"/>
+          </w:tcPr>
+          <w:p>
+            <w:pPr>
+              <w:pStyle w:val="af"/>
+              <w:spacing w:before="0" w:beforeAutospacing="0" w:after="0" w:afterAutospacing="0"/>
+              <w:jc w:val="left"/>
+            </w:pPr>
+            <w:r>
+              <w:rPr>
+                <w:color w:val="000000"/>
+                <w:sz w:val="22"/>
+              </w:rPr>
+              <w:t xml:space="preserve">1 сейф</w:t>
+            </w:r>
+          </w:p>
+        </w:tc>
+        <w:tc>
+          <w:tcPr>
+            <w:tcW w:w="1350" w:type="dxa"/>
+          </w:tcPr>
+          <w:p>
+            <w:pPr>
+              <w:pStyle w:val="af"/>
+              <w:spacing w:before="0" w:beforeAutospacing="0" w:after="0" w:afterAutospacing="0"/>
+              <w:jc w:val="center"/>
+            </w:pPr>
+            <w:r>
+              <w:rPr>
+                <w:color w:val="000000"/>
+                <w:sz w:val="22"/>
+              </w:rPr>
+              <w:t xml:space="preserve">42</w:t>
+            </w:r>
+          </w:p>
+        </w:tc>
+        <w:tc>
+          <w:tcPr>
+            <w:tcW w:w="1100" w:type="dxa"/>
+          </w:tcPr>
+          <w:p>
+            <w:pPr>
+              <w:pStyle w:val="af"/>
+              <w:spacing w:before="0" w:beforeAutospacing="0" w:after="0" w:afterAutospacing="0"/>
+              <w:jc w:val="center"/>
+            </w:pPr>
+            <w:r>
+              <w:rPr>
+                <w:color w:val="000000"/>
+                <w:sz w:val="22"/>
+              </w:rPr>
+              <w:t xml:space="preserve">0:35</w:t>
+            </w:r>
+          </w:p>
+        </w:tc>
+        <w:tc>
+          <w:tcPr>
+            <w:tcW w:w="1100" w:type="dxa"/>
+          </w:tcPr>
+          <w:p>
+            <w:pPr>
+              <w:pStyle w:val="af"/>
+              <w:spacing w:before="0" w:beforeAutospacing="0" w:after="0" w:afterAutospacing="0"/>
+              <w:jc w:val="center"/>
+            </w:pPr>
+            <w:r>
+              <w:rPr>
+                <w:color w:val="000000"/>
+                <w:sz w:val="22"/>
+              </w:rPr>
+              <w:t xml:space="preserve">0:50</w:t>
+            </w:r>
+          </w:p>
+        </w:tc>
+        <w:tc>
+          <w:tcPr>
+            <w:tcW w:w="1000" w:type="dxa"/>
+          </w:tcPr>
+          <w:p>
+            <w:pPr>
+              <w:pStyle w:val="af"/>
+              <w:spacing w:before="0" w:beforeAutospacing="0" w:after="0" w:afterAutospacing="0"/>
+              <w:jc w:val="center"/>
+            </w:pPr>
+            <w:r>
+              <w:rPr>
+                <w:color w:val="000000"/>
+                <w:sz w:val="22"/>
+              </w:rPr>
+              <w:t xml:space="preserve">1:10</w:t>
+            </w:r>
+          </w:p>
+        </w:tc>
+      </w:tr>
+      <w:tr>
+        <w:trPr>
+          <w:cantSplit/>
+        </w:trPr>
+        <w:tc>
+          <w:tcPr>
+            <w:tcW w:w="1150" w:type="dxa"/>
+          </w:tcPr>
+          <w:p>
+            <w:pPr>
+              <w:pStyle w:val="af"/>
+              <w:spacing w:before="0" w:beforeAutospacing="0" w:after="0" w:afterAutospacing="0"/>
+              <w:jc w:val="center"/>
+            </w:pPr>
+            <w:r>
+              <w:rPr>
+                <w:color w:val="000000"/>
+                <w:sz w:val="22"/>
+              </w:rPr>
+              <w:t xml:space="preserve">22</w:t>
+            </w:r>
+          </w:p>
+        </w:tc>
+        <w:tc>
+          <w:tcPr>
+            <w:tcW w:w="1150" w:type="dxa"/>
+          </w:tcPr>
+          <w:p>
+            <w:pPr>
+              <w:pStyle w:val="af"/>
+              <w:spacing w:before="0" w:beforeAutospacing="0" w:after="0" w:afterAutospacing="0"/>
+              <w:jc w:val="center"/>
+            </w:pPr>
+            <w:r>
+              <w:rPr>
+                <w:color w:val="000000"/>
+                <w:sz w:val="22"/>
+              </w:rPr>
+              <w:t xml:space="preserve">5</w:t>
+            </w:r>
+          </w:p>
+        </w:tc>
+        <w:tc>
+          <w:tcPr>
+            <w:tcW w:w="2505" w:type="dxa"/>
+          </w:tcPr>
+          <w:p>
+            <w:pPr>
+              <w:pStyle w:val="af"/>
+              <w:spacing w:before="0" w:beforeAutospacing="0" w:after="0" w:afterAutospacing="0"/>
+              <w:jc w:val="left"/>
+            </w:pPr>
+            <w:r>
+              <w:rPr>
+                <w:color w:val="000000"/>
+                <w:sz w:val="22"/>
+              </w:rPr>
+              <w:t xml:space="preserve">2 сейфа</w:t>
+            </w:r>
+          </w:p>
+        </w:tc>
+        <w:tc>
+          <w:tcPr>
+            <w:tcW w:w="1350" w:type="dxa"/>
+          </w:tcPr>
+          <w:p>
+            <w:pPr>
+              <w:pStyle w:val="af"/>
+              <w:spacing w:before="0" w:beforeAutospacing="0" w:after="0" w:afterAutospacing="0"/>
+              <w:jc w:val="center"/>
+            </w:pPr>
+            <w:r>
+              <w:rPr>
+                <w:color w:val="000000"/>
+                <w:sz w:val="22"/>
+              </w:rPr>
+              <w:t xml:space="preserve">45</w:t>
+            </w:r>
+          </w:p>
+        </w:tc>
+        <w:tc>
+          <w:tcPr>
+            <w:tcW w:w="1100" w:type="dxa"/>
+          </w:tcPr>
+          <w:p>
+            <w:pPr>
+              <w:pStyle w:val="af"/>
+              <w:spacing w:before="0" w:beforeAutospacing="0" w:after="0" w:afterAutospacing="0"/>
+              <w:jc w:val="center"/>
+            </w:pPr>
+            <w:r>
+              <w:rPr>
+                <w:color w:val="000000"/>
+                <w:sz w:val="22"/>
+              </w:rPr>
+              <w:t xml:space="preserve">0:35</w:t>
+            </w:r>
+          </w:p>
+        </w:tc>
+        <w:tc>
+          <w:tcPr>
+            <w:tcW w:w="1100" w:type="dxa"/>
+          </w:tcPr>
+          <w:p>
+            <w:pPr>
+              <w:pStyle w:val="af"/>
+              <w:spacing w:before="0" w:beforeAutospacing="0" w:after="0" w:afterAutospacing="0"/>
+              <w:jc w:val="center"/>
+            </w:pPr>
+            <w:r>
+              <w:rPr>
+                <w:color w:val="000000"/>
+                <w:sz w:val="22"/>
+              </w:rPr>
+              <w:t xml:space="preserve">0:55</w:t>
+            </w:r>
+          </w:p>
+        </w:tc>
+        <w:tc>
+          <w:tcPr>
+            <w:tcW w:w="1000" w:type="dxa"/>
+          </w:tcPr>
+          <w:p>
+            <w:pPr>
+              <w:pStyle w:val="af"/>
+              <w:spacing w:before="0" w:beforeAutospacing="0" w:after="0" w:afterAutospacing="0"/>
+              <w:jc w:val="center"/>
+            </w:pPr>
+            <w:r>
+              <w:rPr>
+                <w:color w:val="000000"/>
+                <w:sz w:val="22"/>
+              </w:rPr>
+              <w:t xml:space="preserve">1:15</w:t>
+            </w:r>
+          </w:p>
+        </w:tc>
+      </w:tr>
+      <w:tr>
+        <w:trPr>
+          <w:cantSplit/>
+        </w:trPr>
+        <w:tc>
+          <w:tcPr>
+            <w:tcW w:w="1150" w:type="dxa"/>
+          </w:tcPr>
+          <w:p>
+            <w:pPr>
+              <w:pStyle w:val="af"/>
+              <w:spacing w:before="0" w:beforeAutospacing="0" w:after="0" w:afterAutospacing="0"/>
+              <w:jc w:val="center"/>
+            </w:pPr>
+            <w:r>
+              <w:rPr>
+                <w:color w:val="000000"/>
+                <w:sz w:val="22"/>
+              </w:rPr>
+              <w:t xml:space="preserve">23</w:t>
+            </w:r>
+          </w:p>
+        </w:tc>
+        <w:tc>
+          <w:tcPr>
+            <w:tcW w:w="1150" w:type="dxa"/>
+          </w:tcPr>
+          <w:p>
+            <w:pPr>
+              <w:pStyle w:val="af"/>
+              <w:spacing w:before="0" w:beforeAutospacing="0" w:after="0" w:afterAutospacing="0"/>
+              <w:jc w:val="center"/>
+            </w:pPr>
+            <w:r>
+              <w:rPr>
+                <w:color w:val="000000"/>
+                <w:sz w:val="22"/>
+              </w:rPr>
+              <w:t xml:space="preserve">5</w:t>
+            </w:r>
+          </w:p>
+        </w:tc>
+        <w:tc>
+          <w:tcPr>
+            <w:tcW w:w="2505" w:type="dxa"/>
+          </w:tcPr>
+          <w:p>
+            <w:pPr>
+              <w:pStyle w:val="af"/>
+              <w:spacing w:before="0" w:beforeAutospacing="0" w:after="0" w:afterAutospacing="0"/>
+              <w:jc w:val="left"/>
+            </w:pPr>
+            <w:r>
+              <w:rPr>
+                <w:color w:val="000000"/>
+                <w:sz w:val="22"/>
+              </w:rPr>
+              <w:t xml:space="preserve">3 сейфа</w:t>
+            </w:r>
+          </w:p>
+        </w:tc>
+        <w:tc>
+          <w:tcPr>
+            <w:tcW w:w="1350" w:type="dxa"/>
+          </w:tcPr>
+          <w:p>
+            <w:pPr>
+              <w:pStyle w:val="af"/>
+              <w:spacing w:before="0" w:beforeAutospacing="0" w:after="0" w:afterAutospacing="0"/>
+              <w:jc w:val="center"/>
+            </w:pPr>
+            <w:r>
+              <w:rPr>
+                <w:color w:val="000000"/>
+                <w:sz w:val="22"/>
+              </w:rPr>
+              <w:t xml:space="preserve">48</w:t>
+            </w:r>
+          </w:p>
+        </w:tc>
+        <w:tc>
+          <w:tcPr>
+            <w:tcW w:w="1100" w:type="dxa"/>
+          </w:tcPr>
+          <w:p>
+            <w:pPr>
+              <w:pStyle w:val="af"/>
+              <w:spacing w:before="0" w:beforeAutospacing="0" w:after="0" w:afterAutospacing="0"/>
+              <w:jc w:val="center"/>
+            </w:pPr>
+            <w:r>
+              <w:rPr>
+                <w:color w:val="000000"/>
+                <w:sz w:val="22"/>
+              </w:rPr>
+              <w:t xml:space="preserve">0:45</w:t>
+            </w:r>
+          </w:p>
+        </w:tc>
+        <w:tc>
+          <w:tcPr>
+            <w:tcW w:w="1100" w:type="dxa"/>
+          </w:tcPr>
+          <w:p>
+            <w:pPr>
+              <w:pStyle w:val="af"/>
+              <w:spacing w:before="0" w:beforeAutospacing="0" w:after="0" w:afterAutospacing="0"/>
+              <w:jc w:val="center"/>
+            </w:pPr>
+            <w:r>
+              <w:rPr>
+                <w:color w:val="000000"/>
+                <w:sz w:val="22"/>
+              </w:rPr>
+              <w:t xml:space="preserve">1:05</w:t>
+            </w:r>
+          </w:p>
+        </w:tc>
+        <w:tc>
+          <w:tcPr>
+            <w:tcW w:w="1000" w:type="dxa"/>
+          </w:tcPr>
+          <w:p>
+            <w:pPr>
+              <w:pStyle w:val="af"/>
+              <w:spacing w:before="0" w:beforeAutospacing="0" w:after="0" w:afterAutospacing="0"/>
+              <w:jc w:val="center"/>
+            </w:pPr>
+            <w:r>
+              <w:rPr>
+                <w:color w:val="000000"/>
+                <w:sz w:val="22"/>
+              </w:rPr>
+              <w:t xml:space="preserve">1:20</w:t>
+            </w:r>
+          </w:p>
+        </w:tc>
+      </w:tr>
+      <w:tr>
+        <w:trPr>
+          <w:cantSplit/>
+        </w:trPr>
+        <w:tc>
+          <w:tcPr>
+            <w:tcW w:w="1150" w:type="dxa"/>
+          </w:tcPr>
+          <w:p>
+            <w:pPr>
+              <w:pStyle w:val="af"/>
+              <w:spacing w:before="0" w:beforeAutospacing="0" w:after="0" w:afterAutospacing="0"/>
+              <w:jc w:val="center"/>
+            </w:pPr>
+            <w:r>
+              <w:rPr>
+                <w:color w:val="000000"/>
+                <w:sz w:val="22"/>
+              </w:rPr>
+              <w:t xml:space="preserve">24</w:t>
+            </w:r>
+          </w:p>
+        </w:tc>
+        <w:tc>
+          <w:tcPr>
+            <w:tcW w:w="1150" w:type="dxa"/>
+          </w:tcPr>
+          <w:p>
+            <w:pPr>
+              <w:pStyle w:val="af"/>
+              <w:spacing w:before="0" w:beforeAutospacing="0" w:after="0" w:afterAutospacing="0"/>
+              <w:jc w:val="center"/>
+            </w:pPr>
+            <w:r>
+              <w:rPr>
+                <w:color w:val="000000"/>
+                <w:sz w:val="22"/>
+              </w:rPr>
+              <w:t xml:space="preserve">5</w:t>
+            </w:r>
+          </w:p>
+        </w:tc>
+        <w:tc>
+          <w:tcPr>
+            <w:tcW w:w="2505" w:type="dxa"/>
+          </w:tcPr>
+          <w:p>
+            <w:pPr>
+              <w:pStyle w:val="af"/>
+              <w:spacing w:before="0" w:beforeAutospacing="0" w:after="0" w:afterAutospacing="0"/>
+              <w:jc w:val="left"/>
+            </w:pPr>
+            <w:r>
+              <w:rPr>
+                <w:color w:val="000000"/>
+                <w:sz w:val="22"/>
+              </w:rPr>
+              <w:t xml:space="preserve">4 сейфа</w:t>
+            </w:r>
+          </w:p>
+        </w:tc>
+        <w:tc>
+          <w:tcPr>
+            <w:tcW w:w="1350" w:type="dxa"/>
+          </w:tcPr>
+          <w:p>
+            <w:pPr>
+              <w:pStyle w:val="af"/>
+              <w:spacing w:before="0" w:beforeAutospacing="0" w:after="0" w:afterAutospacing="0"/>
+              <w:jc w:val="center"/>
+            </w:pPr>
+            <w:r>
+              <w:rPr>
+                <w:color w:val="000000"/>
+                <w:sz w:val="22"/>
+              </w:rPr>
+              <w:t xml:space="preserve">51</w:t>
+            </w:r>
+          </w:p>
+        </w:tc>
+        <w:tc>
+          <w:tcPr>
+            <w:tcW w:w="1100" w:type="dxa"/>
+          </w:tcPr>
+          <w:p>
+            <w:pPr>
+              <w:pStyle w:val="af"/>
+              <w:spacing w:before="0" w:beforeAutospacing="0" w:after="0" w:afterAutospacing="0"/>
+              <w:jc w:val="center"/>
+            </w:pPr>
+            <w:r>
+              <w:rPr>
+                <w:color w:val="000000"/>
+                <w:sz w:val="22"/>
+              </w:rPr>
+              <w:t xml:space="preserve">0:50</w:t>
+            </w:r>
+          </w:p>
+        </w:tc>
+        <w:tc>
+          <w:tcPr>
+            <w:tcW w:w="1100" w:type="dxa"/>
+          </w:tcPr>
+          <w:p>
+            <w:pPr>
+              <w:pStyle w:val="af"/>
+              <w:spacing w:before="0" w:beforeAutospacing="0" w:after="0" w:afterAutospacing="0"/>
+              <w:jc w:val="center"/>
+            </w:pPr>
+            <w:r>
+              <w:rPr>
+                <w:color w:val="000000"/>
+                <w:sz w:val="22"/>
+              </w:rPr>
+              <w:t xml:space="preserve">1:10</w:t>
+            </w:r>
+          </w:p>
+        </w:tc>
+        <w:tc>
+          <w:tcPr>
+            <w:tcW w:w="1000" w:type="dxa"/>
+          </w:tcPr>
+          <w:p>
+            <w:pPr>
+              <w:pStyle w:val="af"/>
+              <w:spacing w:before="0" w:beforeAutospacing="0" w:after="0" w:afterAutospacing="0"/>
+              <w:jc w:val="center"/>
+            </w:pPr>
+            <w:r>
+              <w:rPr>
+                <w:color w:val="000000"/>
+                <w:sz w:val="22"/>
+              </w:rPr>
+              <w:t xml:space="preserve">1:30</w:t>
+            </w:r>
+          </w:p>
+        </w:tc>
+      </w:tr>
+      <w:tr>
+        <w:trPr>
+          <w:cantSplit/>
+        </w:trPr>
+        <w:tc>
+          <w:tcPr>
+            <w:tcW w:w="1150" w:type="dxa"/>
+          </w:tcPr>
+          <w:p>
+            <w:pPr>
+              <w:pStyle w:val="af"/>
+              <w:spacing w:before="0" w:beforeAutospacing="0" w:after="0" w:afterAutospacing="0"/>
+              <w:jc w:val="center"/>
+            </w:pPr>
+            <w:r>
+              <w:rPr>
+                <w:color w:val="000000"/>
+                <w:sz w:val="22"/>
+              </w:rPr>
+              <w:t xml:space="preserve">25</w:t>
+            </w:r>
+          </w:p>
+        </w:tc>
+        <w:tc>
+          <w:tcPr>
+            <w:tcW w:w="1150" w:type="dxa"/>
+          </w:tcPr>
+          <w:p>
+            <w:pPr>
+              <w:pStyle w:val="af"/>
+              <w:spacing w:before="0" w:beforeAutospacing="0" w:after="0" w:afterAutospacing="0"/>
+              <w:jc w:val="center"/>
+            </w:pPr>
+            <w:r>
+              <w:rPr>
+                <w:color w:val="000000"/>
+                <w:sz w:val="22"/>
+              </w:rPr>
+              <w:t xml:space="preserve">5</w:t>
+            </w:r>
+          </w:p>
+        </w:tc>
+        <w:tc>
+          <w:tcPr>
+            <w:tcW w:w="2505" w:type="dxa"/>
+          </w:tcPr>
+          <w:p>
+            <w:pPr>
+              <w:pStyle w:val="af"/>
+              <w:spacing w:before="0" w:beforeAutospacing="0" w:after="0" w:afterAutospacing="0"/>
+              <w:jc w:val="left"/>
+            </w:pPr>
+            <w:r>
+              <w:rPr>
+                <w:color w:val="000000"/>
+                <w:sz w:val="22"/>
+              </w:rPr>
+              <w:t xml:space="preserve">4 сейфа</w:t>
+            </w:r>
+          </w:p>
+        </w:tc>
+        <w:tc>
+          <w:tcPr>
+            <w:tcW w:w="1350" w:type="dxa"/>
+          </w:tcPr>
+          <w:p>
+            <w:pPr>
+              <w:pStyle w:val="af"/>
+              <w:spacing w:before="0" w:beforeAutospacing="0" w:after="0" w:afterAutospacing="0"/>
+              <w:jc w:val="center"/>
+            </w:pPr>
+            <w:r>
+              <w:rPr>
+                <w:color w:val="000000"/>
+                <w:sz w:val="22"/>
+              </w:rPr>
+              <w:t xml:space="preserve">54</w:t>
+            </w:r>
+          </w:p>
+        </w:tc>
+        <w:tc>
+          <w:tcPr>
+            <w:tcW w:w="1100" w:type="dxa"/>
+          </w:tcPr>
+          <w:p>
+            <w:pPr>
+              <w:pStyle w:val="af"/>
+              <w:spacing w:before="0" w:beforeAutospacing="0" w:after="0" w:afterAutospacing="0"/>
+              <w:jc w:val="center"/>
+            </w:pPr>
+            <w:r>
+              <w:rPr>
+                <w:color w:val="000000"/>
+                <w:sz w:val="22"/>
+              </w:rPr>
+              <w:t xml:space="preserve">0:55</w:t>
+            </w:r>
+          </w:p>
+        </w:tc>
+        <w:tc>
+          <w:tcPr>
+            <w:tcW w:w="1100" w:type="dxa"/>
+          </w:tcPr>
+          <w:p>
+            <w:pPr>
+              <w:pStyle w:val="af"/>
+              <w:spacing w:before="0" w:beforeAutospacing="0" w:after="0" w:afterAutospacing="0"/>
+              <w:jc w:val="center"/>
+            </w:pPr>
+            <w:r>
+              <w:rPr>
+                <w:color w:val="000000"/>
+                <w:sz w:val="22"/>
+              </w:rPr>
+              <w:t xml:space="preserve">1:15</w:t>
+            </w:r>
+          </w:p>
+        </w:tc>
+        <w:tc>
+          <w:tcPr>
+            <w:tcW w:w="1000" w:type="dxa"/>
+          </w:tcPr>
+          <w:p>
+            <w:pPr>
+              <w:pStyle w:val="af"/>
+              <w:spacing w:before="0" w:beforeAutospacing="0" w:after="0" w:afterAutospacing="0"/>
+              <w:jc w:val="center"/>
+            </w:pPr>
+            <w:r>
+              <w:rPr>
+                <w:color w:val="000000"/>
+                <w:sz w:val="22"/>
+              </w:rPr>
+              <w:t xml:space="preserve">1:35</w:t>
             </w:r>
           </w:p>
         </w:tc>

</xml_diff>

<commit_message>
feat: rewarded continue in endless mode
</commit_message>
<xml_diff>
--- a/docs/ГДД_2026-09-30.docx
+++ b/docs/ГДД_2026-09-30.docx
@@ -2365,6 +2365,91 @@
           <w:color w:val="000000"/>
         </w:rPr>
         <w:t xml:space="preserve">Ключ внутри другого сейфа (цепочка ключей) пока отложен.</w:t>
+      </w:r>
+    </w:p>
+    <w:p>
+      <w:pPr>
+        <w:pStyle w:val="af"/>
+        <w:numPr>
+          <w:ilvl w:val="0"/>
+          <w:numId w:val="14"/>
+        </w:numPr>
+        <w:spacing w:before="0" w:beforeAutospacing="0" w:after="0" w:afterAutospacing="0"/>
+        <w:jc w:val="both"/>
+      </w:pPr>
+      <w:r>
+        <w:rPr>
+          <w:color w:val="000000"/>
+        </w:rPr>
+        <w:t xml:space="preserve">В бесконечном уровне появилась вторая жизнь за рекламу.</w:t>
+      </w:r>
+    </w:p>
+    <w:p>
+      <w:pPr>
+        <w:pStyle w:val="af"/>
+        <w:numPr>
+          <w:ilvl w:val="1"/>
+          <w:numId w:val="14"/>
+        </w:numPr>
+        <w:spacing w:before="0" w:beforeAutospacing="0" w:after="0" w:afterAutospacing="0"/>
+        <w:jc w:val="both"/>
+      </w:pPr>
+      <w:r>
+        <w:rPr>
+          <w:color w:val="000000"/>
+        </w:rPr>
+        <w:t xml:space="preserve">Когда время кончается, открывается окно с предложением посмотреть рекламу и продолжить ран. В окне идет отсчет 5 секунд, после него или по кнопке Завершить показывается результат;</w:t>
+      </w:r>
+    </w:p>
+    <w:p>
+      <w:pPr>
+        <w:pStyle w:val="af"/>
+        <w:numPr>
+          <w:ilvl w:val="1"/>
+          <w:numId w:val="14"/>
+        </w:numPr>
+        <w:spacing w:before="0" w:beforeAutospacing="0" w:after="0" w:afterAutospacing="0"/>
+        <w:jc w:val="both"/>
+      </w:pPr>
+      <w:r>
+        <w:rPr>
+          <w:color w:val="000000"/>
+        </w:rPr>
+        <w:t xml:space="preserve">За просмотр игрок получает +15 секунд, скорость таймера не сбрасывается. Вторая жизнь дается один раз за ран, при втором окончании времени ран сразу заканчивается;</w:t>
+      </w:r>
+    </w:p>
+    <w:p>
+      <w:pPr>
+        <w:pStyle w:val="af"/>
+        <w:numPr>
+          <w:ilvl w:val="1"/>
+          <w:numId w:val="14"/>
+        </w:numPr>
+        <w:spacing w:before="0" w:beforeAutospacing="0" w:after="0" w:afterAutospacing="0"/>
+        <w:jc w:val="both"/>
+      </w:pPr>
+      <w:r>
+        <w:rPr>
+          <w:color w:val="000000"/>
+        </w:rPr>
+        <w:t xml:space="preserve">Если реклама не досмотрена или не загрузилась, окно возвращается и отсчет начинается заново;</w:t>
+      </w:r>
+    </w:p>
+    <w:p>
+      <w:pPr>
+        <w:pStyle w:val="af"/>
+        <w:numPr>
+          <w:ilvl w:val="1"/>
+          <w:numId w:val="14"/>
+        </w:numPr>
+        <w:spacing w:before="0" w:beforeAutospacing="0" w:after="0" w:afterAutospacing="0"/>
+        <w:jc w:val="both"/>
+      </w:pPr>
+      <w:r>
+        <w:rPr>
+          <w:color w:val="000000"/>
+        </w:rPr>
+        <w:t xml:space="preserve">Если игрок уже получил вторую жизнь за рекламу в этом ране, интер при выходе в меню не показывается.</w:t>
       </w:r>
     </w:p>
     <w:p>

</xml_diff>

<commit_message>
feat: reorder chapters so key locks close the campaign, rebalance chapter volumes
</commit_message>
<xml_diff>
--- a/docs/ГДД_2026-09-30.docx
+++ b/docs/ГДД_2026-09-30.docx
@@ -2455,6 +2455,108 @@
     <w:p>
       <w:pPr>
         <w:pStyle w:val="af"/>
+        <w:numPr>
+          <w:ilvl w:val="0"/>
+          <w:numId w:val="14"/>
+        </w:numPr>
+        <w:spacing w:before="0" w:beforeAutospacing="0" w:after="0" w:afterAutospacing="0"/>
+        <w:jc w:val="both"/>
+      </w:pPr>
+      <w:r>
+        <w:rPr>
+          <w:color w:val="000000"/>
+        </w:rPr>
+        <w:t xml:space="preserve">Изменен порядок глав. Камера хранения стала главой 5 (уровни 21-25), а Хранилище с ключами и сейфами перенесено в конец и стало финалом кампании (уровни 26-30).</w:t>
+      </w:r>
+    </w:p>
+    <w:p>
+      <w:pPr>
+        <w:pStyle w:val="af"/>
+        <w:numPr>
+          <w:ilvl w:val="1"/>
+          <w:numId w:val="14"/>
+        </w:numPr>
+        <w:spacing w:before="0" w:beforeAutospacing="0" w:after="0" w:afterAutospacing="0"/>
+        <w:jc w:val="both"/>
+      </w:pPr>
+      <w:r>
+        <w:rPr>
+          <w:color w:val="000000"/>
+        </w:rPr>
+        <w:t xml:space="preserve">Главы, где у игрока есть понятная цель и награда (фильтры, закрытые полки, ключи), чередуются с главами, где доска мешает игроку (конвейеры, ячейки). Кампания заканчивается главой с самой яркой наградой, открытием сейфа;</w:t>
+      </w:r>
+    </w:p>
+    <w:p>
+      <w:pPr>
+        <w:pStyle w:val="af"/>
+        <w:numPr>
+          <w:ilvl w:val="1"/>
+          <w:numId w:val="14"/>
+        </w:numPr>
+        <w:spacing w:before="0" w:beforeAutospacing="0" w:after="0" w:afterAutospacing="0"/>
+        <w:jc w:val="both"/>
+      </w:pPr>
+      <w:r>
+        <w:rPr>
+          <w:color w:val="000000"/>
+        </w:rPr>
+        <w:t xml:space="preserve">В главе 5 ячейки верхнего ряда открываются и закрываются по очереди, табло показывает, сколько мэтчей осталось до смены. По главе растет число ячеек от 2 до 4;</w:t>
+      </w:r>
+    </w:p>
+    <w:p>
+      <w:pPr>
+        <w:pStyle w:val="af"/>
+        <w:numPr>
+          <w:ilvl w:val="1"/>
+          <w:numId w:val="14"/>
+        </w:numPr>
+        <w:spacing w:before="0" w:beforeAutospacing="0" w:after="0" w:afterAutospacing="0"/>
+        <w:jc w:val="both"/>
+      </w:pPr>
+      <w:r>
+        <w:rPr>
+          <w:color w:val="000000"/>
+        </w:rPr>
+        <w:t xml:space="preserve">Уровни закрытых полок стали короче: лимит от 1:45 до 2:10 вместо 2:30-3:20;</w:t>
+      </w:r>
+    </w:p>
+    <w:p>
+      <w:pPr>
+        <w:pStyle w:val="af"/>
+        <w:numPr>
+          <w:ilvl w:val="1"/>
+          <w:numId w:val="14"/>
+        </w:numPr>
+        <w:spacing w:before="0" w:beforeAutospacing="0" w:after="0" w:afterAutospacing="0"/>
+        <w:jc w:val="both"/>
+      </w:pPr>
+      <w:r>
+        <w:rPr>
+          <w:color w:val="000000"/>
+        </w:rPr>
+        <w:t xml:space="preserve">В главе конвейеров меньше предметов к финалу: от 72 до 90 вместо 102, чтобы после пика не было перегруза;</w:t>
+      </w:r>
+    </w:p>
+    <w:p>
+      <w:pPr>
+        <w:pStyle w:val="af"/>
+        <w:numPr>
+          <w:ilvl w:val="1"/>
+          <w:numId w:val="14"/>
+        </w:numPr>
+        <w:spacing w:before="0" w:beforeAutospacing="0" w:after="0" w:afterAutospacing="0"/>
+        <w:jc w:val="both"/>
+      </w:pPr>
+      <w:r>
+        <w:rPr>
+          <w:color w:val="000000"/>
+        </w:rPr>
+        <w:t xml:space="preserve">Глава ячеек идет от 75 до 87 предметов, глава ключей теперь от 60 до 84 предметов, чтобы финал был самым объемным. Время на звезды для измененных уровней пересчитано вместе с лимитом и будет уточняться по плейтестам.</w:t>
+      </w:r>
+    </w:p>
+    <w:p>
+      <w:pPr>
+        <w:pStyle w:val="af"/>
         <w:spacing w:before="0" w:beforeAutospacing="0" w:after="0" w:afterAutospacing="0"/>
       </w:pPr>
     </w:p>
@@ -9066,6 +9168,4353 @@
           <w:color w:val="000000"/>
         </w:rPr>
         <w:t xml:space="preserve">Для уровней 11-15 указано стартовое количество предметов. Время на звезды стартовое и будет уточняться по плейтестам. Количество предметов с 6-го уровня будет пересмотрено после плейтеста глав.</w:t>
+      </w:r>
+    </w:p>
+    <w:p>
+      <w:pPr>
+        <w:pStyle w:val="af"/>
+        <w:spacing w:before="0" w:beforeAutospacing="0" w:after="0" w:afterAutospacing="0"/>
+        <w:ind w:firstLine="709"/>
+        <w:jc w:val="both"/>
+      </w:pPr>
+      <w:r>
+        <w:rPr>
+          <w:color w:val="000000"/>
+        </w:rPr>
+        <w:t xml:space="preserve">Таблица выше описывает кампанию до перестановки глав. Ниже актуальные уровни по главам.</w:t>
+      </w:r>
+    </w:p>
+    <w:tbl>
+      <w:tblPr>
+        <w:tblW w:w="9355" w:type="dxa"/>
+        <w:jc w:val="center"/>
+        <w:tblBorders>
+          <w:top w:val="single" w:sz="4" w:space="0" w:color="000000"/>
+          <w:left w:val="single" w:sz="4" w:space="0" w:color="000000"/>
+          <w:bottom w:val="single" w:sz="4" w:space="0" w:color="000000"/>
+          <w:right w:val="single" w:sz="4" w:space="0" w:color="000000"/>
+          <w:insideH w:val="single" w:sz="4" w:space="0" w:color="000000"/>
+          <w:insideV w:val="single" w:sz="4" w:space="0" w:color="000000"/>
+        </w:tblBorders>
+        <w:tblLayout w:type="fixed"/>
+        <w:tblLook w:val="04A0" w:firstRow="1" w:lastRow="0" w:firstColumn="1" w:lastColumn="0" w:noHBand="0" w:noVBand="1"/>
+      </w:tblPr>
+      <w:tblGrid>
+        <w:gridCol w:w="1150"/>
+        <w:gridCol w:w="1150"/>
+        <w:gridCol w:w="2505"/>
+        <w:gridCol w:w="1350"/>
+        <w:gridCol w:w="1100"/>
+        <w:gridCol w:w="1100"/>
+        <w:gridCol w:w="1000"/>
+      </w:tblGrid>
+      <w:tr>
+        <w:trPr>
+          <w:tblHeader/>
+        </w:trPr>
+        <w:tc>
+          <w:tcPr>
+            <w:tcW w:w="1150" w:type="dxa"/>
+          </w:tcPr>
+          <w:p>
+            <w:pPr>
+              <w:pStyle w:val="af"/>
+              <w:spacing w:before="0" w:beforeAutospacing="0" w:after="0" w:afterAutospacing="0"/>
+              <w:jc w:val="center"/>
+            </w:pPr>
+            <w:r>
+              <w:rPr>
+                <w:b/>
+                <w:color w:val="000000"/>
+                <w:sz w:val="22"/>
+              </w:rPr>
+              <w:t xml:space="preserve">Уровень</w:t>
+            </w:r>
+          </w:p>
+        </w:tc>
+        <w:tc>
+          <w:tcPr>
+            <w:tcW w:w="1150" w:type="dxa"/>
+          </w:tcPr>
+          <w:p>
+            <w:pPr>
+              <w:pStyle w:val="af"/>
+              <w:spacing w:before="0" w:beforeAutospacing="0" w:after="0" w:afterAutospacing="0"/>
+              <w:jc w:val="center"/>
+            </w:pPr>
+            <w:r>
+              <w:rPr>
+                <w:b/>
+                <w:color w:val="000000"/>
+                <w:sz w:val="22"/>
+              </w:rPr>
+              <w:t xml:space="preserve">Глава</w:t>
+            </w:r>
+          </w:p>
+        </w:tc>
+        <w:tc>
+          <w:tcPr>
+            <w:tcW w:w="2505" w:type="dxa"/>
+          </w:tcPr>
+          <w:p>
+            <w:pPr>
+              <w:pStyle w:val="af"/>
+              <w:spacing w:before="0" w:beforeAutospacing="0" w:after="0" w:afterAutospacing="0"/>
+              <w:jc w:val="center"/>
+            </w:pPr>
+            <w:r>
+              <w:rPr>
+                <w:b/>
+                <w:color w:val="000000"/>
+                <w:sz w:val="22"/>
+              </w:rPr>
+              <w:t xml:space="preserve">Что нового</w:t>
+            </w:r>
+          </w:p>
+        </w:tc>
+        <w:tc>
+          <w:tcPr>
+            <w:tcW w:w="1350" w:type="dxa"/>
+          </w:tcPr>
+          <w:p>
+            <w:pPr>
+              <w:pStyle w:val="af"/>
+              <w:spacing w:before="0" w:beforeAutospacing="0" w:after="0" w:afterAutospacing="0"/>
+              <w:jc w:val="center"/>
+            </w:pPr>
+            <w:r>
+              <w:rPr>
+                <w:b/>
+                <w:color w:val="000000"/>
+                <w:sz w:val="22"/>
+              </w:rPr>
+              <w:t xml:space="preserve">Предметов</w:t>
+            </w:r>
+          </w:p>
+        </w:tc>
+        <w:tc>
+          <w:tcPr>
+            <w:tcW w:w="1100" w:type="dxa"/>
+          </w:tcPr>
+          <w:p>
+            <w:pPr>
+              <w:pStyle w:val="af"/>
+              <w:spacing w:before="0" w:beforeAutospacing="0" w:after="0" w:afterAutospacing="0"/>
+              <w:jc w:val="center"/>
+            </w:pPr>
+            <w:r>
+              <w:rPr>
+                <w:b/>
+                <w:color w:val="000000"/>
+                <w:sz w:val="22"/>
+              </w:rPr>
+              <w:t xml:space="preserve">3 звезды</w:t>
+            </w:r>
+          </w:p>
+        </w:tc>
+        <w:tc>
+          <w:tcPr>
+            <w:tcW w:w="1100" w:type="dxa"/>
+          </w:tcPr>
+          <w:p>
+            <w:pPr>
+              <w:pStyle w:val="af"/>
+              <w:spacing w:before="0" w:beforeAutospacing="0" w:after="0" w:afterAutospacing="0"/>
+              <w:jc w:val="center"/>
+            </w:pPr>
+            <w:r>
+              <w:rPr>
+                <w:b/>
+                <w:color w:val="000000"/>
+                <w:sz w:val="22"/>
+              </w:rPr>
+              <w:t xml:space="preserve">2 звезды</w:t>
+            </w:r>
+          </w:p>
+        </w:tc>
+        <w:tc>
+          <w:tcPr>
+            <w:tcW w:w="1000" w:type="dxa"/>
+          </w:tcPr>
+          <w:p>
+            <w:pPr>
+              <w:pStyle w:val="af"/>
+              <w:spacing w:before="0" w:beforeAutospacing="0" w:after="0" w:afterAutospacing="0"/>
+              <w:jc w:val="center"/>
+            </w:pPr>
+            <w:r>
+              <w:rPr>
+                <w:b/>
+                <w:color w:val="000000"/>
+                <w:sz w:val="22"/>
+              </w:rPr>
+              <w:t xml:space="preserve">Лимит</w:t>
+            </w:r>
+          </w:p>
+        </w:tc>
+      </w:tr>
+      <w:tr>
+        <w:trPr>
+          <w:cantSplit/>
+        </w:trPr>
+        <w:tc>
+          <w:tcPr>
+            <w:tcW w:w="1150" w:type="dxa"/>
+          </w:tcPr>
+          <w:p>
+            <w:pPr>
+              <w:pStyle w:val="af"/>
+              <w:spacing w:before="0" w:beforeAutospacing="0" w:after="0" w:afterAutospacing="0"/>
+              <w:jc w:val="center"/>
+            </w:pPr>
+            <w:r>
+              <w:rPr>
+                <w:color w:val="000000"/>
+                <w:sz w:val="22"/>
+              </w:rPr>
+              <w:t xml:space="preserve">1</w:t>
+            </w:r>
+          </w:p>
+        </w:tc>
+        <w:tc>
+          <w:tcPr>
+            <w:tcW w:w="1150" w:type="dxa"/>
+          </w:tcPr>
+          <w:p>
+            <w:pPr>
+              <w:pStyle w:val="af"/>
+              <w:spacing w:before="0" w:beforeAutospacing="0" w:after="0" w:afterAutospacing="0"/>
+              <w:jc w:val="center"/>
+            </w:pPr>
+            <w:r>
+              <w:rPr>
+                <w:color w:val="000000"/>
+                <w:sz w:val="22"/>
+              </w:rPr>
+              <w:t xml:space="preserve">1</w:t>
+            </w:r>
+          </w:p>
+        </w:tc>
+        <w:tc>
+          <w:tcPr>
+            <w:tcW w:w="2505" w:type="dxa"/>
+          </w:tcPr>
+          <w:p>
+            <w:pPr>
+              <w:pStyle w:val="af"/>
+              <w:spacing w:before="0" w:beforeAutospacing="0" w:after="0" w:afterAutospacing="0"/>
+              <w:jc w:val="left"/>
+            </w:pPr>
+            <w:r>
+              <w:rPr>
+                <w:color w:val="000000"/>
+                <w:sz w:val="22"/>
+              </w:rPr>
+              <w:t xml:space="preserve">мяч, мишка, растение, лампа</w:t>
+            </w:r>
+          </w:p>
+        </w:tc>
+        <w:tc>
+          <w:tcPr>
+            <w:tcW w:w="1350" w:type="dxa"/>
+          </w:tcPr>
+          <w:p>
+            <w:pPr>
+              <w:pStyle w:val="af"/>
+              <w:spacing w:before="0" w:beforeAutospacing="0" w:after="0" w:afterAutospacing="0"/>
+              <w:jc w:val="center"/>
+            </w:pPr>
+            <w:r>
+              <w:rPr>
+                <w:color w:val="000000"/>
+                <w:sz w:val="22"/>
+              </w:rPr>
+              <w:t xml:space="preserve">51</w:t>
+            </w:r>
+          </w:p>
+        </w:tc>
+        <w:tc>
+          <w:tcPr>
+            <w:tcW w:w="1100" w:type="dxa"/>
+          </w:tcPr>
+          <w:p>
+            <w:pPr>
+              <w:pStyle w:val="af"/>
+              <w:spacing w:before="0" w:beforeAutospacing="0" w:after="0" w:afterAutospacing="0"/>
+              <w:jc w:val="center"/>
+            </w:pPr>
+            <w:r>
+              <w:rPr>
+                <w:color w:val="000000"/>
+                <w:sz w:val="22"/>
+              </w:rPr>
+              <w:t xml:space="preserve">0:25</w:t>
+            </w:r>
+          </w:p>
+        </w:tc>
+        <w:tc>
+          <w:tcPr>
+            <w:tcW w:w="1100" w:type="dxa"/>
+          </w:tcPr>
+          <w:p>
+            <w:pPr>
+              <w:pStyle w:val="af"/>
+              <w:spacing w:before="0" w:beforeAutospacing="0" w:after="0" w:afterAutospacing="0"/>
+              <w:jc w:val="center"/>
+            </w:pPr>
+            <w:r>
+              <w:rPr>
+                <w:color w:val="000000"/>
+                <w:sz w:val="22"/>
+              </w:rPr>
+              <w:t xml:space="preserve">0:40</w:t>
+            </w:r>
+          </w:p>
+        </w:tc>
+        <w:tc>
+          <w:tcPr>
+            <w:tcW w:w="1000" w:type="dxa"/>
+          </w:tcPr>
+          <w:p>
+            <w:pPr>
+              <w:pStyle w:val="af"/>
+              <w:spacing w:before="0" w:beforeAutospacing="0" w:after="0" w:afterAutospacing="0"/>
+              <w:jc w:val="center"/>
+            </w:pPr>
+            <w:r>
+              <w:rPr>
+                <w:color w:val="000000"/>
+                <w:sz w:val="22"/>
+              </w:rPr>
+              <w:t xml:space="preserve">0:55</w:t>
+            </w:r>
+          </w:p>
+        </w:tc>
+      </w:tr>
+      <w:tr>
+        <w:trPr>
+          <w:cantSplit/>
+        </w:trPr>
+        <w:tc>
+          <w:tcPr>
+            <w:tcW w:w="1150" w:type="dxa"/>
+          </w:tcPr>
+          <w:p>
+            <w:pPr>
+              <w:pStyle w:val="af"/>
+              <w:spacing w:before="0" w:beforeAutospacing="0" w:after="0" w:afterAutospacing="0"/>
+              <w:jc w:val="center"/>
+            </w:pPr>
+            <w:r>
+              <w:rPr>
+                <w:color w:val="000000"/>
+                <w:sz w:val="22"/>
+              </w:rPr>
+              <w:t xml:space="preserve">2</w:t>
+            </w:r>
+          </w:p>
+        </w:tc>
+        <w:tc>
+          <w:tcPr>
+            <w:tcW w:w="1150" w:type="dxa"/>
+          </w:tcPr>
+          <w:p>
+            <w:pPr>
+              <w:pStyle w:val="af"/>
+              <w:spacing w:before="0" w:beforeAutospacing="0" w:after="0" w:afterAutospacing="0"/>
+              <w:jc w:val="center"/>
+            </w:pPr>
+            <w:r>
+              <w:rPr>
+                <w:color w:val="000000"/>
+                <w:sz w:val="22"/>
+              </w:rPr>
+              <w:t xml:space="preserve">1</w:t>
+            </w:r>
+          </w:p>
+        </w:tc>
+        <w:tc>
+          <w:tcPr>
+            <w:tcW w:w="2505" w:type="dxa"/>
+          </w:tcPr>
+          <w:p>
+            <w:pPr>
+              <w:pStyle w:val="af"/>
+              <w:spacing w:before="0" w:beforeAutospacing="0" w:after="0" w:afterAutospacing="0"/>
+              <w:jc w:val="left"/>
+            </w:pPr>
+            <w:r>
+              <w:rPr>
+                <w:color w:val="000000"/>
+                <w:sz w:val="22"/>
+              </w:rPr>
+              <w:t xml:space="preserve">+ глобус</w:t>
+            </w:r>
+          </w:p>
+        </w:tc>
+        <w:tc>
+          <w:tcPr>
+            <w:tcW w:w="1350" w:type="dxa"/>
+          </w:tcPr>
+          <w:p>
+            <w:pPr>
+              <w:pStyle w:val="af"/>
+              <w:spacing w:before="0" w:beforeAutospacing="0" w:after="0" w:afterAutospacing="0"/>
+              <w:jc w:val="center"/>
+            </w:pPr>
+            <w:r>
+              <w:rPr>
+                <w:color w:val="000000"/>
+                <w:sz w:val="22"/>
+              </w:rPr>
+              <w:t xml:space="preserve">57</w:t>
+            </w:r>
+          </w:p>
+        </w:tc>
+        <w:tc>
+          <w:tcPr>
+            <w:tcW w:w="1100" w:type="dxa"/>
+          </w:tcPr>
+          <w:p>
+            <w:pPr>
+              <w:pStyle w:val="af"/>
+              <w:spacing w:before="0" w:beforeAutospacing="0" w:after="0" w:afterAutospacing="0"/>
+              <w:jc w:val="center"/>
+            </w:pPr>
+            <w:r>
+              <w:rPr>
+                <w:color w:val="000000"/>
+                <w:sz w:val="22"/>
+              </w:rPr>
+              <w:t xml:space="preserve">0:30</w:t>
+            </w:r>
+          </w:p>
+        </w:tc>
+        <w:tc>
+          <w:tcPr>
+            <w:tcW w:w="1100" w:type="dxa"/>
+          </w:tcPr>
+          <w:p>
+            <w:pPr>
+              <w:pStyle w:val="af"/>
+              <w:spacing w:before="0" w:beforeAutospacing="0" w:after="0" w:afterAutospacing="0"/>
+              <w:jc w:val="center"/>
+            </w:pPr>
+            <w:r>
+              <w:rPr>
+                <w:color w:val="000000"/>
+                <w:sz w:val="22"/>
+              </w:rPr>
+              <w:t xml:space="preserve">0:45</w:t>
+            </w:r>
+          </w:p>
+        </w:tc>
+        <w:tc>
+          <w:tcPr>
+            <w:tcW w:w="1000" w:type="dxa"/>
+          </w:tcPr>
+          <w:p>
+            <w:pPr>
+              <w:pStyle w:val="af"/>
+              <w:spacing w:before="0" w:beforeAutospacing="0" w:after="0" w:afterAutospacing="0"/>
+              <w:jc w:val="center"/>
+            </w:pPr>
+            <w:r>
+              <w:rPr>
+                <w:color w:val="000000"/>
+                <w:sz w:val="22"/>
+              </w:rPr>
+              <w:t xml:space="preserve">1:00</w:t>
+            </w:r>
+          </w:p>
+        </w:tc>
+      </w:tr>
+      <w:tr>
+        <w:trPr>
+          <w:cantSplit/>
+        </w:trPr>
+        <w:tc>
+          <w:tcPr>
+            <w:tcW w:w="1150" w:type="dxa"/>
+          </w:tcPr>
+          <w:p>
+            <w:pPr>
+              <w:pStyle w:val="af"/>
+              <w:spacing w:before="0" w:beforeAutospacing="0" w:after="0" w:afterAutospacing="0"/>
+              <w:jc w:val="center"/>
+            </w:pPr>
+            <w:r>
+              <w:rPr>
+                <w:color w:val="000000"/>
+                <w:sz w:val="22"/>
+              </w:rPr>
+              <w:t xml:space="preserve">3</w:t>
+            </w:r>
+          </w:p>
+        </w:tc>
+        <w:tc>
+          <w:tcPr>
+            <w:tcW w:w="1150" w:type="dxa"/>
+          </w:tcPr>
+          <w:p>
+            <w:pPr>
+              <w:pStyle w:val="af"/>
+              <w:spacing w:before="0" w:beforeAutospacing="0" w:after="0" w:afterAutospacing="0"/>
+              <w:jc w:val="center"/>
+            </w:pPr>
+            <w:r>
+              <w:rPr>
+                <w:color w:val="000000"/>
+                <w:sz w:val="22"/>
+              </w:rPr>
+              <w:t xml:space="preserve">1</w:t>
+            </w:r>
+          </w:p>
+        </w:tc>
+        <w:tc>
+          <w:tcPr>
+            <w:tcW w:w="2505" w:type="dxa"/>
+          </w:tcPr>
+          <w:p>
+            <w:pPr>
+              <w:pStyle w:val="af"/>
+              <w:spacing w:before="0" w:beforeAutospacing="0" w:after="0" w:afterAutospacing="0"/>
+              <w:jc w:val="left"/>
+            </w:pPr>
+            <w:r>
+              <w:rPr>
+                <w:color w:val="000000"/>
+                <w:sz w:val="22"/>
+              </w:rPr>
+              <w:t xml:space="preserve"/>
+            </w:r>
+          </w:p>
+        </w:tc>
+        <w:tc>
+          <w:tcPr>
+            <w:tcW w:w="1350" w:type="dxa"/>
+          </w:tcPr>
+          <w:p>
+            <w:pPr>
+              <w:pStyle w:val="af"/>
+              <w:spacing w:before="0" w:beforeAutospacing="0" w:after="0" w:afterAutospacing="0"/>
+              <w:jc w:val="center"/>
+            </w:pPr>
+            <w:r>
+              <w:rPr>
+                <w:color w:val="000000"/>
+                <w:sz w:val="22"/>
+              </w:rPr>
+              <w:t xml:space="preserve">60</w:t>
+            </w:r>
+          </w:p>
+        </w:tc>
+        <w:tc>
+          <w:tcPr>
+            <w:tcW w:w="1100" w:type="dxa"/>
+          </w:tcPr>
+          <w:p>
+            <w:pPr>
+              <w:pStyle w:val="af"/>
+              <w:spacing w:before="0" w:beforeAutospacing="0" w:after="0" w:afterAutospacing="0"/>
+              <w:jc w:val="center"/>
+            </w:pPr>
+            <w:r>
+              <w:rPr>
+                <w:color w:val="000000"/>
+                <w:sz w:val="22"/>
+              </w:rPr>
+              <w:t xml:space="preserve">0:30</w:t>
+            </w:r>
+          </w:p>
+        </w:tc>
+        <w:tc>
+          <w:tcPr>
+            <w:tcW w:w="1100" w:type="dxa"/>
+          </w:tcPr>
+          <w:p>
+            <w:pPr>
+              <w:pStyle w:val="af"/>
+              <w:spacing w:before="0" w:beforeAutospacing="0" w:after="0" w:afterAutospacing="0"/>
+              <w:jc w:val="center"/>
+            </w:pPr>
+            <w:r>
+              <w:rPr>
+                <w:color w:val="000000"/>
+                <w:sz w:val="22"/>
+              </w:rPr>
+              <w:t xml:space="preserve">0:45</w:t>
+            </w:r>
+          </w:p>
+        </w:tc>
+        <w:tc>
+          <w:tcPr>
+            <w:tcW w:w="1000" w:type="dxa"/>
+          </w:tcPr>
+          <w:p>
+            <w:pPr>
+              <w:pStyle w:val="af"/>
+              <w:spacing w:before="0" w:beforeAutospacing="0" w:after="0" w:afterAutospacing="0"/>
+              <w:jc w:val="center"/>
+            </w:pPr>
+            <w:r>
+              <w:rPr>
+                <w:color w:val="000000"/>
+                <w:sz w:val="22"/>
+              </w:rPr>
+              <w:t xml:space="preserve">1:00</w:t>
+            </w:r>
+          </w:p>
+        </w:tc>
+      </w:tr>
+      <w:tr>
+        <w:trPr>
+          <w:cantSplit/>
+        </w:trPr>
+        <w:tc>
+          <w:tcPr>
+            <w:tcW w:w="1150" w:type="dxa"/>
+          </w:tcPr>
+          <w:p>
+            <w:pPr>
+              <w:pStyle w:val="af"/>
+              <w:spacing w:before="0" w:beforeAutospacing="0" w:after="0" w:afterAutospacing="0"/>
+              <w:jc w:val="center"/>
+            </w:pPr>
+            <w:r>
+              <w:rPr>
+                <w:color w:val="000000"/>
+                <w:sz w:val="22"/>
+              </w:rPr>
+              <w:t xml:space="preserve">4</w:t>
+            </w:r>
+          </w:p>
+        </w:tc>
+        <w:tc>
+          <w:tcPr>
+            <w:tcW w:w="1150" w:type="dxa"/>
+          </w:tcPr>
+          <w:p>
+            <w:pPr>
+              <w:pStyle w:val="af"/>
+              <w:spacing w:before="0" w:beforeAutospacing="0" w:after="0" w:afterAutospacing="0"/>
+              <w:jc w:val="center"/>
+            </w:pPr>
+            <w:r>
+              <w:rPr>
+                <w:color w:val="000000"/>
+                <w:sz w:val="22"/>
+              </w:rPr>
+              <w:t xml:space="preserve">1</w:t>
+            </w:r>
+          </w:p>
+        </w:tc>
+        <w:tc>
+          <w:tcPr>
+            <w:tcW w:w="2505" w:type="dxa"/>
+          </w:tcPr>
+          <w:p>
+            <w:pPr>
+              <w:pStyle w:val="af"/>
+              <w:spacing w:before="0" w:beforeAutospacing="0" w:after="0" w:afterAutospacing="0"/>
+              <w:jc w:val="left"/>
+            </w:pPr>
+            <w:r>
+              <w:rPr>
+                <w:color w:val="000000"/>
+                <w:sz w:val="22"/>
+              </w:rPr>
+              <w:t xml:space="preserve">+ декор</w:t>
+            </w:r>
+          </w:p>
+        </w:tc>
+        <w:tc>
+          <w:tcPr>
+            <w:tcW w:w="1350" w:type="dxa"/>
+          </w:tcPr>
+          <w:p>
+            <w:pPr>
+              <w:pStyle w:val="af"/>
+              <w:spacing w:before="0" w:beforeAutospacing="0" w:after="0" w:afterAutospacing="0"/>
+              <w:jc w:val="center"/>
+            </w:pPr>
+            <w:r>
+              <w:rPr>
+                <w:color w:val="000000"/>
+                <w:sz w:val="22"/>
+              </w:rPr>
+              <w:t xml:space="preserve">66</w:t>
+            </w:r>
+          </w:p>
+        </w:tc>
+        <w:tc>
+          <w:tcPr>
+            <w:tcW w:w="1100" w:type="dxa"/>
+          </w:tcPr>
+          <w:p>
+            <w:pPr>
+              <w:pStyle w:val="af"/>
+              <w:spacing w:before="0" w:beforeAutospacing="0" w:after="0" w:afterAutospacing="0"/>
+              <w:jc w:val="center"/>
+            </w:pPr>
+            <w:r>
+              <w:rPr>
+                <w:color w:val="000000"/>
+                <w:sz w:val="22"/>
+              </w:rPr>
+              <w:t xml:space="preserve">0:35</w:t>
+            </w:r>
+          </w:p>
+        </w:tc>
+        <w:tc>
+          <w:tcPr>
+            <w:tcW w:w="1100" w:type="dxa"/>
+          </w:tcPr>
+          <w:p>
+            <w:pPr>
+              <w:pStyle w:val="af"/>
+              <w:spacing w:before="0" w:beforeAutospacing="0" w:after="0" w:afterAutospacing="0"/>
+              <w:jc w:val="center"/>
+            </w:pPr>
+            <w:r>
+              <w:rPr>
+                <w:color w:val="000000"/>
+                <w:sz w:val="22"/>
+              </w:rPr>
+              <w:t xml:space="preserve">0:55</w:t>
+            </w:r>
+          </w:p>
+        </w:tc>
+        <w:tc>
+          <w:tcPr>
+            <w:tcW w:w="1000" w:type="dxa"/>
+          </w:tcPr>
+          <w:p>
+            <w:pPr>
+              <w:pStyle w:val="af"/>
+              <w:spacing w:before="0" w:beforeAutospacing="0" w:after="0" w:afterAutospacing="0"/>
+              <w:jc w:val="center"/>
+            </w:pPr>
+            <w:r>
+              <w:rPr>
+                <w:color w:val="000000"/>
+                <w:sz w:val="22"/>
+              </w:rPr>
+              <w:t xml:space="preserve">1:05</w:t>
+            </w:r>
+          </w:p>
+        </w:tc>
+      </w:tr>
+      <w:tr>
+        <w:trPr>
+          <w:cantSplit/>
+        </w:trPr>
+        <w:tc>
+          <w:tcPr>
+            <w:tcW w:w="1150" w:type="dxa"/>
+          </w:tcPr>
+          <w:p>
+            <w:pPr>
+              <w:pStyle w:val="af"/>
+              <w:spacing w:before="0" w:beforeAutospacing="0" w:after="0" w:afterAutospacing="0"/>
+              <w:jc w:val="center"/>
+            </w:pPr>
+            <w:r>
+              <w:rPr>
+                <w:color w:val="000000"/>
+                <w:sz w:val="22"/>
+              </w:rPr>
+              <w:t xml:space="preserve">5</w:t>
+            </w:r>
+          </w:p>
+        </w:tc>
+        <w:tc>
+          <w:tcPr>
+            <w:tcW w:w="1150" w:type="dxa"/>
+          </w:tcPr>
+          <w:p>
+            <w:pPr>
+              <w:pStyle w:val="af"/>
+              <w:spacing w:before="0" w:beforeAutospacing="0" w:after="0" w:afterAutospacing="0"/>
+              <w:jc w:val="center"/>
+            </w:pPr>
+            <w:r>
+              <w:rPr>
+                <w:color w:val="000000"/>
+                <w:sz w:val="22"/>
+              </w:rPr>
+              <w:t xml:space="preserve">1</w:t>
+            </w:r>
+          </w:p>
+        </w:tc>
+        <w:tc>
+          <w:tcPr>
+            <w:tcW w:w="2505" w:type="dxa"/>
+          </w:tcPr>
+          <w:p>
+            <w:pPr>
+              <w:pStyle w:val="af"/>
+              <w:spacing w:before="0" w:beforeAutospacing="0" w:after="0" w:afterAutospacing="0"/>
+              <w:jc w:val="left"/>
+            </w:pPr>
+            <w:r>
+              <w:rPr>
+                <w:color w:val="000000"/>
+                <w:sz w:val="22"/>
+              </w:rPr>
+              <w:t xml:space="preserve"/>
+            </w:r>
+          </w:p>
+        </w:tc>
+        <w:tc>
+          <w:tcPr>
+            <w:tcW w:w="1350" w:type="dxa"/>
+          </w:tcPr>
+          <w:p>
+            <w:pPr>
+              <w:pStyle w:val="af"/>
+              <w:spacing w:before="0" w:beforeAutospacing="0" w:after="0" w:afterAutospacing="0"/>
+              <w:jc w:val="center"/>
+            </w:pPr>
+            <w:r>
+              <w:rPr>
+                <w:color w:val="000000"/>
+                <w:sz w:val="22"/>
+              </w:rPr>
+              <w:t xml:space="preserve">72</w:t>
+            </w:r>
+          </w:p>
+        </w:tc>
+        <w:tc>
+          <w:tcPr>
+            <w:tcW w:w="1100" w:type="dxa"/>
+          </w:tcPr>
+          <w:p>
+            <w:pPr>
+              <w:pStyle w:val="af"/>
+              <w:spacing w:before="0" w:beforeAutospacing="0" w:after="0" w:afterAutospacing="0"/>
+              <w:jc w:val="center"/>
+            </w:pPr>
+            <w:r>
+              <w:rPr>
+                <w:color w:val="000000"/>
+                <w:sz w:val="22"/>
+              </w:rPr>
+              <w:t xml:space="preserve">0:40</w:t>
+            </w:r>
+          </w:p>
+        </w:tc>
+        <w:tc>
+          <w:tcPr>
+            <w:tcW w:w="1100" w:type="dxa"/>
+          </w:tcPr>
+          <w:p>
+            <w:pPr>
+              <w:pStyle w:val="af"/>
+              <w:spacing w:before="0" w:beforeAutospacing="0" w:after="0" w:afterAutospacing="0"/>
+              <w:jc w:val="center"/>
+            </w:pPr>
+            <w:r>
+              <w:rPr>
+                <w:color w:val="000000"/>
+                <w:sz w:val="22"/>
+              </w:rPr>
+              <w:t xml:space="preserve">1:00</w:t>
+            </w:r>
+          </w:p>
+        </w:tc>
+        <w:tc>
+          <w:tcPr>
+            <w:tcW w:w="1000" w:type="dxa"/>
+          </w:tcPr>
+          <w:p>
+            <w:pPr>
+              <w:pStyle w:val="af"/>
+              <w:spacing w:before="0" w:beforeAutospacing="0" w:after="0" w:afterAutospacing="0"/>
+              <w:jc w:val="center"/>
+            </w:pPr>
+            <w:r>
+              <w:rPr>
+                <w:color w:val="000000"/>
+                <w:sz w:val="22"/>
+              </w:rPr>
+              <w:t xml:space="preserve">1:15</w:t>
+            </w:r>
+          </w:p>
+        </w:tc>
+      </w:tr>
+      <w:tr>
+        <w:trPr>
+          <w:cantSplit/>
+        </w:trPr>
+        <w:tc>
+          <w:tcPr>
+            <w:tcW w:w="1150" w:type="dxa"/>
+          </w:tcPr>
+          <w:p>
+            <w:pPr>
+              <w:pStyle w:val="af"/>
+              <w:spacing w:before="0" w:beforeAutospacing="0" w:after="0" w:afterAutospacing="0"/>
+              <w:jc w:val="center"/>
+            </w:pPr>
+            <w:r>
+              <w:rPr>
+                <w:color w:val="000000"/>
+                <w:sz w:val="22"/>
+              </w:rPr>
+              <w:t xml:space="preserve">6</w:t>
+            </w:r>
+          </w:p>
+        </w:tc>
+        <w:tc>
+          <w:tcPr>
+            <w:tcW w:w="1150" w:type="dxa"/>
+          </w:tcPr>
+          <w:p>
+            <w:pPr>
+              <w:pStyle w:val="af"/>
+              <w:spacing w:before="0" w:beforeAutospacing="0" w:after="0" w:afterAutospacing="0"/>
+              <w:jc w:val="center"/>
+            </w:pPr>
+            <w:r>
+              <w:rPr>
+                <w:color w:val="000000"/>
+                <w:sz w:val="22"/>
+              </w:rPr>
+              <w:t xml:space="preserve">2</w:t>
+            </w:r>
+          </w:p>
+        </w:tc>
+        <w:tc>
+          <w:tcPr>
+            <w:tcW w:w="2505" w:type="dxa"/>
+          </w:tcPr>
+          <w:p>
+            <w:pPr>
+              <w:pStyle w:val="af"/>
+              <w:spacing w:before="0" w:beforeAutospacing="0" w:after="0" w:afterAutospacing="0"/>
+              <w:jc w:val="left"/>
+            </w:pPr>
+            <w:r>
+              <w:rPr>
+                <w:color w:val="000000"/>
+                <w:sz w:val="22"/>
+              </w:rPr>
+              <w:t xml:space="preserve">фильтр: мяч</w:t>
+            </w:r>
+          </w:p>
+        </w:tc>
+        <w:tc>
+          <w:tcPr>
+            <w:tcW w:w="1350" w:type="dxa"/>
+          </w:tcPr>
+          <w:p>
+            <w:pPr>
+              <w:pStyle w:val="af"/>
+              <w:spacing w:before="0" w:beforeAutospacing="0" w:after="0" w:afterAutospacing="0"/>
+              <w:jc w:val="center"/>
+            </w:pPr>
+            <w:r>
+              <w:rPr>
+                <w:color w:val="000000"/>
+                <w:sz w:val="22"/>
+              </w:rPr>
+              <w:t xml:space="preserve">48</w:t>
+            </w:r>
+          </w:p>
+        </w:tc>
+        <w:tc>
+          <w:tcPr>
+            <w:tcW w:w="1100" w:type="dxa"/>
+          </w:tcPr>
+          <w:p>
+            <w:pPr>
+              <w:pStyle w:val="af"/>
+              <w:spacing w:before="0" w:beforeAutospacing="0" w:after="0" w:afterAutospacing="0"/>
+              <w:jc w:val="center"/>
+            </w:pPr>
+            <w:r>
+              <w:rPr>
+                <w:color w:val="000000"/>
+                <w:sz w:val="22"/>
+              </w:rPr>
+              <w:t xml:space="preserve">0:40</w:t>
+            </w:r>
+          </w:p>
+        </w:tc>
+        <w:tc>
+          <w:tcPr>
+            <w:tcW w:w="1100" w:type="dxa"/>
+          </w:tcPr>
+          <w:p>
+            <w:pPr>
+              <w:pStyle w:val="af"/>
+              <w:spacing w:before="0" w:beforeAutospacing="0" w:after="0" w:afterAutospacing="0"/>
+              <w:jc w:val="center"/>
+            </w:pPr>
+            <w:r>
+              <w:rPr>
+                <w:color w:val="000000"/>
+                <w:sz w:val="22"/>
+              </w:rPr>
+              <w:t xml:space="preserve">1:00</w:t>
+            </w:r>
+          </w:p>
+        </w:tc>
+        <w:tc>
+          <w:tcPr>
+            <w:tcW w:w="1000" w:type="dxa"/>
+          </w:tcPr>
+          <w:p>
+            <w:pPr>
+              <w:pStyle w:val="af"/>
+              <w:spacing w:before="0" w:beforeAutospacing="0" w:after="0" w:afterAutospacing="0"/>
+              <w:jc w:val="center"/>
+            </w:pPr>
+            <w:r>
+              <w:rPr>
+                <w:color w:val="000000"/>
+                <w:sz w:val="22"/>
+              </w:rPr>
+              <w:t xml:space="preserve">1:15</w:t>
+            </w:r>
+          </w:p>
+        </w:tc>
+      </w:tr>
+      <w:tr>
+        <w:trPr>
+          <w:cantSplit/>
+        </w:trPr>
+        <w:tc>
+          <w:tcPr>
+            <w:tcW w:w="1150" w:type="dxa"/>
+          </w:tcPr>
+          <w:p>
+            <w:pPr>
+              <w:pStyle w:val="af"/>
+              <w:spacing w:before="0" w:beforeAutospacing="0" w:after="0" w:afterAutospacing="0"/>
+              <w:jc w:val="center"/>
+            </w:pPr>
+            <w:r>
+              <w:rPr>
+                <w:color w:val="000000"/>
+                <w:sz w:val="22"/>
+              </w:rPr>
+              <w:t xml:space="preserve">7</w:t>
+            </w:r>
+          </w:p>
+        </w:tc>
+        <w:tc>
+          <w:tcPr>
+            <w:tcW w:w="1150" w:type="dxa"/>
+          </w:tcPr>
+          <w:p>
+            <w:pPr>
+              <w:pStyle w:val="af"/>
+              <w:spacing w:before="0" w:beforeAutospacing="0" w:after="0" w:afterAutospacing="0"/>
+              <w:jc w:val="center"/>
+            </w:pPr>
+            <w:r>
+              <w:rPr>
+                <w:color w:val="000000"/>
+                <w:sz w:val="22"/>
+              </w:rPr>
+              <w:t xml:space="preserve">2</w:t>
+            </w:r>
+          </w:p>
+        </w:tc>
+        <w:tc>
+          <w:tcPr>
+            <w:tcW w:w="2505" w:type="dxa"/>
+          </w:tcPr>
+          <w:p>
+            <w:pPr>
+              <w:pStyle w:val="af"/>
+              <w:spacing w:before="0" w:beforeAutospacing="0" w:after="0" w:afterAutospacing="0"/>
+              <w:jc w:val="left"/>
+            </w:pPr>
+            <w:r>
+              <w:rPr>
+                <w:color w:val="000000"/>
+                <w:sz w:val="22"/>
+              </w:rPr>
+              <w:t xml:space="preserve">+ игрушка; фильтры: мишка, лампа</w:t>
+            </w:r>
+          </w:p>
+        </w:tc>
+        <w:tc>
+          <w:tcPr>
+            <w:tcW w:w="1350" w:type="dxa"/>
+          </w:tcPr>
+          <w:p>
+            <w:pPr>
+              <w:pStyle w:val="af"/>
+              <w:spacing w:before="0" w:beforeAutospacing="0" w:after="0" w:afterAutospacing="0"/>
+              <w:jc w:val="center"/>
+            </w:pPr>
+            <w:r>
+              <w:rPr>
+                <w:color w:val="000000"/>
+                <w:sz w:val="22"/>
+              </w:rPr>
+              <w:t xml:space="preserve">51</w:t>
+            </w:r>
+          </w:p>
+        </w:tc>
+        <w:tc>
+          <w:tcPr>
+            <w:tcW w:w="1100" w:type="dxa"/>
+          </w:tcPr>
+          <w:p>
+            <w:pPr>
+              <w:pStyle w:val="af"/>
+              <w:spacing w:before="0" w:beforeAutospacing="0" w:after="0" w:afterAutospacing="0"/>
+              <w:jc w:val="center"/>
+            </w:pPr>
+            <w:r>
+              <w:rPr>
+                <w:color w:val="000000"/>
+                <w:sz w:val="22"/>
+              </w:rPr>
+              <w:t xml:space="preserve">0:45</w:t>
+            </w:r>
+          </w:p>
+        </w:tc>
+        <w:tc>
+          <w:tcPr>
+            <w:tcW w:w="1100" w:type="dxa"/>
+          </w:tcPr>
+          <w:p>
+            <w:pPr>
+              <w:pStyle w:val="af"/>
+              <w:spacing w:before="0" w:beforeAutospacing="0" w:after="0" w:afterAutospacing="0"/>
+              <w:jc w:val="center"/>
+            </w:pPr>
+            <w:r>
+              <w:rPr>
+                <w:color w:val="000000"/>
+                <w:sz w:val="22"/>
+              </w:rPr>
+              <w:t xml:space="preserve">1:05</w:t>
+            </w:r>
+          </w:p>
+        </w:tc>
+        <w:tc>
+          <w:tcPr>
+            <w:tcW w:w="1000" w:type="dxa"/>
+          </w:tcPr>
+          <w:p>
+            <w:pPr>
+              <w:pStyle w:val="af"/>
+              <w:spacing w:before="0" w:beforeAutospacing="0" w:after="0" w:afterAutospacing="0"/>
+              <w:jc w:val="center"/>
+            </w:pPr>
+            <w:r>
+              <w:rPr>
+                <w:color w:val="000000"/>
+                <w:sz w:val="22"/>
+              </w:rPr>
+              <w:t xml:space="preserve">1:20</w:t>
+            </w:r>
+          </w:p>
+        </w:tc>
+      </w:tr>
+      <w:tr>
+        <w:trPr>
+          <w:cantSplit/>
+        </w:trPr>
+        <w:tc>
+          <w:tcPr>
+            <w:tcW w:w="1150" w:type="dxa"/>
+          </w:tcPr>
+          <w:p>
+            <w:pPr>
+              <w:pStyle w:val="af"/>
+              <w:spacing w:before="0" w:beforeAutospacing="0" w:after="0" w:afterAutospacing="0"/>
+              <w:jc w:val="center"/>
+            </w:pPr>
+            <w:r>
+              <w:rPr>
+                <w:color w:val="000000"/>
+                <w:sz w:val="22"/>
+              </w:rPr>
+              <w:t xml:space="preserve">8</w:t>
+            </w:r>
+          </w:p>
+        </w:tc>
+        <w:tc>
+          <w:tcPr>
+            <w:tcW w:w="1150" w:type="dxa"/>
+          </w:tcPr>
+          <w:p>
+            <w:pPr>
+              <w:pStyle w:val="af"/>
+              <w:spacing w:before="0" w:beforeAutospacing="0" w:after="0" w:afterAutospacing="0"/>
+              <w:jc w:val="center"/>
+            </w:pPr>
+            <w:r>
+              <w:rPr>
+                <w:color w:val="000000"/>
+                <w:sz w:val="22"/>
+              </w:rPr>
+              <w:t xml:space="preserve">2</w:t>
+            </w:r>
+          </w:p>
+        </w:tc>
+        <w:tc>
+          <w:tcPr>
+            <w:tcW w:w="2505" w:type="dxa"/>
+          </w:tcPr>
+          <w:p>
+            <w:pPr>
+              <w:pStyle w:val="af"/>
+              <w:spacing w:before="0" w:beforeAutospacing="0" w:after="0" w:afterAutospacing="0"/>
+              <w:jc w:val="left"/>
+            </w:pPr>
+            <w:r>
+              <w:rPr>
+                <w:color w:val="000000"/>
+                <w:sz w:val="22"/>
+              </w:rPr>
+              <w:t xml:space="preserve">фильтры: мяч и игрушка, растение</w:t>
+            </w:r>
+          </w:p>
+        </w:tc>
+        <w:tc>
+          <w:tcPr>
+            <w:tcW w:w="1350" w:type="dxa"/>
+          </w:tcPr>
+          <w:p>
+            <w:pPr>
+              <w:pStyle w:val="af"/>
+              <w:spacing w:before="0" w:beforeAutospacing="0" w:after="0" w:afterAutospacing="0"/>
+              <w:jc w:val="center"/>
+            </w:pPr>
+            <w:r>
+              <w:rPr>
+                <w:color w:val="000000"/>
+                <w:sz w:val="22"/>
+              </w:rPr>
+              <w:t xml:space="preserve">54</w:t>
+            </w:r>
+          </w:p>
+        </w:tc>
+        <w:tc>
+          <w:tcPr>
+            <w:tcW w:w="1100" w:type="dxa"/>
+          </w:tcPr>
+          <w:p>
+            <w:pPr>
+              <w:pStyle w:val="af"/>
+              <w:spacing w:before="0" w:beforeAutospacing="0" w:after="0" w:afterAutospacing="0"/>
+              <w:jc w:val="center"/>
+            </w:pPr>
+            <w:r>
+              <w:rPr>
+                <w:color w:val="000000"/>
+                <w:sz w:val="22"/>
+              </w:rPr>
+              <w:t xml:space="preserve">0:50</w:t>
+            </w:r>
+          </w:p>
+        </w:tc>
+        <w:tc>
+          <w:tcPr>
+            <w:tcW w:w="1100" w:type="dxa"/>
+          </w:tcPr>
+          <w:p>
+            <w:pPr>
+              <w:pStyle w:val="af"/>
+              <w:spacing w:before="0" w:beforeAutospacing="0" w:after="0" w:afterAutospacing="0"/>
+              <w:jc w:val="center"/>
+            </w:pPr>
+            <w:r>
+              <w:rPr>
+                <w:color w:val="000000"/>
+                <w:sz w:val="22"/>
+              </w:rPr>
+              <w:t xml:space="preserve">1:10</w:t>
+            </w:r>
+          </w:p>
+        </w:tc>
+        <w:tc>
+          <w:tcPr>
+            <w:tcW w:w="1000" w:type="dxa"/>
+          </w:tcPr>
+          <w:p>
+            <w:pPr>
+              <w:pStyle w:val="af"/>
+              <w:spacing w:before="0" w:beforeAutospacing="0" w:after="0" w:afterAutospacing="0"/>
+              <w:jc w:val="center"/>
+            </w:pPr>
+            <w:r>
+              <w:rPr>
+                <w:color w:val="000000"/>
+                <w:sz w:val="22"/>
+              </w:rPr>
+              <w:t xml:space="preserve">1:30</w:t>
+            </w:r>
+          </w:p>
+        </w:tc>
+      </w:tr>
+      <w:tr>
+        <w:trPr>
+          <w:cantSplit/>
+        </w:trPr>
+        <w:tc>
+          <w:tcPr>
+            <w:tcW w:w="1150" w:type="dxa"/>
+          </w:tcPr>
+          <w:p>
+            <w:pPr>
+              <w:pStyle w:val="af"/>
+              <w:spacing w:before="0" w:beforeAutospacing="0" w:after="0" w:afterAutospacing="0"/>
+              <w:jc w:val="center"/>
+            </w:pPr>
+            <w:r>
+              <w:rPr>
+                <w:color w:val="000000"/>
+                <w:sz w:val="22"/>
+              </w:rPr>
+              <w:t xml:space="preserve">9</w:t>
+            </w:r>
+          </w:p>
+        </w:tc>
+        <w:tc>
+          <w:tcPr>
+            <w:tcW w:w="1150" w:type="dxa"/>
+          </w:tcPr>
+          <w:p>
+            <w:pPr>
+              <w:pStyle w:val="af"/>
+              <w:spacing w:before="0" w:beforeAutospacing="0" w:after="0" w:afterAutospacing="0"/>
+              <w:jc w:val="center"/>
+            </w:pPr>
+            <w:r>
+              <w:rPr>
+                <w:color w:val="000000"/>
+                <w:sz w:val="22"/>
+              </w:rPr>
+              <w:t xml:space="preserve">2</w:t>
+            </w:r>
+          </w:p>
+        </w:tc>
+        <w:tc>
+          <w:tcPr>
+            <w:tcW w:w="2505" w:type="dxa"/>
+          </w:tcPr>
+          <w:p>
+            <w:pPr>
+              <w:pStyle w:val="af"/>
+              <w:spacing w:before="0" w:beforeAutospacing="0" w:after="0" w:afterAutospacing="0"/>
+              <w:jc w:val="left"/>
+            </w:pPr>
+            <w:r>
+              <w:rPr>
+                <w:color w:val="000000"/>
+                <w:sz w:val="22"/>
+              </w:rPr>
+              <w:t xml:space="preserve">3 фильтра</w:t>
+            </w:r>
+          </w:p>
+        </w:tc>
+        <w:tc>
+          <w:tcPr>
+            <w:tcW w:w="1350" w:type="dxa"/>
+          </w:tcPr>
+          <w:p>
+            <w:pPr>
+              <w:pStyle w:val="af"/>
+              <w:spacing w:before="0" w:beforeAutospacing="0" w:after="0" w:afterAutospacing="0"/>
+              <w:jc w:val="center"/>
+            </w:pPr>
+            <w:r>
+              <w:rPr>
+                <w:color w:val="000000"/>
+                <w:sz w:val="22"/>
+              </w:rPr>
+              <w:t xml:space="preserve">57</w:t>
+            </w:r>
+          </w:p>
+        </w:tc>
+        <w:tc>
+          <w:tcPr>
+            <w:tcW w:w="1100" w:type="dxa"/>
+          </w:tcPr>
+          <w:p>
+            <w:pPr>
+              <w:pStyle w:val="af"/>
+              <w:spacing w:before="0" w:beforeAutospacing="0" w:after="0" w:afterAutospacing="0"/>
+              <w:jc w:val="center"/>
+            </w:pPr>
+            <w:r>
+              <w:rPr>
+                <w:color w:val="000000"/>
+                <w:sz w:val="22"/>
+              </w:rPr>
+              <w:t xml:space="preserve">0:55</w:t>
+            </w:r>
+          </w:p>
+        </w:tc>
+        <w:tc>
+          <w:tcPr>
+            <w:tcW w:w="1100" w:type="dxa"/>
+          </w:tcPr>
+          <w:p>
+            <w:pPr>
+              <w:pStyle w:val="af"/>
+              <w:spacing w:before="0" w:beforeAutospacing="0" w:after="0" w:afterAutospacing="0"/>
+              <w:jc w:val="center"/>
+            </w:pPr>
+            <w:r>
+              <w:rPr>
+                <w:color w:val="000000"/>
+                <w:sz w:val="22"/>
+              </w:rPr>
+              <w:t xml:space="preserve">1:20</w:t>
+            </w:r>
+          </w:p>
+        </w:tc>
+        <w:tc>
+          <w:tcPr>
+            <w:tcW w:w="1000" w:type="dxa"/>
+          </w:tcPr>
+          <w:p>
+            <w:pPr>
+              <w:pStyle w:val="af"/>
+              <w:spacing w:before="0" w:beforeAutospacing="0" w:after="0" w:afterAutospacing="0"/>
+              <w:jc w:val="center"/>
+            </w:pPr>
+            <w:r>
+              <w:rPr>
+                <w:color w:val="000000"/>
+                <w:sz w:val="22"/>
+              </w:rPr>
+              <w:t xml:space="preserve">1:40</w:t>
+            </w:r>
+          </w:p>
+        </w:tc>
+      </w:tr>
+      <w:tr>
+        <w:trPr>
+          <w:cantSplit/>
+        </w:trPr>
+        <w:tc>
+          <w:tcPr>
+            <w:tcW w:w="1150" w:type="dxa"/>
+          </w:tcPr>
+          <w:p>
+            <w:pPr>
+              <w:pStyle w:val="af"/>
+              <w:spacing w:before="0" w:beforeAutospacing="0" w:after="0" w:afterAutospacing="0"/>
+              <w:jc w:val="center"/>
+            </w:pPr>
+            <w:r>
+              <w:rPr>
+                <w:color w:val="000000"/>
+                <w:sz w:val="22"/>
+              </w:rPr>
+              <w:t xml:space="preserve">10</w:t>
+            </w:r>
+          </w:p>
+        </w:tc>
+        <w:tc>
+          <w:tcPr>
+            <w:tcW w:w="1150" w:type="dxa"/>
+          </w:tcPr>
+          <w:p>
+            <w:pPr>
+              <w:pStyle w:val="af"/>
+              <w:spacing w:before="0" w:beforeAutospacing="0" w:after="0" w:afterAutospacing="0"/>
+              <w:jc w:val="center"/>
+            </w:pPr>
+            <w:r>
+              <w:rPr>
+                <w:color w:val="000000"/>
+                <w:sz w:val="22"/>
+              </w:rPr>
+              <w:t xml:space="preserve">2</w:t>
+            </w:r>
+          </w:p>
+        </w:tc>
+        <w:tc>
+          <w:tcPr>
+            <w:tcW w:w="2505" w:type="dxa"/>
+          </w:tcPr>
+          <w:p>
+            <w:pPr>
+              <w:pStyle w:val="af"/>
+              <w:spacing w:before="0" w:beforeAutospacing="0" w:after="0" w:afterAutospacing="0"/>
+              <w:jc w:val="left"/>
+            </w:pPr>
+            <w:r>
+              <w:rPr>
+                <w:color w:val="000000"/>
+                <w:sz w:val="22"/>
+              </w:rPr>
+              <w:t xml:space="preserve">4 фильтра</w:t>
+            </w:r>
+          </w:p>
+        </w:tc>
+        <w:tc>
+          <w:tcPr>
+            <w:tcW w:w="1350" w:type="dxa"/>
+          </w:tcPr>
+          <w:p>
+            <w:pPr>
+              <w:pStyle w:val="af"/>
+              <w:spacing w:before="0" w:beforeAutospacing="0" w:after="0" w:afterAutospacing="0"/>
+              <w:jc w:val="center"/>
+            </w:pPr>
+            <w:r>
+              <w:rPr>
+                <w:color w:val="000000"/>
+                <w:sz w:val="22"/>
+              </w:rPr>
+              <w:t xml:space="preserve">60</w:t>
+            </w:r>
+          </w:p>
+        </w:tc>
+        <w:tc>
+          <w:tcPr>
+            <w:tcW w:w="1100" w:type="dxa"/>
+          </w:tcPr>
+          <w:p>
+            <w:pPr>
+              <w:pStyle w:val="af"/>
+              <w:spacing w:before="0" w:beforeAutospacing="0" w:after="0" w:afterAutospacing="0"/>
+              <w:jc w:val="center"/>
+            </w:pPr>
+            <w:r>
+              <w:rPr>
+                <w:color w:val="000000"/>
+                <w:sz w:val="22"/>
+              </w:rPr>
+              <w:t xml:space="preserve">1:00</w:t>
+            </w:r>
+          </w:p>
+        </w:tc>
+        <w:tc>
+          <w:tcPr>
+            <w:tcW w:w="1100" w:type="dxa"/>
+          </w:tcPr>
+          <w:p>
+            <w:pPr>
+              <w:pStyle w:val="af"/>
+              <w:spacing w:before="0" w:beforeAutospacing="0" w:after="0" w:afterAutospacing="0"/>
+              <w:jc w:val="center"/>
+            </w:pPr>
+            <w:r>
+              <w:rPr>
+                <w:color w:val="000000"/>
+                <w:sz w:val="22"/>
+              </w:rPr>
+              <w:t xml:space="preserve">1:25</w:t>
+            </w:r>
+          </w:p>
+        </w:tc>
+        <w:tc>
+          <w:tcPr>
+            <w:tcW w:w="1000" w:type="dxa"/>
+          </w:tcPr>
+          <w:p>
+            <w:pPr>
+              <w:pStyle w:val="af"/>
+              <w:spacing w:before="0" w:beforeAutospacing="0" w:after="0" w:afterAutospacing="0"/>
+              <w:jc w:val="center"/>
+            </w:pPr>
+            <w:r>
+              <w:rPr>
+                <w:color w:val="000000"/>
+                <w:sz w:val="22"/>
+              </w:rPr>
+              <w:t xml:space="preserve">1:45</w:t>
+            </w:r>
+          </w:p>
+        </w:tc>
+      </w:tr>
+      <w:tr>
+        <w:trPr>
+          <w:cantSplit/>
+        </w:trPr>
+        <w:tc>
+          <w:tcPr>
+            <w:tcW w:w="1150" w:type="dxa"/>
+          </w:tcPr>
+          <w:p>
+            <w:pPr>
+              <w:pStyle w:val="af"/>
+              <w:spacing w:before="0" w:beforeAutospacing="0" w:after="0" w:afterAutospacing="0"/>
+              <w:jc w:val="center"/>
+            </w:pPr>
+            <w:r>
+              <w:rPr>
+                <w:color w:val="000000"/>
+                <w:sz w:val="22"/>
+              </w:rPr>
+              <w:t xml:space="preserve">11</w:t>
+            </w:r>
+          </w:p>
+        </w:tc>
+        <w:tc>
+          <w:tcPr>
+            <w:tcW w:w="1150" w:type="dxa"/>
+          </w:tcPr>
+          <w:p>
+            <w:pPr>
+              <w:pStyle w:val="af"/>
+              <w:spacing w:before="0" w:beforeAutospacing="0" w:after="0" w:afterAutospacing="0"/>
+              <w:jc w:val="center"/>
+            </w:pPr>
+            <w:r>
+              <w:rPr>
+                <w:color w:val="000000"/>
+                <w:sz w:val="22"/>
+              </w:rPr>
+              <w:t xml:space="preserve">3</w:t>
+            </w:r>
+          </w:p>
+        </w:tc>
+        <w:tc>
+          <w:tcPr>
+            <w:tcW w:w="2505" w:type="dxa"/>
+          </w:tcPr>
+          <w:p>
+            <w:pPr>
+              <w:pStyle w:val="af"/>
+              <w:spacing w:before="0" w:beforeAutospacing="0" w:after="0" w:afterAutospacing="0"/>
+              <w:jc w:val="left"/>
+            </w:pPr>
+            <w:r>
+              <w:rPr>
+                <w:color w:val="000000"/>
+                <w:sz w:val="22"/>
+              </w:rPr>
+              <w:t xml:space="preserve">+ поезд; 1 закрытая полка</w:t>
+            </w:r>
+          </w:p>
+        </w:tc>
+        <w:tc>
+          <w:tcPr>
+            <w:tcW w:w="1350" w:type="dxa"/>
+          </w:tcPr>
+          <w:p>
+            <w:pPr>
+              <w:pStyle w:val="af"/>
+              <w:spacing w:before="0" w:beforeAutospacing="0" w:after="0" w:afterAutospacing="0"/>
+              <w:jc w:val="center"/>
+            </w:pPr>
+            <w:r>
+              <w:rPr>
+                <w:color w:val="000000"/>
+                <w:sz w:val="22"/>
+              </w:rPr>
+              <w:t xml:space="preserve">66</w:t>
+            </w:r>
+          </w:p>
+        </w:tc>
+        <w:tc>
+          <w:tcPr>
+            <w:tcW w:w="1100" w:type="dxa"/>
+          </w:tcPr>
+          <w:p>
+            <w:pPr>
+              <w:pStyle w:val="af"/>
+              <w:spacing w:before="0" w:beforeAutospacing="0" w:after="0" w:afterAutospacing="0"/>
+              <w:jc w:val="center"/>
+            </w:pPr>
+            <w:r>
+              <w:rPr>
+                <w:color w:val="000000"/>
+                <w:sz w:val="22"/>
+              </w:rPr>
+              <w:t xml:space="preserve">1:05</w:t>
+            </w:r>
+          </w:p>
+        </w:tc>
+        <w:tc>
+          <w:tcPr>
+            <w:tcW w:w="1100" w:type="dxa"/>
+          </w:tcPr>
+          <w:p>
+            <w:pPr>
+              <w:pStyle w:val="af"/>
+              <w:spacing w:before="0" w:beforeAutospacing="0" w:after="0" w:afterAutospacing="0"/>
+              <w:jc w:val="center"/>
+            </w:pPr>
+            <w:r>
+              <w:rPr>
+                <w:color w:val="000000"/>
+                <w:sz w:val="22"/>
+              </w:rPr>
+              <w:t xml:space="preserve">1:25</w:t>
+            </w:r>
+          </w:p>
+        </w:tc>
+        <w:tc>
+          <w:tcPr>
+            <w:tcW w:w="1000" w:type="dxa"/>
+          </w:tcPr>
+          <w:p>
+            <w:pPr>
+              <w:pStyle w:val="af"/>
+              <w:spacing w:before="0" w:beforeAutospacing="0" w:after="0" w:afterAutospacing="0"/>
+              <w:jc w:val="center"/>
+            </w:pPr>
+            <w:r>
+              <w:rPr>
+                <w:color w:val="000000"/>
+                <w:sz w:val="22"/>
+              </w:rPr>
+              <w:t xml:space="preserve">1:45</w:t>
+            </w:r>
+          </w:p>
+        </w:tc>
+      </w:tr>
+      <w:tr>
+        <w:trPr>
+          <w:cantSplit/>
+        </w:trPr>
+        <w:tc>
+          <w:tcPr>
+            <w:tcW w:w="1150" w:type="dxa"/>
+          </w:tcPr>
+          <w:p>
+            <w:pPr>
+              <w:pStyle w:val="af"/>
+              <w:spacing w:before="0" w:beforeAutospacing="0" w:after="0" w:afterAutospacing="0"/>
+              <w:jc w:val="center"/>
+            </w:pPr>
+            <w:r>
+              <w:rPr>
+                <w:color w:val="000000"/>
+                <w:sz w:val="22"/>
+              </w:rPr>
+              <w:t xml:space="preserve">12</w:t>
+            </w:r>
+          </w:p>
+        </w:tc>
+        <w:tc>
+          <w:tcPr>
+            <w:tcW w:w="1150" w:type="dxa"/>
+          </w:tcPr>
+          <w:p>
+            <w:pPr>
+              <w:pStyle w:val="af"/>
+              <w:spacing w:before="0" w:beforeAutospacing="0" w:after="0" w:afterAutospacing="0"/>
+              <w:jc w:val="center"/>
+            </w:pPr>
+            <w:r>
+              <w:rPr>
+                <w:color w:val="000000"/>
+                <w:sz w:val="22"/>
+              </w:rPr>
+              <w:t xml:space="preserve">3</w:t>
+            </w:r>
+          </w:p>
+        </w:tc>
+        <w:tc>
+          <w:tcPr>
+            <w:tcW w:w="2505" w:type="dxa"/>
+          </w:tcPr>
+          <w:p>
+            <w:pPr>
+              <w:pStyle w:val="af"/>
+              <w:spacing w:before="0" w:beforeAutospacing="0" w:after="0" w:afterAutospacing="0"/>
+              <w:jc w:val="left"/>
+            </w:pPr>
+            <w:r>
+              <w:rPr>
+                <w:color w:val="000000"/>
+                <w:sz w:val="22"/>
+              </w:rPr>
+              <w:t xml:space="preserve">2 закрытые полки</w:t>
+            </w:r>
+          </w:p>
+        </w:tc>
+        <w:tc>
+          <w:tcPr>
+            <w:tcW w:w="1350" w:type="dxa"/>
+          </w:tcPr>
+          <w:p>
+            <w:pPr>
+              <w:pStyle w:val="af"/>
+              <w:spacing w:before="0" w:beforeAutospacing="0" w:after="0" w:afterAutospacing="0"/>
+              <w:jc w:val="center"/>
+            </w:pPr>
+            <w:r>
+              <w:rPr>
+                <w:color w:val="000000"/>
+                <w:sz w:val="22"/>
+              </w:rPr>
+              <w:t xml:space="preserve">60</w:t>
+            </w:r>
+          </w:p>
+        </w:tc>
+        <w:tc>
+          <w:tcPr>
+            <w:tcW w:w="1100" w:type="dxa"/>
+          </w:tcPr>
+          <w:p>
+            <w:pPr>
+              <w:pStyle w:val="af"/>
+              <w:spacing w:before="0" w:beforeAutospacing="0" w:after="0" w:afterAutospacing="0"/>
+              <w:jc w:val="center"/>
+            </w:pPr>
+            <w:r>
+              <w:rPr>
+                <w:color w:val="000000"/>
+                <w:sz w:val="22"/>
+              </w:rPr>
+              <w:t xml:space="preserve">1:10</w:t>
+            </w:r>
+          </w:p>
+        </w:tc>
+        <w:tc>
+          <w:tcPr>
+            <w:tcW w:w="1100" w:type="dxa"/>
+          </w:tcPr>
+          <w:p>
+            <w:pPr>
+              <w:pStyle w:val="af"/>
+              <w:spacing w:before="0" w:beforeAutospacing="0" w:after="0" w:afterAutospacing="0"/>
+              <w:jc w:val="center"/>
+            </w:pPr>
+            <w:r>
+              <w:rPr>
+                <w:color w:val="000000"/>
+                <w:sz w:val="22"/>
+              </w:rPr>
+              <w:t xml:space="preserve">1:30</w:t>
+            </w:r>
+          </w:p>
+        </w:tc>
+        <w:tc>
+          <w:tcPr>
+            <w:tcW w:w="1000" w:type="dxa"/>
+          </w:tcPr>
+          <w:p>
+            <w:pPr>
+              <w:pStyle w:val="af"/>
+              <w:spacing w:before="0" w:beforeAutospacing="0" w:after="0" w:afterAutospacing="0"/>
+              <w:jc w:val="center"/>
+            </w:pPr>
+            <w:r>
+              <w:rPr>
+                <w:color w:val="000000"/>
+                <w:sz w:val="22"/>
+              </w:rPr>
+              <w:t xml:space="preserve">1:55</w:t>
+            </w:r>
+          </w:p>
+        </w:tc>
+      </w:tr>
+      <w:tr>
+        <w:trPr>
+          <w:cantSplit/>
+        </w:trPr>
+        <w:tc>
+          <w:tcPr>
+            <w:tcW w:w="1150" w:type="dxa"/>
+          </w:tcPr>
+          <w:p>
+            <w:pPr>
+              <w:pStyle w:val="af"/>
+              <w:spacing w:before="0" w:beforeAutospacing="0" w:after="0" w:afterAutospacing="0"/>
+              <w:jc w:val="center"/>
+            </w:pPr>
+            <w:r>
+              <w:rPr>
+                <w:color w:val="000000"/>
+                <w:sz w:val="22"/>
+              </w:rPr>
+              <w:t xml:space="preserve">13</w:t>
+            </w:r>
+          </w:p>
+        </w:tc>
+        <w:tc>
+          <w:tcPr>
+            <w:tcW w:w="1150" w:type="dxa"/>
+          </w:tcPr>
+          <w:p>
+            <w:pPr>
+              <w:pStyle w:val="af"/>
+              <w:spacing w:before="0" w:beforeAutospacing="0" w:after="0" w:afterAutospacing="0"/>
+              <w:jc w:val="center"/>
+            </w:pPr>
+            <w:r>
+              <w:rPr>
+                <w:color w:val="000000"/>
+                <w:sz w:val="22"/>
+              </w:rPr>
+              <w:t xml:space="preserve">3</w:t>
+            </w:r>
+          </w:p>
+        </w:tc>
+        <w:tc>
+          <w:tcPr>
+            <w:tcW w:w="2505" w:type="dxa"/>
+          </w:tcPr>
+          <w:p>
+            <w:pPr>
+              <w:pStyle w:val="af"/>
+              <w:spacing w:before="0" w:beforeAutospacing="0" w:after="0" w:afterAutospacing="0"/>
+              <w:jc w:val="left"/>
+            </w:pPr>
+            <w:r>
+              <w:rPr>
+                <w:color w:val="000000"/>
+                <w:sz w:val="22"/>
+              </w:rPr>
+              <w:t xml:space="preserve">2 закрытые полки</w:t>
+            </w:r>
+          </w:p>
+        </w:tc>
+        <w:tc>
+          <w:tcPr>
+            <w:tcW w:w="1350" w:type="dxa"/>
+          </w:tcPr>
+          <w:p>
+            <w:pPr>
+              <w:pStyle w:val="af"/>
+              <w:spacing w:before="0" w:beforeAutospacing="0" w:after="0" w:afterAutospacing="0"/>
+              <w:jc w:val="center"/>
+            </w:pPr>
+            <w:r>
+              <w:rPr>
+                <w:color w:val="000000"/>
+                <w:sz w:val="22"/>
+              </w:rPr>
+              <w:t xml:space="preserve">60</w:t>
+            </w:r>
+          </w:p>
+        </w:tc>
+        <w:tc>
+          <w:tcPr>
+            <w:tcW w:w="1100" w:type="dxa"/>
+          </w:tcPr>
+          <w:p>
+            <w:pPr>
+              <w:pStyle w:val="af"/>
+              <w:spacing w:before="0" w:beforeAutospacing="0" w:after="0" w:afterAutospacing="0"/>
+              <w:jc w:val="center"/>
+            </w:pPr>
+            <w:r>
+              <w:rPr>
+                <w:color w:val="000000"/>
+                <w:sz w:val="22"/>
+              </w:rPr>
+              <w:t xml:space="preserve">1:15</w:t>
+            </w:r>
+          </w:p>
+        </w:tc>
+        <w:tc>
+          <w:tcPr>
+            <w:tcW w:w="1100" w:type="dxa"/>
+          </w:tcPr>
+          <w:p>
+            <w:pPr>
+              <w:pStyle w:val="af"/>
+              <w:spacing w:before="0" w:beforeAutospacing="0" w:after="0" w:afterAutospacing="0"/>
+              <w:jc w:val="center"/>
+            </w:pPr>
+            <w:r>
+              <w:rPr>
+                <w:color w:val="000000"/>
+                <w:sz w:val="22"/>
+              </w:rPr>
+              <w:t xml:space="preserve">1:35</w:t>
+            </w:r>
+          </w:p>
+        </w:tc>
+        <w:tc>
+          <w:tcPr>
+            <w:tcW w:w="1000" w:type="dxa"/>
+          </w:tcPr>
+          <w:p>
+            <w:pPr>
+              <w:pStyle w:val="af"/>
+              <w:spacing w:before="0" w:beforeAutospacing="0" w:after="0" w:afterAutospacing="0"/>
+              <w:jc w:val="center"/>
+            </w:pPr>
+            <w:r>
+              <w:rPr>
+                <w:color w:val="000000"/>
+                <w:sz w:val="22"/>
+              </w:rPr>
+              <w:t xml:space="preserve">2:00</w:t>
+            </w:r>
+          </w:p>
+        </w:tc>
+      </w:tr>
+      <w:tr>
+        <w:trPr>
+          <w:cantSplit/>
+        </w:trPr>
+        <w:tc>
+          <w:tcPr>
+            <w:tcW w:w="1150" w:type="dxa"/>
+          </w:tcPr>
+          <w:p>
+            <w:pPr>
+              <w:pStyle w:val="af"/>
+              <w:spacing w:before="0" w:beforeAutospacing="0" w:after="0" w:afterAutospacing="0"/>
+              <w:jc w:val="center"/>
+            </w:pPr>
+            <w:r>
+              <w:rPr>
+                <w:color w:val="000000"/>
+                <w:sz w:val="22"/>
+              </w:rPr>
+              <w:t xml:space="preserve">14</w:t>
+            </w:r>
+          </w:p>
+        </w:tc>
+        <w:tc>
+          <w:tcPr>
+            <w:tcW w:w="1150" w:type="dxa"/>
+          </w:tcPr>
+          <w:p>
+            <w:pPr>
+              <w:pStyle w:val="af"/>
+              <w:spacing w:before="0" w:beforeAutospacing="0" w:after="0" w:afterAutospacing="0"/>
+              <w:jc w:val="center"/>
+            </w:pPr>
+            <w:r>
+              <w:rPr>
+                <w:color w:val="000000"/>
+                <w:sz w:val="22"/>
+              </w:rPr>
+              <w:t xml:space="preserve">3</w:t>
+            </w:r>
+          </w:p>
+        </w:tc>
+        <w:tc>
+          <w:tcPr>
+            <w:tcW w:w="2505" w:type="dxa"/>
+          </w:tcPr>
+          <w:p>
+            <w:pPr>
+              <w:pStyle w:val="af"/>
+              <w:spacing w:before="0" w:beforeAutospacing="0" w:after="0" w:afterAutospacing="0"/>
+              <w:jc w:val="left"/>
+            </w:pPr>
+            <w:r>
+              <w:rPr>
+                <w:color w:val="000000"/>
+                <w:sz w:val="22"/>
+              </w:rPr>
+              <w:t xml:space="preserve">2 закрытые полки</w:t>
+            </w:r>
+          </w:p>
+        </w:tc>
+        <w:tc>
+          <w:tcPr>
+            <w:tcW w:w="1350" w:type="dxa"/>
+          </w:tcPr>
+          <w:p>
+            <w:pPr>
+              <w:pStyle w:val="af"/>
+              <w:spacing w:before="0" w:beforeAutospacing="0" w:after="0" w:afterAutospacing="0"/>
+              <w:jc w:val="center"/>
+            </w:pPr>
+            <w:r>
+              <w:rPr>
+                <w:color w:val="000000"/>
+                <w:sz w:val="22"/>
+              </w:rPr>
+              <w:t xml:space="preserve">57</w:t>
+            </w:r>
+          </w:p>
+        </w:tc>
+        <w:tc>
+          <w:tcPr>
+            <w:tcW w:w="1100" w:type="dxa"/>
+          </w:tcPr>
+          <w:p>
+            <w:pPr>
+              <w:pStyle w:val="af"/>
+              <w:spacing w:before="0" w:beforeAutospacing="0" w:after="0" w:afterAutospacing="0"/>
+              <w:jc w:val="center"/>
+            </w:pPr>
+            <w:r>
+              <w:rPr>
+                <w:color w:val="000000"/>
+                <w:sz w:val="22"/>
+              </w:rPr>
+              <w:t xml:space="preserve">1:15</w:t>
+            </w:r>
+          </w:p>
+        </w:tc>
+        <w:tc>
+          <w:tcPr>
+            <w:tcW w:w="1100" w:type="dxa"/>
+          </w:tcPr>
+          <w:p>
+            <w:pPr>
+              <w:pStyle w:val="af"/>
+              <w:spacing w:before="0" w:beforeAutospacing="0" w:after="0" w:afterAutospacing="0"/>
+              <w:jc w:val="center"/>
+            </w:pPr>
+            <w:r>
+              <w:rPr>
+                <w:color w:val="000000"/>
+                <w:sz w:val="22"/>
+              </w:rPr>
+              <w:t xml:space="preserve">1:40</w:t>
+            </w:r>
+          </w:p>
+        </w:tc>
+        <w:tc>
+          <w:tcPr>
+            <w:tcW w:w="1000" w:type="dxa"/>
+          </w:tcPr>
+          <w:p>
+            <w:pPr>
+              <w:pStyle w:val="af"/>
+              <w:spacing w:before="0" w:beforeAutospacing="0" w:after="0" w:afterAutospacing="0"/>
+              <w:jc w:val="center"/>
+            </w:pPr>
+            <w:r>
+              <w:rPr>
+                <w:color w:val="000000"/>
+                <w:sz w:val="22"/>
+              </w:rPr>
+              <w:t xml:space="preserve">2:05</w:t>
+            </w:r>
+          </w:p>
+        </w:tc>
+      </w:tr>
+      <w:tr>
+        <w:trPr>
+          <w:cantSplit/>
+        </w:trPr>
+        <w:tc>
+          <w:tcPr>
+            <w:tcW w:w="1150" w:type="dxa"/>
+          </w:tcPr>
+          <w:p>
+            <w:pPr>
+              <w:pStyle w:val="af"/>
+              <w:spacing w:before="0" w:beforeAutospacing="0" w:after="0" w:afterAutospacing="0"/>
+              <w:jc w:val="center"/>
+            </w:pPr>
+            <w:r>
+              <w:rPr>
+                <w:color w:val="000000"/>
+                <w:sz w:val="22"/>
+              </w:rPr>
+              <w:t xml:space="preserve">15</w:t>
+            </w:r>
+          </w:p>
+        </w:tc>
+        <w:tc>
+          <w:tcPr>
+            <w:tcW w:w="1150" w:type="dxa"/>
+          </w:tcPr>
+          <w:p>
+            <w:pPr>
+              <w:pStyle w:val="af"/>
+              <w:spacing w:before="0" w:beforeAutospacing="0" w:after="0" w:afterAutospacing="0"/>
+              <w:jc w:val="center"/>
+            </w:pPr>
+            <w:r>
+              <w:rPr>
+                <w:color w:val="000000"/>
+                <w:sz w:val="22"/>
+              </w:rPr>
+              <w:t xml:space="preserve">3</w:t>
+            </w:r>
+          </w:p>
+        </w:tc>
+        <w:tc>
+          <w:tcPr>
+            <w:tcW w:w="2505" w:type="dxa"/>
+          </w:tcPr>
+          <w:p>
+            <w:pPr>
+              <w:pStyle w:val="af"/>
+              <w:spacing w:before="0" w:beforeAutospacing="0" w:after="0" w:afterAutospacing="0"/>
+              <w:jc w:val="left"/>
+            </w:pPr>
+            <w:r>
+              <w:rPr>
+                <w:color w:val="000000"/>
+                <w:sz w:val="22"/>
+              </w:rPr>
+              <w:t xml:space="preserve">3 закрытые полки</w:t>
+            </w:r>
+          </w:p>
+        </w:tc>
+        <w:tc>
+          <w:tcPr>
+            <w:tcW w:w="1350" w:type="dxa"/>
+          </w:tcPr>
+          <w:p>
+            <w:pPr>
+              <w:pStyle w:val="af"/>
+              <w:spacing w:before="0" w:beforeAutospacing="0" w:after="0" w:afterAutospacing="0"/>
+              <w:jc w:val="center"/>
+            </w:pPr>
+            <w:r>
+              <w:rPr>
+                <w:color w:val="000000"/>
+                <w:sz w:val="22"/>
+              </w:rPr>
+              <w:t xml:space="preserve">54</w:t>
+            </w:r>
+          </w:p>
+        </w:tc>
+        <w:tc>
+          <w:tcPr>
+            <w:tcW w:w="1100" w:type="dxa"/>
+          </w:tcPr>
+          <w:p>
+            <w:pPr>
+              <w:pStyle w:val="af"/>
+              <w:spacing w:before="0" w:beforeAutospacing="0" w:after="0" w:afterAutospacing="0"/>
+              <w:jc w:val="center"/>
+            </w:pPr>
+            <w:r>
+              <w:rPr>
+                <w:color w:val="000000"/>
+                <w:sz w:val="22"/>
+              </w:rPr>
+              <w:t xml:space="preserve">1:20</w:t>
+            </w:r>
+          </w:p>
+        </w:tc>
+        <w:tc>
+          <w:tcPr>
+            <w:tcW w:w="1100" w:type="dxa"/>
+          </w:tcPr>
+          <w:p>
+            <w:pPr>
+              <w:pStyle w:val="af"/>
+              <w:spacing w:before="0" w:beforeAutospacing="0" w:after="0" w:afterAutospacing="0"/>
+              <w:jc w:val="center"/>
+            </w:pPr>
+            <w:r>
+              <w:rPr>
+                <w:color w:val="000000"/>
+                <w:sz w:val="22"/>
+              </w:rPr>
+              <w:t xml:space="preserve">1:45</w:t>
+            </w:r>
+          </w:p>
+        </w:tc>
+        <w:tc>
+          <w:tcPr>
+            <w:tcW w:w="1000" w:type="dxa"/>
+          </w:tcPr>
+          <w:p>
+            <w:pPr>
+              <w:pStyle w:val="af"/>
+              <w:spacing w:before="0" w:beforeAutospacing="0" w:after="0" w:afterAutospacing="0"/>
+              <w:jc w:val="center"/>
+            </w:pPr>
+            <w:r>
+              <w:rPr>
+                <w:color w:val="000000"/>
+                <w:sz w:val="22"/>
+              </w:rPr>
+              <w:t xml:space="preserve">2:10</w:t>
+            </w:r>
+          </w:p>
+        </w:tc>
+      </w:tr>
+      <w:tr>
+        <w:trPr>
+          <w:cantSplit/>
+        </w:trPr>
+        <w:tc>
+          <w:tcPr>
+            <w:tcW w:w="1150" w:type="dxa"/>
+          </w:tcPr>
+          <w:p>
+            <w:pPr>
+              <w:pStyle w:val="af"/>
+              <w:spacing w:before="0" w:beforeAutospacing="0" w:after="0" w:afterAutospacing="0"/>
+              <w:jc w:val="center"/>
+            </w:pPr>
+            <w:r>
+              <w:rPr>
+                <w:color w:val="000000"/>
+                <w:sz w:val="22"/>
+              </w:rPr>
+              <w:t xml:space="preserve">16</w:t>
+            </w:r>
+          </w:p>
+        </w:tc>
+        <w:tc>
+          <w:tcPr>
+            <w:tcW w:w="1150" w:type="dxa"/>
+          </w:tcPr>
+          <w:p>
+            <w:pPr>
+              <w:pStyle w:val="af"/>
+              <w:spacing w:before="0" w:beforeAutospacing="0" w:after="0" w:afterAutospacing="0"/>
+              <w:jc w:val="center"/>
+            </w:pPr>
+            <w:r>
+              <w:rPr>
+                <w:color w:val="000000"/>
+                <w:sz w:val="22"/>
+              </w:rPr>
+              <w:t xml:space="preserve">4</w:t>
+            </w:r>
+          </w:p>
+        </w:tc>
+        <w:tc>
+          <w:tcPr>
+            <w:tcW w:w="2505" w:type="dxa"/>
+          </w:tcPr>
+          <w:p>
+            <w:pPr>
+              <w:pStyle w:val="af"/>
+              <w:spacing w:before="0" w:beforeAutospacing="0" w:after="0" w:afterAutospacing="0"/>
+              <w:jc w:val="left"/>
+            </w:pPr>
+            <w:r>
+              <w:rPr>
+                <w:color w:val="000000"/>
+                <w:sz w:val="22"/>
+              </w:rPr>
+              <w:t xml:space="preserve">2 конвейера</w:t>
+            </w:r>
+          </w:p>
+        </w:tc>
+        <w:tc>
+          <w:tcPr>
+            <w:tcW w:w="1350" w:type="dxa"/>
+          </w:tcPr>
+          <w:p>
+            <w:pPr>
+              <w:pStyle w:val="af"/>
+              <w:spacing w:before="0" w:beforeAutospacing="0" w:after="0" w:afterAutospacing="0"/>
+              <w:jc w:val="center"/>
+            </w:pPr>
+            <w:r>
+              <w:rPr>
+                <w:color w:val="000000"/>
+                <w:sz w:val="22"/>
+              </w:rPr>
+              <w:t xml:space="preserve">72</w:t>
+            </w:r>
+          </w:p>
+        </w:tc>
+        <w:tc>
+          <w:tcPr>
+            <w:tcW w:w="1100" w:type="dxa"/>
+          </w:tcPr>
+          <w:p>
+            <w:pPr>
+              <w:pStyle w:val="af"/>
+              <w:spacing w:before="0" w:beforeAutospacing="0" w:after="0" w:afterAutospacing="0"/>
+              <w:jc w:val="center"/>
+            </w:pPr>
+            <w:r>
+              <w:rPr>
+                <w:color w:val="000000"/>
+                <w:sz w:val="22"/>
+              </w:rPr>
+              <w:t xml:space="preserve">1:05</w:t>
+            </w:r>
+          </w:p>
+        </w:tc>
+        <w:tc>
+          <w:tcPr>
+            <w:tcW w:w="1100" w:type="dxa"/>
+          </w:tcPr>
+          <w:p>
+            <w:pPr>
+              <w:pStyle w:val="af"/>
+              <w:spacing w:before="0" w:beforeAutospacing="0" w:after="0" w:afterAutospacing="0"/>
+              <w:jc w:val="center"/>
+            </w:pPr>
+            <w:r>
+              <w:rPr>
+                <w:color w:val="000000"/>
+                <w:sz w:val="22"/>
+              </w:rPr>
+              <w:t xml:space="preserve">1:30</w:t>
+            </w:r>
+          </w:p>
+        </w:tc>
+        <w:tc>
+          <w:tcPr>
+            <w:tcW w:w="1000" w:type="dxa"/>
+          </w:tcPr>
+          <w:p>
+            <w:pPr>
+              <w:pStyle w:val="af"/>
+              <w:spacing w:before="0" w:beforeAutospacing="0" w:after="0" w:afterAutospacing="0"/>
+              <w:jc w:val="center"/>
+            </w:pPr>
+            <w:r>
+              <w:rPr>
+                <w:color w:val="000000"/>
+                <w:sz w:val="22"/>
+              </w:rPr>
+              <w:t xml:space="preserve">1:55</w:t>
+            </w:r>
+          </w:p>
+        </w:tc>
+      </w:tr>
+      <w:tr>
+        <w:trPr>
+          <w:cantSplit/>
+        </w:trPr>
+        <w:tc>
+          <w:tcPr>
+            <w:tcW w:w="1150" w:type="dxa"/>
+          </w:tcPr>
+          <w:p>
+            <w:pPr>
+              <w:pStyle w:val="af"/>
+              <w:spacing w:before="0" w:beforeAutospacing="0" w:after="0" w:afterAutospacing="0"/>
+              <w:jc w:val="center"/>
+            </w:pPr>
+            <w:r>
+              <w:rPr>
+                <w:color w:val="000000"/>
+                <w:sz w:val="22"/>
+              </w:rPr>
+              <w:t xml:space="preserve">17</w:t>
+            </w:r>
+          </w:p>
+        </w:tc>
+        <w:tc>
+          <w:tcPr>
+            <w:tcW w:w="1150" w:type="dxa"/>
+          </w:tcPr>
+          <w:p>
+            <w:pPr>
+              <w:pStyle w:val="af"/>
+              <w:spacing w:before="0" w:beforeAutospacing="0" w:after="0" w:afterAutospacing="0"/>
+              <w:jc w:val="center"/>
+            </w:pPr>
+            <w:r>
+              <w:rPr>
+                <w:color w:val="000000"/>
+                <w:sz w:val="22"/>
+              </w:rPr>
+              <w:t xml:space="preserve">4</w:t>
+            </w:r>
+          </w:p>
+        </w:tc>
+        <w:tc>
+          <w:tcPr>
+            <w:tcW w:w="2505" w:type="dxa"/>
+          </w:tcPr>
+          <w:p>
+            <w:pPr>
+              <w:pStyle w:val="af"/>
+              <w:spacing w:before="0" w:beforeAutospacing="0" w:after="0" w:afterAutospacing="0"/>
+              <w:jc w:val="left"/>
+            </w:pPr>
+            <w:r>
+              <w:rPr>
+                <w:color w:val="000000"/>
+                <w:sz w:val="22"/>
+              </w:rPr>
+              <w:t xml:space="preserve">3 конвейера</w:t>
+            </w:r>
+          </w:p>
+        </w:tc>
+        <w:tc>
+          <w:tcPr>
+            <w:tcW w:w="1350" w:type="dxa"/>
+          </w:tcPr>
+          <w:p>
+            <w:pPr>
+              <w:pStyle w:val="af"/>
+              <w:spacing w:before="0" w:beforeAutospacing="0" w:after="0" w:afterAutospacing="0"/>
+              <w:jc w:val="center"/>
+            </w:pPr>
+            <w:r>
+              <w:rPr>
+                <w:color w:val="000000"/>
+                <w:sz w:val="22"/>
+              </w:rPr>
+              <w:t xml:space="preserve">78</w:t>
+            </w:r>
+          </w:p>
+        </w:tc>
+        <w:tc>
+          <w:tcPr>
+            <w:tcW w:w="1100" w:type="dxa"/>
+          </w:tcPr>
+          <w:p>
+            <w:pPr>
+              <w:pStyle w:val="af"/>
+              <w:spacing w:before="0" w:beforeAutospacing="0" w:after="0" w:afterAutospacing="0"/>
+              <w:jc w:val="center"/>
+            </w:pPr>
+            <w:r>
+              <w:rPr>
+                <w:color w:val="000000"/>
+                <w:sz w:val="22"/>
+              </w:rPr>
+              <w:t xml:space="preserve">1:15</w:t>
+            </w:r>
+          </w:p>
+        </w:tc>
+        <w:tc>
+          <w:tcPr>
+            <w:tcW w:w="1100" w:type="dxa"/>
+          </w:tcPr>
+          <w:p>
+            <w:pPr>
+              <w:pStyle w:val="af"/>
+              <w:spacing w:before="0" w:beforeAutospacing="0" w:after="0" w:afterAutospacing="0"/>
+              <w:jc w:val="center"/>
+            </w:pPr>
+            <w:r>
+              <w:rPr>
+                <w:color w:val="000000"/>
+                <w:sz w:val="22"/>
+              </w:rPr>
+              <w:t xml:space="preserve">1:35</w:t>
+            </w:r>
+          </w:p>
+        </w:tc>
+        <w:tc>
+          <w:tcPr>
+            <w:tcW w:w="1000" w:type="dxa"/>
+          </w:tcPr>
+          <w:p>
+            <w:pPr>
+              <w:pStyle w:val="af"/>
+              <w:spacing w:before="0" w:beforeAutospacing="0" w:after="0" w:afterAutospacing="0"/>
+              <w:jc w:val="center"/>
+            </w:pPr>
+            <w:r>
+              <w:rPr>
+                <w:color w:val="000000"/>
+                <w:sz w:val="22"/>
+              </w:rPr>
+              <w:t xml:space="preserve">2:00</w:t>
+            </w:r>
+          </w:p>
+        </w:tc>
+      </w:tr>
+      <w:tr>
+        <w:trPr>
+          <w:cantSplit/>
+        </w:trPr>
+        <w:tc>
+          <w:tcPr>
+            <w:tcW w:w="1150" w:type="dxa"/>
+          </w:tcPr>
+          <w:p>
+            <w:pPr>
+              <w:pStyle w:val="af"/>
+              <w:spacing w:before="0" w:beforeAutospacing="0" w:after="0" w:afterAutospacing="0"/>
+              <w:jc w:val="center"/>
+            </w:pPr>
+            <w:r>
+              <w:rPr>
+                <w:color w:val="000000"/>
+                <w:sz w:val="22"/>
+              </w:rPr>
+              <w:t xml:space="preserve">18</w:t>
+            </w:r>
+          </w:p>
+        </w:tc>
+        <w:tc>
+          <w:tcPr>
+            <w:tcW w:w="1150" w:type="dxa"/>
+          </w:tcPr>
+          <w:p>
+            <w:pPr>
+              <w:pStyle w:val="af"/>
+              <w:spacing w:before="0" w:beforeAutospacing="0" w:after="0" w:afterAutospacing="0"/>
+              <w:jc w:val="center"/>
+            </w:pPr>
+            <w:r>
+              <w:rPr>
+                <w:color w:val="000000"/>
+                <w:sz w:val="22"/>
+              </w:rPr>
+              <w:t xml:space="preserve">4</w:t>
+            </w:r>
+          </w:p>
+        </w:tc>
+        <w:tc>
+          <w:tcPr>
+            <w:tcW w:w="2505" w:type="dxa"/>
+          </w:tcPr>
+          <w:p>
+            <w:pPr>
+              <w:pStyle w:val="af"/>
+              <w:spacing w:before="0" w:beforeAutospacing="0" w:after="0" w:afterAutospacing="0"/>
+              <w:jc w:val="left"/>
+            </w:pPr>
+            <w:r>
+              <w:rPr>
+                <w:color w:val="000000"/>
+                <w:sz w:val="22"/>
+              </w:rPr>
+              <w:t xml:space="preserve">3 конвейера</w:t>
+            </w:r>
+          </w:p>
+        </w:tc>
+        <w:tc>
+          <w:tcPr>
+            <w:tcW w:w="1350" w:type="dxa"/>
+          </w:tcPr>
+          <w:p>
+            <w:pPr>
+              <w:pStyle w:val="af"/>
+              <w:spacing w:before="0" w:beforeAutospacing="0" w:after="0" w:afterAutospacing="0"/>
+              <w:jc w:val="center"/>
+            </w:pPr>
+            <w:r>
+              <w:rPr>
+                <w:color w:val="000000"/>
+                <w:sz w:val="22"/>
+              </w:rPr>
+              <w:t xml:space="preserve">84</w:t>
+            </w:r>
+          </w:p>
+        </w:tc>
+        <w:tc>
+          <w:tcPr>
+            <w:tcW w:w="1100" w:type="dxa"/>
+          </w:tcPr>
+          <w:p>
+            <w:pPr>
+              <w:pStyle w:val="af"/>
+              <w:spacing w:before="0" w:beforeAutospacing="0" w:after="0" w:afterAutospacing="0"/>
+              <w:jc w:val="center"/>
+            </w:pPr>
+            <w:r>
+              <w:rPr>
+                <w:color w:val="000000"/>
+                <w:sz w:val="22"/>
+              </w:rPr>
+              <w:t xml:space="preserve">1:25</w:t>
+            </w:r>
+          </w:p>
+        </w:tc>
+        <w:tc>
+          <w:tcPr>
+            <w:tcW w:w="1100" w:type="dxa"/>
+          </w:tcPr>
+          <w:p>
+            <w:pPr>
+              <w:pStyle w:val="af"/>
+              <w:spacing w:before="0" w:beforeAutospacing="0" w:after="0" w:afterAutospacing="0"/>
+              <w:jc w:val="center"/>
+            </w:pPr>
+            <w:r>
+              <w:rPr>
+                <w:color w:val="000000"/>
+                <w:sz w:val="22"/>
+              </w:rPr>
+              <w:t xml:space="preserve">1:50</w:t>
+            </w:r>
+          </w:p>
+        </w:tc>
+        <w:tc>
+          <w:tcPr>
+            <w:tcW w:w="1000" w:type="dxa"/>
+          </w:tcPr>
+          <w:p>
+            <w:pPr>
+              <w:pStyle w:val="af"/>
+              <w:spacing w:before="0" w:beforeAutospacing="0" w:after="0" w:afterAutospacing="0"/>
+              <w:jc w:val="center"/>
+            </w:pPr>
+            <w:r>
+              <w:rPr>
+                <w:color w:val="000000"/>
+                <w:sz w:val="22"/>
+              </w:rPr>
+              <w:t xml:space="preserve">2:00</w:t>
+            </w:r>
+          </w:p>
+        </w:tc>
+      </w:tr>
+      <w:tr>
+        <w:trPr>
+          <w:cantSplit/>
+        </w:trPr>
+        <w:tc>
+          <w:tcPr>
+            <w:tcW w:w="1150" w:type="dxa"/>
+          </w:tcPr>
+          <w:p>
+            <w:pPr>
+              <w:pStyle w:val="af"/>
+              <w:spacing w:before="0" w:beforeAutospacing="0" w:after="0" w:afterAutospacing="0"/>
+              <w:jc w:val="center"/>
+            </w:pPr>
+            <w:r>
+              <w:rPr>
+                <w:color w:val="000000"/>
+                <w:sz w:val="22"/>
+              </w:rPr>
+              <w:t xml:space="preserve">19</w:t>
+            </w:r>
+          </w:p>
+        </w:tc>
+        <w:tc>
+          <w:tcPr>
+            <w:tcW w:w="1150" w:type="dxa"/>
+          </w:tcPr>
+          <w:p>
+            <w:pPr>
+              <w:pStyle w:val="af"/>
+              <w:spacing w:before="0" w:beforeAutospacing="0" w:after="0" w:afterAutospacing="0"/>
+              <w:jc w:val="center"/>
+            </w:pPr>
+            <w:r>
+              <w:rPr>
+                <w:color w:val="000000"/>
+                <w:sz w:val="22"/>
+              </w:rPr>
+              <w:t xml:space="preserve">4</w:t>
+            </w:r>
+          </w:p>
+        </w:tc>
+        <w:tc>
+          <w:tcPr>
+            <w:tcW w:w="2505" w:type="dxa"/>
+          </w:tcPr>
+          <w:p>
+            <w:pPr>
+              <w:pStyle w:val="af"/>
+              <w:spacing w:before="0" w:beforeAutospacing="0" w:after="0" w:afterAutospacing="0"/>
+              <w:jc w:val="left"/>
+            </w:pPr>
+            <w:r>
+              <w:rPr>
+                <w:color w:val="000000"/>
+                <w:sz w:val="22"/>
+              </w:rPr>
+              <w:t xml:space="preserve">3 конвейера</w:t>
+            </w:r>
+          </w:p>
+        </w:tc>
+        <w:tc>
+          <w:tcPr>
+            <w:tcW w:w="1350" w:type="dxa"/>
+          </w:tcPr>
+          <w:p>
+            <w:pPr>
+              <w:pStyle w:val="af"/>
+              <w:spacing w:before="0" w:beforeAutospacing="0" w:after="0" w:afterAutospacing="0"/>
+              <w:jc w:val="center"/>
+            </w:pPr>
+            <w:r>
+              <w:rPr>
+                <w:color w:val="000000"/>
+                <w:sz w:val="22"/>
+              </w:rPr>
+              <w:t xml:space="preserve">87</w:t>
+            </w:r>
+          </w:p>
+        </w:tc>
+        <w:tc>
+          <w:tcPr>
+            <w:tcW w:w="1100" w:type="dxa"/>
+          </w:tcPr>
+          <w:p>
+            <w:pPr>
+              <w:pStyle w:val="af"/>
+              <w:spacing w:before="0" w:beforeAutospacing="0" w:after="0" w:afterAutospacing="0"/>
+              <w:jc w:val="center"/>
+            </w:pPr>
+            <w:r>
+              <w:rPr>
+                <w:color w:val="000000"/>
+                <w:sz w:val="22"/>
+              </w:rPr>
+              <w:t xml:space="preserve">1:25</w:t>
+            </w:r>
+          </w:p>
+        </w:tc>
+        <w:tc>
+          <w:tcPr>
+            <w:tcW w:w="1100" w:type="dxa"/>
+          </w:tcPr>
+          <w:p>
+            <w:pPr>
+              <w:pStyle w:val="af"/>
+              <w:spacing w:before="0" w:beforeAutospacing="0" w:after="0" w:afterAutospacing="0"/>
+              <w:jc w:val="center"/>
+            </w:pPr>
+            <w:r>
+              <w:rPr>
+                <w:color w:val="000000"/>
+                <w:sz w:val="22"/>
+              </w:rPr>
+              <w:t xml:space="preserve">1:50</w:t>
+            </w:r>
+          </w:p>
+        </w:tc>
+        <w:tc>
+          <w:tcPr>
+            <w:tcW w:w="1000" w:type="dxa"/>
+          </w:tcPr>
+          <w:p>
+            <w:pPr>
+              <w:pStyle w:val="af"/>
+              <w:spacing w:before="0" w:beforeAutospacing="0" w:after="0" w:afterAutospacing="0"/>
+              <w:jc w:val="center"/>
+            </w:pPr>
+            <w:r>
+              <w:rPr>
+                <w:color w:val="000000"/>
+                <w:sz w:val="22"/>
+              </w:rPr>
+              <w:t xml:space="preserve">2:00</w:t>
+            </w:r>
+          </w:p>
+        </w:tc>
+      </w:tr>
+      <w:tr>
+        <w:trPr>
+          <w:cantSplit/>
+        </w:trPr>
+        <w:tc>
+          <w:tcPr>
+            <w:tcW w:w="1150" w:type="dxa"/>
+          </w:tcPr>
+          <w:p>
+            <w:pPr>
+              <w:pStyle w:val="af"/>
+              <w:spacing w:before="0" w:beforeAutospacing="0" w:after="0" w:afterAutospacing="0"/>
+              <w:jc w:val="center"/>
+            </w:pPr>
+            <w:r>
+              <w:rPr>
+                <w:color w:val="000000"/>
+                <w:sz w:val="22"/>
+              </w:rPr>
+              <w:t xml:space="preserve">20</w:t>
+            </w:r>
+          </w:p>
+        </w:tc>
+        <w:tc>
+          <w:tcPr>
+            <w:tcW w:w="1150" w:type="dxa"/>
+          </w:tcPr>
+          <w:p>
+            <w:pPr>
+              <w:pStyle w:val="af"/>
+              <w:spacing w:before="0" w:beforeAutospacing="0" w:after="0" w:afterAutospacing="0"/>
+              <w:jc w:val="center"/>
+            </w:pPr>
+            <w:r>
+              <w:rPr>
+                <w:color w:val="000000"/>
+                <w:sz w:val="22"/>
+              </w:rPr>
+              <w:t xml:space="preserve">4</w:t>
+            </w:r>
+          </w:p>
+        </w:tc>
+        <w:tc>
+          <w:tcPr>
+            <w:tcW w:w="2505" w:type="dxa"/>
+          </w:tcPr>
+          <w:p>
+            <w:pPr>
+              <w:pStyle w:val="af"/>
+              <w:spacing w:before="0" w:beforeAutospacing="0" w:after="0" w:afterAutospacing="0"/>
+              <w:jc w:val="left"/>
+            </w:pPr>
+            <w:r>
+              <w:rPr>
+                <w:color w:val="000000"/>
+                <w:sz w:val="22"/>
+              </w:rPr>
+              <w:t xml:space="preserve">4 конвейера, фильтр: лампа</w:t>
+            </w:r>
+          </w:p>
+        </w:tc>
+        <w:tc>
+          <w:tcPr>
+            <w:tcW w:w="1350" w:type="dxa"/>
+          </w:tcPr>
+          <w:p>
+            <w:pPr>
+              <w:pStyle w:val="af"/>
+              <w:spacing w:before="0" w:beforeAutospacing="0" w:after="0" w:afterAutospacing="0"/>
+              <w:jc w:val="center"/>
+            </w:pPr>
+            <w:r>
+              <w:rPr>
+                <w:color w:val="000000"/>
+                <w:sz w:val="22"/>
+              </w:rPr>
+              <w:t xml:space="preserve">90</w:t>
+            </w:r>
+          </w:p>
+        </w:tc>
+        <w:tc>
+          <w:tcPr>
+            <w:tcW w:w="1100" w:type="dxa"/>
+          </w:tcPr>
+          <w:p>
+            <w:pPr>
+              <w:pStyle w:val="af"/>
+              <w:spacing w:before="0" w:beforeAutospacing="0" w:after="0" w:afterAutospacing="0"/>
+              <w:jc w:val="center"/>
+            </w:pPr>
+            <w:r>
+              <w:rPr>
+                <w:color w:val="000000"/>
+                <w:sz w:val="22"/>
+              </w:rPr>
+              <w:t xml:space="preserve">1:30</w:t>
+            </w:r>
+          </w:p>
+        </w:tc>
+        <w:tc>
+          <w:tcPr>
+            <w:tcW w:w="1100" w:type="dxa"/>
+          </w:tcPr>
+          <w:p>
+            <w:pPr>
+              <w:pStyle w:val="af"/>
+              <w:spacing w:before="0" w:beforeAutospacing="0" w:after="0" w:afterAutospacing="0"/>
+              <w:jc w:val="center"/>
+            </w:pPr>
+            <w:r>
+              <w:rPr>
+                <w:color w:val="000000"/>
+                <w:sz w:val="22"/>
+              </w:rPr>
+              <w:t xml:space="preserve">1:50</w:t>
+            </w:r>
+          </w:p>
+        </w:tc>
+        <w:tc>
+          <w:tcPr>
+            <w:tcW w:w="1000" w:type="dxa"/>
+          </w:tcPr>
+          <w:p>
+            <w:pPr>
+              <w:pStyle w:val="af"/>
+              <w:spacing w:before="0" w:beforeAutospacing="0" w:after="0" w:afterAutospacing="0"/>
+              <w:jc w:val="center"/>
+            </w:pPr>
+            <w:r>
+              <w:rPr>
+                <w:color w:val="000000"/>
+                <w:sz w:val="22"/>
+              </w:rPr>
+              <w:t xml:space="preserve">2:00</w:t>
+            </w:r>
+          </w:p>
+        </w:tc>
+      </w:tr>
+      <w:tr>
+        <w:trPr>
+          <w:cantSplit/>
+        </w:trPr>
+        <w:tc>
+          <w:tcPr>
+            <w:tcW w:w="1150" w:type="dxa"/>
+          </w:tcPr>
+          <w:p>
+            <w:pPr>
+              <w:pStyle w:val="af"/>
+              <w:spacing w:before="0" w:beforeAutospacing="0" w:after="0" w:afterAutospacing="0"/>
+              <w:jc w:val="center"/>
+            </w:pPr>
+            <w:r>
+              <w:rPr>
+                <w:color w:val="000000"/>
+                <w:sz w:val="22"/>
+              </w:rPr>
+              <w:t xml:space="preserve">21</w:t>
+            </w:r>
+          </w:p>
+        </w:tc>
+        <w:tc>
+          <w:tcPr>
+            <w:tcW w:w="1150" w:type="dxa"/>
+          </w:tcPr>
+          <w:p>
+            <w:pPr>
+              <w:pStyle w:val="af"/>
+              <w:spacing w:before="0" w:beforeAutospacing="0" w:after="0" w:afterAutospacing="0"/>
+              <w:jc w:val="center"/>
+            </w:pPr>
+            <w:r>
+              <w:rPr>
+                <w:color w:val="000000"/>
+                <w:sz w:val="22"/>
+              </w:rPr>
+              <w:t xml:space="preserve">5</w:t>
+            </w:r>
+          </w:p>
+        </w:tc>
+        <w:tc>
+          <w:tcPr>
+            <w:tcW w:w="2505" w:type="dxa"/>
+          </w:tcPr>
+          <w:p>
+            <w:pPr>
+              <w:pStyle w:val="af"/>
+              <w:spacing w:before="0" w:beforeAutospacing="0" w:after="0" w:afterAutospacing="0"/>
+              <w:jc w:val="left"/>
+            </w:pPr>
+            <w:r>
+              <w:rPr>
+                <w:color w:val="000000"/>
+                <w:sz w:val="22"/>
+              </w:rPr>
+              <w:t xml:space="preserve">2 ячейки</w:t>
+            </w:r>
+          </w:p>
+        </w:tc>
+        <w:tc>
+          <w:tcPr>
+            <w:tcW w:w="1350" w:type="dxa"/>
+          </w:tcPr>
+          <w:p>
+            <w:pPr>
+              <w:pStyle w:val="af"/>
+              <w:spacing w:before="0" w:beforeAutospacing="0" w:after="0" w:afterAutospacing="0"/>
+              <w:jc w:val="center"/>
+            </w:pPr>
+            <w:r>
+              <w:rPr>
+                <w:color w:val="000000"/>
+                <w:sz w:val="22"/>
+              </w:rPr>
+              <w:t xml:space="preserve">75</w:t>
+            </w:r>
+          </w:p>
+        </w:tc>
+        <w:tc>
+          <w:tcPr>
+            <w:tcW w:w="1100" w:type="dxa"/>
+          </w:tcPr>
+          <w:p>
+            <w:pPr>
+              <w:pStyle w:val="af"/>
+              <w:spacing w:before="0" w:beforeAutospacing="0" w:after="0" w:afterAutospacing="0"/>
+              <w:jc w:val="center"/>
+            </w:pPr>
+            <w:r>
+              <w:rPr>
+                <w:color w:val="000000"/>
+                <w:sz w:val="22"/>
+              </w:rPr>
+              <w:t xml:space="preserve">1:10</w:t>
+            </w:r>
+          </w:p>
+        </w:tc>
+        <w:tc>
+          <w:tcPr>
+            <w:tcW w:w="1100" w:type="dxa"/>
+          </w:tcPr>
+          <w:p>
+            <w:pPr>
+              <w:pStyle w:val="af"/>
+              <w:spacing w:before="0" w:beforeAutospacing="0" w:after="0" w:afterAutospacing="0"/>
+              <w:jc w:val="center"/>
+            </w:pPr>
+            <w:r>
+              <w:rPr>
+                <w:color w:val="000000"/>
+                <w:sz w:val="22"/>
+              </w:rPr>
+              <w:t xml:space="preserve">1:35</w:t>
+            </w:r>
+          </w:p>
+        </w:tc>
+        <w:tc>
+          <w:tcPr>
+            <w:tcW w:w="1000" w:type="dxa"/>
+          </w:tcPr>
+          <w:p>
+            <w:pPr>
+              <w:pStyle w:val="af"/>
+              <w:spacing w:before="0" w:beforeAutospacing="0" w:after="0" w:afterAutospacing="0"/>
+              <w:jc w:val="center"/>
+            </w:pPr>
+            <w:r>
+              <w:rPr>
+                <w:color w:val="000000"/>
+                <w:sz w:val="22"/>
+              </w:rPr>
+              <w:t xml:space="preserve">2:10</w:t>
+            </w:r>
+          </w:p>
+        </w:tc>
+      </w:tr>
+      <w:tr>
+        <w:trPr>
+          <w:cantSplit/>
+        </w:trPr>
+        <w:tc>
+          <w:tcPr>
+            <w:tcW w:w="1150" w:type="dxa"/>
+          </w:tcPr>
+          <w:p>
+            <w:pPr>
+              <w:pStyle w:val="af"/>
+              <w:spacing w:before="0" w:beforeAutospacing="0" w:after="0" w:afterAutospacing="0"/>
+              <w:jc w:val="center"/>
+            </w:pPr>
+            <w:r>
+              <w:rPr>
+                <w:color w:val="000000"/>
+                <w:sz w:val="22"/>
+              </w:rPr>
+              <w:t xml:space="preserve">22</w:t>
+            </w:r>
+          </w:p>
+        </w:tc>
+        <w:tc>
+          <w:tcPr>
+            <w:tcW w:w="1150" w:type="dxa"/>
+          </w:tcPr>
+          <w:p>
+            <w:pPr>
+              <w:pStyle w:val="af"/>
+              <w:spacing w:before="0" w:beforeAutospacing="0" w:after="0" w:afterAutospacing="0"/>
+              <w:jc w:val="center"/>
+            </w:pPr>
+            <w:r>
+              <w:rPr>
+                <w:color w:val="000000"/>
+                <w:sz w:val="22"/>
+              </w:rPr>
+              <w:t xml:space="preserve">5</w:t>
+            </w:r>
+          </w:p>
+        </w:tc>
+        <w:tc>
+          <w:tcPr>
+            <w:tcW w:w="2505" w:type="dxa"/>
+          </w:tcPr>
+          <w:p>
+            <w:pPr>
+              <w:pStyle w:val="af"/>
+              <w:spacing w:before="0" w:beforeAutospacing="0" w:after="0" w:afterAutospacing="0"/>
+              <w:jc w:val="left"/>
+            </w:pPr>
+            <w:r>
+              <w:rPr>
+                <w:color w:val="000000"/>
+                <w:sz w:val="22"/>
+              </w:rPr>
+              <w:t xml:space="preserve">3 ячейки</w:t>
+            </w:r>
+          </w:p>
+        </w:tc>
+        <w:tc>
+          <w:tcPr>
+            <w:tcW w:w="1350" w:type="dxa"/>
+          </w:tcPr>
+          <w:p>
+            <w:pPr>
+              <w:pStyle w:val="af"/>
+              <w:spacing w:before="0" w:beforeAutospacing="0" w:after="0" w:afterAutospacing="0"/>
+              <w:jc w:val="center"/>
+            </w:pPr>
+            <w:r>
+              <w:rPr>
+                <w:color w:val="000000"/>
+                <w:sz w:val="22"/>
+              </w:rPr>
+              <w:t xml:space="preserve">78</w:t>
+            </w:r>
+          </w:p>
+        </w:tc>
+        <w:tc>
+          <w:tcPr>
+            <w:tcW w:w="1100" w:type="dxa"/>
+          </w:tcPr>
+          <w:p>
+            <w:pPr>
+              <w:pStyle w:val="af"/>
+              <w:spacing w:before="0" w:beforeAutospacing="0" w:after="0" w:afterAutospacing="0"/>
+              <w:jc w:val="center"/>
+            </w:pPr>
+            <w:r>
+              <w:rPr>
+                <w:color w:val="000000"/>
+                <w:sz w:val="22"/>
+              </w:rPr>
+              <w:t xml:space="preserve">1:10</w:t>
+            </w:r>
+          </w:p>
+        </w:tc>
+        <w:tc>
+          <w:tcPr>
+            <w:tcW w:w="1100" w:type="dxa"/>
+          </w:tcPr>
+          <w:p>
+            <w:pPr>
+              <w:pStyle w:val="af"/>
+              <w:spacing w:before="0" w:beforeAutospacing="0" w:after="0" w:afterAutospacing="0"/>
+              <w:jc w:val="center"/>
+            </w:pPr>
+            <w:r>
+              <w:rPr>
+                <w:color w:val="000000"/>
+                <w:sz w:val="22"/>
+              </w:rPr>
+              <w:t xml:space="preserve">1:40</w:t>
+            </w:r>
+          </w:p>
+        </w:tc>
+        <w:tc>
+          <w:tcPr>
+            <w:tcW w:w="1000" w:type="dxa"/>
+          </w:tcPr>
+          <w:p>
+            <w:pPr>
+              <w:pStyle w:val="af"/>
+              <w:spacing w:before="0" w:beforeAutospacing="0" w:after="0" w:afterAutospacing="0"/>
+              <w:jc w:val="center"/>
+            </w:pPr>
+            <w:r>
+              <w:rPr>
+                <w:color w:val="000000"/>
+                <w:sz w:val="22"/>
+              </w:rPr>
+              <w:t xml:space="preserve">2:15</w:t>
+            </w:r>
+          </w:p>
+        </w:tc>
+      </w:tr>
+      <w:tr>
+        <w:trPr>
+          <w:cantSplit/>
+        </w:trPr>
+        <w:tc>
+          <w:tcPr>
+            <w:tcW w:w="1150" w:type="dxa"/>
+          </w:tcPr>
+          <w:p>
+            <w:pPr>
+              <w:pStyle w:val="af"/>
+              <w:spacing w:before="0" w:beforeAutospacing="0" w:after="0" w:afterAutospacing="0"/>
+              <w:jc w:val="center"/>
+            </w:pPr>
+            <w:r>
+              <w:rPr>
+                <w:color w:val="000000"/>
+                <w:sz w:val="22"/>
+              </w:rPr>
+              <w:t xml:space="preserve">23</w:t>
+            </w:r>
+          </w:p>
+        </w:tc>
+        <w:tc>
+          <w:tcPr>
+            <w:tcW w:w="1150" w:type="dxa"/>
+          </w:tcPr>
+          <w:p>
+            <w:pPr>
+              <w:pStyle w:val="af"/>
+              <w:spacing w:before="0" w:beforeAutospacing="0" w:after="0" w:afterAutospacing="0"/>
+              <w:jc w:val="center"/>
+            </w:pPr>
+            <w:r>
+              <w:rPr>
+                <w:color w:val="000000"/>
+                <w:sz w:val="22"/>
+              </w:rPr>
+              <w:t xml:space="preserve">5</w:t>
+            </w:r>
+          </w:p>
+        </w:tc>
+        <w:tc>
+          <w:tcPr>
+            <w:tcW w:w="2505" w:type="dxa"/>
+          </w:tcPr>
+          <w:p>
+            <w:pPr>
+              <w:pStyle w:val="af"/>
+              <w:spacing w:before="0" w:beforeAutospacing="0" w:after="0" w:afterAutospacing="0"/>
+              <w:jc w:val="left"/>
+            </w:pPr>
+            <w:r>
+              <w:rPr>
+                <w:color w:val="000000"/>
+                <w:sz w:val="22"/>
+              </w:rPr>
+              <w:t xml:space="preserve">4 ячейки</w:t>
+            </w:r>
+          </w:p>
+        </w:tc>
+        <w:tc>
+          <w:tcPr>
+            <w:tcW w:w="1350" w:type="dxa"/>
+          </w:tcPr>
+          <w:p>
+            <w:pPr>
+              <w:pStyle w:val="af"/>
+              <w:spacing w:before="0" w:beforeAutospacing="0" w:after="0" w:afterAutospacing="0"/>
+              <w:jc w:val="center"/>
+            </w:pPr>
+            <w:r>
+              <w:rPr>
+                <w:color w:val="000000"/>
+                <w:sz w:val="22"/>
+              </w:rPr>
+              <w:t xml:space="preserve">81</w:t>
+            </w:r>
+          </w:p>
+        </w:tc>
+        <w:tc>
+          <w:tcPr>
+            <w:tcW w:w="1100" w:type="dxa"/>
+          </w:tcPr>
+          <w:p>
+            <w:pPr>
+              <w:pStyle w:val="af"/>
+              <w:spacing w:before="0" w:beforeAutospacing="0" w:after="0" w:afterAutospacing="0"/>
+              <w:jc w:val="center"/>
+            </w:pPr>
+            <w:r>
+              <w:rPr>
+                <w:color w:val="000000"/>
+                <w:sz w:val="22"/>
+              </w:rPr>
+              <w:t xml:space="preserve">1:15</w:t>
+            </w:r>
+          </w:p>
+        </w:tc>
+        <w:tc>
+          <w:tcPr>
+            <w:tcW w:w="1100" w:type="dxa"/>
+          </w:tcPr>
+          <w:p>
+            <w:pPr>
+              <w:pStyle w:val="af"/>
+              <w:spacing w:before="0" w:beforeAutospacing="0" w:after="0" w:afterAutospacing="0"/>
+              <w:jc w:val="center"/>
+            </w:pPr>
+            <w:r>
+              <w:rPr>
+                <w:color w:val="000000"/>
+                <w:sz w:val="22"/>
+              </w:rPr>
+              <w:t xml:space="preserve">1:45</w:t>
+            </w:r>
+          </w:p>
+        </w:tc>
+        <w:tc>
+          <w:tcPr>
+            <w:tcW w:w="1000" w:type="dxa"/>
+          </w:tcPr>
+          <w:p>
+            <w:pPr>
+              <w:pStyle w:val="af"/>
+              <w:spacing w:before="0" w:beforeAutospacing="0" w:after="0" w:afterAutospacing="0"/>
+              <w:jc w:val="center"/>
+            </w:pPr>
+            <w:r>
+              <w:rPr>
+                <w:color w:val="000000"/>
+                <w:sz w:val="22"/>
+              </w:rPr>
+              <w:t xml:space="preserve">2:20</w:t>
+            </w:r>
+          </w:p>
+        </w:tc>
+      </w:tr>
+      <w:tr>
+        <w:trPr>
+          <w:cantSplit/>
+        </w:trPr>
+        <w:tc>
+          <w:tcPr>
+            <w:tcW w:w="1150" w:type="dxa"/>
+          </w:tcPr>
+          <w:p>
+            <w:pPr>
+              <w:pStyle w:val="af"/>
+              <w:spacing w:before="0" w:beforeAutospacing="0" w:after="0" w:afterAutospacing="0"/>
+              <w:jc w:val="center"/>
+            </w:pPr>
+            <w:r>
+              <w:rPr>
+                <w:color w:val="000000"/>
+                <w:sz w:val="22"/>
+              </w:rPr>
+              <w:t xml:space="preserve">24</w:t>
+            </w:r>
+          </w:p>
+        </w:tc>
+        <w:tc>
+          <w:tcPr>
+            <w:tcW w:w="1150" w:type="dxa"/>
+          </w:tcPr>
+          <w:p>
+            <w:pPr>
+              <w:pStyle w:val="af"/>
+              <w:spacing w:before="0" w:beforeAutospacing="0" w:after="0" w:afterAutospacing="0"/>
+              <w:jc w:val="center"/>
+            </w:pPr>
+            <w:r>
+              <w:rPr>
+                <w:color w:val="000000"/>
+                <w:sz w:val="22"/>
+              </w:rPr>
+              <w:t xml:space="preserve">5</w:t>
+            </w:r>
+          </w:p>
+        </w:tc>
+        <w:tc>
+          <w:tcPr>
+            <w:tcW w:w="2505" w:type="dxa"/>
+          </w:tcPr>
+          <w:p>
+            <w:pPr>
+              <w:pStyle w:val="af"/>
+              <w:spacing w:before="0" w:beforeAutospacing="0" w:after="0" w:afterAutospacing="0"/>
+              <w:jc w:val="left"/>
+            </w:pPr>
+            <w:r>
+              <w:rPr>
+                <w:color w:val="000000"/>
+                <w:sz w:val="22"/>
+              </w:rPr>
+              <w:t xml:space="preserve">4 ячейки, разные окна</w:t>
+            </w:r>
+          </w:p>
+        </w:tc>
+        <w:tc>
+          <w:tcPr>
+            <w:tcW w:w="1350" w:type="dxa"/>
+          </w:tcPr>
+          <w:p>
+            <w:pPr>
+              <w:pStyle w:val="af"/>
+              <w:spacing w:before="0" w:beforeAutospacing="0" w:after="0" w:afterAutospacing="0"/>
+              <w:jc w:val="center"/>
+            </w:pPr>
+            <w:r>
+              <w:rPr>
+                <w:color w:val="000000"/>
+                <w:sz w:val="22"/>
+              </w:rPr>
+              <w:t xml:space="preserve">84</w:t>
+            </w:r>
+          </w:p>
+        </w:tc>
+        <w:tc>
+          <w:tcPr>
+            <w:tcW w:w="1100" w:type="dxa"/>
+          </w:tcPr>
+          <w:p>
+            <w:pPr>
+              <w:pStyle w:val="af"/>
+              <w:spacing w:before="0" w:beforeAutospacing="0" w:after="0" w:afterAutospacing="0"/>
+              <w:jc w:val="center"/>
+            </w:pPr>
+            <w:r>
+              <w:rPr>
+                <w:color w:val="000000"/>
+                <w:sz w:val="22"/>
+              </w:rPr>
+              <w:t xml:space="preserve">1:15</w:t>
+            </w:r>
+          </w:p>
+        </w:tc>
+        <w:tc>
+          <w:tcPr>
+            <w:tcW w:w="1100" w:type="dxa"/>
+          </w:tcPr>
+          <w:p>
+            <w:pPr>
+              <w:pStyle w:val="af"/>
+              <w:spacing w:before="0" w:beforeAutospacing="0" w:after="0" w:afterAutospacing="0"/>
+              <w:jc w:val="center"/>
+            </w:pPr>
+            <w:r>
+              <w:rPr>
+                <w:color w:val="000000"/>
+                <w:sz w:val="22"/>
+              </w:rPr>
+              <w:t xml:space="preserve">1:50</w:t>
+            </w:r>
+          </w:p>
+        </w:tc>
+        <w:tc>
+          <w:tcPr>
+            <w:tcW w:w="1000" w:type="dxa"/>
+          </w:tcPr>
+          <w:p>
+            <w:pPr>
+              <w:pStyle w:val="af"/>
+              <w:spacing w:before="0" w:beforeAutospacing="0" w:after="0" w:afterAutospacing="0"/>
+              <w:jc w:val="center"/>
+            </w:pPr>
+            <w:r>
+              <w:rPr>
+                <w:color w:val="000000"/>
+                <w:sz w:val="22"/>
+              </w:rPr>
+              <w:t xml:space="preserve">2:25</w:t>
+            </w:r>
+          </w:p>
+        </w:tc>
+      </w:tr>
+      <w:tr>
+        <w:trPr>
+          <w:cantSplit/>
+        </w:trPr>
+        <w:tc>
+          <w:tcPr>
+            <w:tcW w:w="1150" w:type="dxa"/>
+          </w:tcPr>
+          <w:p>
+            <w:pPr>
+              <w:pStyle w:val="af"/>
+              <w:spacing w:before="0" w:beforeAutospacing="0" w:after="0" w:afterAutospacing="0"/>
+              <w:jc w:val="center"/>
+            </w:pPr>
+            <w:r>
+              <w:rPr>
+                <w:color w:val="000000"/>
+                <w:sz w:val="22"/>
+              </w:rPr>
+              <w:t xml:space="preserve">25</w:t>
+            </w:r>
+          </w:p>
+        </w:tc>
+        <w:tc>
+          <w:tcPr>
+            <w:tcW w:w="1150" w:type="dxa"/>
+          </w:tcPr>
+          <w:p>
+            <w:pPr>
+              <w:pStyle w:val="af"/>
+              <w:spacing w:before="0" w:beforeAutospacing="0" w:after="0" w:afterAutospacing="0"/>
+              <w:jc w:val="center"/>
+            </w:pPr>
+            <w:r>
+              <w:rPr>
+                <w:color w:val="000000"/>
+                <w:sz w:val="22"/>
+              </w:rPr>
+              <w:t xml:space="preserve">5</w:t>
+            </w:r>
+          </w:p>
+        </w:tc>
+        <w:tc>
+          <w:tcPr>
+            <w:tcW w:w="2505" w:type="dxa"/>
+          </w:tcPr>
+          <w:p>
+            <w:pPr>
+              <w:pStyle w:val="af"/>
+              <w:spacing w:before="0" w:beforeAutospacing="0" w:after="0" w:afterAutospacing="0"/>
+              <w:jc w:val="left"/>
+            </w:pPr>
+            <w:r>
+              <w:rPr>
+                <w:color w:val="000000"/>
+                <w:sz w:val="22"/>
+              </w:rPr>
+              <w:t xml:space="preserve">4 ячейки, разные окна</w:t>
+            </w:r>
+          </w:p>
+        </w:tc>
+        <w:tc>
+          <w:tcPr>
+            <w:tcW w:w="1350" w:type="dxa"/>
+          </w:tcPr>
+          <w:p>
+            <w:pPr>
+              <w:pStyle w:val="af"/>
+              <w:spacing w:before="0" w:beforeAutospacing="0" w:after="0" w:afterAutospacing="0"/>
+              <w:jc w:val="center"/>
+            </w:pPr>
+            <w:r>
+              <w:rPr>
+                <w:color w:val="000000"/>
+                <w:sz w:val="22"/>
+              </w:rPr>
+              <w:t xml:space="preserve">87</w:t>
+            </w:r>
+          </w:p>
+        </w:tc>
+        <w:tc>
+          <w:tcPr>
+            <w:tcW w:w="1100" w:type="dxa"/>
+          </w:tcPr>
+          <w:p>
+            <w:pPr>
+              <w:pStyle w:val="af"/>
+              <w:spacing w:before="0" w:beforeAutospacing="0" w:after="0" w:afterAutospacing="0"/>
+              <w:jc w:val="center"/>
+            </w:pPr>
+            <w:r>
+              <w:rPr>
+                <w:color w:val="000000"/>
+                <w:sz w:val="22"/>
+              </w:rPr>
+              <w:t xml:space="preserve">1:20</w:t>
+            </w:r>
+          </w:p>
+        </w:tc>
+        <w:tc>
+          <w:tcPr>
+            <w:tcW w:w="1100" w:type="dxa"/>
+          </w:tcPr>
+          <w:p>
+            <w:pPr>
+              <w:pStyle w:val="af"/>
+              <w:spacing w:before="0" w:beforeAutospacing="0" w:after="0" w:afterAutospacing="0"/>
+              <w:jc w:val="center"/>
+            </w:pPr>
+            <w:r>
+              <w:rPr>
+                <w:color w:val="000000"/>
+                <w:sz w:val="22"/>
+              </w:rPr>
+              <w:t xml:space="preserve">1:50</w:t>
+            </w:r>
+          </w:p>
+        </w:tc>
+        <w:tc>
+          <w:tcPr>
+            <w:tcW w:w="1000" w:type="dxa"/>
+          </w:tcPr>
+          <w:p>
+            <w:pPr>
+              <w:pStyle w:val="af"/>
+              <w:spacing w:before="0" w:beforeAutospacing="0" w:after="0" w:afterAutospacing="0"/>
+              <w:jc w:val="center"/>
+            </w:pPr>
+            <w:r>
+              <w:rPr>
+                <w:color w:val="000000"/>
+                <w:sz w:val="22"/>
+              </w:rPr>
+              <w:t xml:space="preserve">2:30</w:t>
+            </w:r>
+          </w:p>
+        </w:tc>
+      </w:tr>
+      <w:tr>
+        <w:trPr>
+          <w:cantSplit/>
+        </w:trPr>
+        <w:tc>
+          <w:tcPr>
+            <w:tcW w:w="1150" w:type="dxa"/>
+          </w:tcPr>
+          <w:p>
+            <w:pPr>
+              <w:pStyle w:val="af"/>
+              <w:spacing w:before="0" w:beforeAutospacing="0" w:after="0" w:afterAutospacing="0"/>
+              <w:jc w:val="center"/>
+            </w:pPr>
+            <w:r>
+              <w:rPr>
+                <w:color w:val="000000"/>
+                <w:sz w:val="22"/>
+              </w:rPr>
+              <w:t xml:space="preserve">26</w:t>
+            </w:r>
+          </w:p>
+        </w:tc>
+        <w:tc>
+          <w:tcPr>
+            <w:tcW w:w="1150" w:type="dxa"/>
+          </w:tcPr>
+          <w:p>
+            <w:pPr>
+              <w:pStyle w:val="af"/>
+              <w:spacing w:before="0" w:beforeAutospacing="0" w:after="0" w:afterAutospacing="0"/>
+              <w:jc w:val="center"/>
+            </w:pPr>
+            <w:r>
+              <w:rPr>
+                <w:color w:val="000000"/>
+                <w:sz w:val="22"/>
+              </w:rPr>
+              <w:t xml:space="preserve">6</w:t>
+            </w:r>
+          </w:p>
+        </w:tc>
+        <w:tc>
+          <w:tcPr>
+            <w:tcW w:w="2505" w:type="dxa"/>
+          </w:tcPr>
+          <w:p>
+            <w:pPr>
+              <w:pStyle w:val="af"/>
+              <w:spacing w:before="0" w:beforeAutospacing="0" w:after="0" w:afterAutospacing="0"/>
+              <w:jc w:val="left"/>
+            </w:pPr>
+            <w:r>
+              <w:rPr>
+                <w:color w:val="000000"/>
+                <w:sz w:val="22"/>
+              </w:rPr>
+              <w:t xml:space="preserve">1 сейф</w:t>
+            </w:r>
+          </w:p>
+        </w:tc>
+        <w:tc>
+          <w:tcPr>
+            <w:tcW w:w="1350" w:type="dxa"/>
+          </w:tcPr>
+          <w:p>
+            <w:pPr>
+              <w:pStyle w:val="af"/>
+              <w:spacing w:before="0" w:beforeAutospacing="0" w:after="0" w:afterAutospacing="0"/>
+              <w:jc w:val="center"/>
+            </w:pPr>
+            <w:r>
+              <w:rPr>
+                <w:color w:val="000000"/>
+                <w:sz w:val="22"/>
+              </w:rPr>
+              <w:t xml:space="preserve">60</w:t>
+            </w:r>
+          </w:p>
+        </w:tc>
+        <w:tc>
+          <w:tcPr>
+            <w:tcW w:w="1100" w:type="dxa"/>
+          </w:tcPr>
+          <w:p>
+            <w:pPr>
+              <w:pStyle w:val="af"/>
+              <w:spacing w:before="0" w:beforeAutospacing="0" w:after="0" w:afterAutospacing="0"/>
+              <w:jc w:val="center"/>
+            </w:pPr>
+            <w:r>
+              <w:rPr>
+                <w:color w:val="000000"/>
+                <w:sz w:val="22"/>
+              </w:rPr>
+              <w:t xml:space="preserve">0:50</w:t>
+            </w:r>
+          </w:p>
+        </w:tc>
+        <w:tc>
+          <w:tcPr>
+            <w:tcW w:w="1100" w:type="dxa"/>
+          </w:tcPr>
+          <w:p>
+            <w:pPr>
+              <w:pStyle w:val="af"/>
+              <w:spacing w:before="0" w:beforeAutospacing="0" w:after="0" w:afterAutospacing="0"/>
+              <w:jc w:val="center"/>
+            </w:pPr>
+            <w:r>
+              <w:rPr>
+                <w:color w:val="000000"/>
+                <w:sz w:val="22"/>
+              </w:rPr>
+              <w:t xml:space="preserve">1:10</w:t>
+            </w:r>
+          </w:p>
+        </w:tc>
+        <w:tc>
+          <w:tcPr>
+            <w:tcW w:w="1000" w:type="dxa"/>
+          </w:tcPr>
+          <w:p>
+            <w:pPr>
+              <w:pStyle w:val="af"/>
+              <w:spacing w:before="0" w:beforeAutospacing="0" w:after="0" w:afterAutospacing="0"/>
+              <w:jc w:val="center"/>
+            </w:pPr>
+            <w:r>
+              <w:rPr>
+                <w:color w:val="000000"/>
+                <w:sz w:val="22"/>
+              </w:rPr>
+              <w:t xml:space="preserve">1:40</w:t>
+            </w:r>
+          </w:p>
+        </w:tc>
+      </w:tr>
+      <w:tr>
+        <w:trPr>
+          <w:cantSplit/>
+        </w:trPr>
+        <w:tc>
+          <w:tcPr>
+            <w:tcW w:w="1150" w:type="dxa"/>
+          </w:tcPr>
+          <w:p>
+            <w:pPr>
+              <w:pStyle w:val="af"/>
+              <w:spacing w:before="0" w:beforeAutospacing="0" w:after="0" w:afterAutospacing="0"/>
+              <w:jc w:val="center"/>
+            </w:pPr>
+            <w:r>
+              <w:rPr>
+                <w:color w:val="000000"/>
+                <w:sz w:val="22"/>
+              </w:rPr>
+              <w:t xml:space="preserve">27</w:t>
+            </w:r>
+          </w:p>
+        </w:tc>
+        <w:tc>
+          <w:tcPr>
+            <w:tcW w:w="1150" w:type="dxa"/>
+          </w:tcPr>
+          <w:p>
+            <w:pPr>
+              <w:pStyle w:val="af"/>
+              <w:spacing w:before="0" w:beforeAutospacing="0" w:after="0" w:afterAutospacing="0"/>
+              <w:jc w:val="center"/>
+            </w:pPr>
+            <w:r>
+              <w:rPr>
+                <w:color w:val="000000"/>
+                <w:sz w:val="22"/>
+              </w:rPr>
+              <w:t xml:space="preserve">6</w:t>
+            </w:r>
+          </w:p>
+        </w:tc>
+        <w:tc>
+          <w:tcPr>
+            <w:tcW w:w="2505" w:type="dxa"/>
+          </w:tcPr>
+          <w:p>
+            <w:pPr>
+              <w:pStyle w:val="af"/>
+              <w:spacing w:before="0" w:beforeAutospacing="0" w:after="0" w:afterAutospacing="0"/>
+              <w:jc w:val="left"/>
+            </w:pPr>
+            <w:r>
+              <w:rPr>
+                <w:color w:val="000000"/>
+                <w:sz w:val="22"/>
+              </w:rPr>
+              <w:t xml:space="preserve">2 сейфа</w:t>
+            </w:r>
+          </w:p>
+        </w:tc>
+        <w:tc>
+          <w:tcPr>
+            <w:tcW w:w="1350" w:type="dxa"/>
+          </w:tcPr>
+          <w:p>
+            <w:pPr>
+              <w:pStyle w:val="af"/>
+              <w:spacing w:before="0" w:beforeAutospacing="0" w:after="0" w:afterAutospacing="0"/>
+              <w:jc w:val="center"/>
+            </w:pPr>
+            <w:r>
+              <w:rPr>
+                <w:color w:val="000000"/>
+                <w:sz w:val="22"/>
+              </w:rPr>
+              <w:t xml:space="preserve">66</w:t>
+            </w:r>
+          </w:p>
+        </w:tc>
+        <w:tc>
+          <w:tcPr>
+            <w:tcW w:w="1100" w:type="dxa"/>
+          </w:tcPr>
+          <w:p>
+            <w:pPr>
+              <w:pStyle w:val="af"/>
+              <w:spacing w:before="0" w:beforeAutospacing="0" w:after="0" w:afterAutospacing="0"/>
+              <w:jc w:val="center"/>
+            </w:pPr>
+            <w:r>
+              <w:rPr>
+                <w:color w:val="000000"/>
+                <w:sz w:val="22"/>
+              </w:rPr>
+              <w:t xml:space="preserve">0:50</w:t>
+            </w:r>
+          </w:p>
+        </w:tc>
+        <w:tc>
+          <w:tcPr>
+            <w:tcW w:w="1100" w:type="dxa"/>
+          </w:tcPr>
+          <w:p>
+            <w:pPr>
+              <w:pStyle w:val="af"/>
+              <w:spacing w:before="0" w:beforeAutospacing="0" w:after="0" w:afterAutospacing="0"/>
+              <w:jc w:val="center"/>
+            </w:pPr>
+            <w:r>
+              <w:rPr>
+                <w:color w:val="000000"/>
+                <w:sz w:val="22"/>
+              </w:rPr>
+              <w:t xml:space="preserve">1:20</w:t>
+            </w:r>
+          </w:p>
+        </w:tc>
+        <w:tc>
+          <w:tcPr>
+            <w:tcW w:w="1000" w:type="dxa"/>
+          </w:tcPr>
+          <w:p>
+            <w:pPr>
+              <w:pStyle w:val="af"/>
+              <w:spacing w:before="0" w:beforeAutospacing="0" w:after="0" w:afterAutospacing="0"/>
+              <w:jc w:val="center"/>
+            </w:pPr>
+            <w:r>
+              <w:rPr>
+                <w:color w:val="000000"/>
+                <w:sz w:val="22"/>
+              </w:rPr>
+              <w:t xml:space="preserve">1:50</w:t>
+            </w:r>
+          </w:p>
+        </w:tc>
+      </w:tr>
+      <w:tr>
+        <w:trPr>
+          <w:cantSplit/>
+        </w:trPr>
+        <w:tc>
+          <w:tcPr>
+            <w:tcW w:w="1150" w:type="dxa"/>
+          </w:tcPr>
+          <w:p>
+            <w:pPr>
+              <w:pStyle w:val="af"/>
+              <w:spacing w:before="0" w:beforeAutospacing="0" w:after="0" w:afterAutospacing="0"/>
+              <w:jc w:val="center"/>
+            </w:pPr>
+            <w:r>
+              <w:rPr>
+                <w:color w:val="000000"/>
+                <w:sz w:val="22"/>
+              </w:rPr>
+              <w:t xml:space="preserve">28</w:t>
+            </w:r>
+          </w:p>
+        </w:tc>
+        <w:tc>
+          <w:tcPr>
+            <w:tcW w:w="1150" w:type="dxa"/>
+          </w:tcPr>
+          <w:p>
+            <w:pPr>
+              <w:pStyle w:val="af"/>
+              <w:spacing w:before="0" w:beforeAutospacing="0" w:after="0" w:afterAutospacing="0"/>
+              <w:jc w:val="center"/>
+            </w:pPr>
+            <w:r>
+              <w:rPr>
+                <w:color w:val="000000"/>
+                <w:sz w:val="22"/>
+              </w:rPr>
+              <w:t xml:space="preserve">6</w:t>
+            </w:r>
+          </w:p>
+        </w:tc>
+        <w:tc>
+          <w:tcPr>
+            <w:tcW w:w="2505" w:type="dxa"/>
+          </w:tcPr>
+          <w:p>
+            <w:pPr>
+              <w:pStyle w:val="af"/>
+              <w:spacing w:before="0" w:beforeAutospacing="0" w:after="0" w:afterAutospacing="0"/>
+              <w:jc w:val="left"/>
+            </w:pPr>
+            <w:r>
+              <w:rPr>
+                <w:color w:val="000000"/>
+                <w:sz w:val="22"/>
+              </w:rPr>
+              <w:t xml:space="preserve">3 сейфа</w:t>
+            </w:r>
+          </w:p>
+        </w:tc>
+        <w:tc>
+          <w:tcPr>
+            <w:tcW w:w="1350" w:type="dxa"/>
+          </w:tcPr>
+          <w:p>
+            <w:pPr>
+              <w:pStyle w:val="af"/>
+              <w:spacing w:before="0" w:beforeAutospacing="0" w:after="0" w:afterAutospacing="0"/>
+              <w:jc w:val="center"/>
+            </w:pPr>
+            <w:r>
+              <w:rPr>
+                <w:color w:val="000000"/>
+                <w:sz w:val="22"/>
+              </w:rPr>
+              <w:t xml:space="preserve">72</w:t>
+            </w:r>
+          </w:p>
+        </w:tc>
+        <w:tc>
+          <w:tcPr>
+            <w:tcW w:w="1100" w:type="dxa"/>
+          </w:tcPr>
+          <w:p>
+            <w:pPr>
+              <w:pStyle w:val="af"/>
+              <w:spacing w:before="0" w:beforeAutospacing="0" w:after="0" w:afterAutospacing="0"/>
+              <w:jc w:val="center"/>
+            </w:pPr>
+            <w:r>
+              <w:rPr>
+                <w:color w:val="000000"/>
+                <w:sz w:val="22"/>
+              </w:rPr>
+              <w:t xml:space="preserve">1:10</w:t>
+            </w:r>
+          </w:p>
+        </w:tc>
+        <w:tc>
+          <w:tcPr>
+            <w:tcW w:w="1100" w:type="dxa"/>
+          </w:tcPr>
+          <w:p>
+            <w:pPr>
+              <w:pStyle w:val="af"/>
+              <w:spacing w:before="0" w:beforeAutospacing="0" w:after="0" w:afterAutospacing="0"/>
+              <w:jc w:val="center"/>
+            </w:pPr>
+            <w:r>
+              <w:rPr>
+                <w:color w:val="000000"/>
+                <w:sz w:val="22"/>
+              </w:rPr>
+              <w:t xml:space="preserve">1:40</w:t>
+            </w:r>
+          </w:p>
+        </w:tc>
+        <w:tc>
+          <w:tcPr>
+            <w:tcW w:w="1000" w:type="dxa"/>
+          </w:tcPr>
+          <w:p>
+            <w:pPr>
+              <w:pStyle w:val="af"/>
+              <w:spacing w:before="0" w:beforeAutospacing="0" w:after="0" w:afterAutospacing="0"/>
+              <w:jc w:val="center"/>
+            </w:pPr>
+            <w:r>
+              <w:rPr>
+                <w:color w:val="000000"/>
+                <w:sz w:val="22"/>
+              </w:rPr>
+              <w:t xml:space="preserve">2:00</w:t>
+            </w:r>
+          </w:p>
+        </w:tc>
+      </w:tr>
+      <w:tr>
+        <w:trPr>
+          <w:cantSplit/>
+        </w:trPr>
+        <w:tc>
+          <w:tcPr>
+            <w:tcW w:w="1150" w:type="dxa"/>
+          </w:tcPr>
+          <w:p>
+            <w:pPr>
+              <w:pStyle w:val="af"/>
+              <w:spacing w:before="0" w:beforeAutospacing="0" w:after="0" w:afterAutospacing="0"/>
+              <w:jc w:val="center"/>
+            </w:pPr>
+            <w:r>
+              <w:rPr>
+                <w:color w:val="000000"/>
+                <w:sz w:val="22"/>
+              </w:rPr>
+              <w:t xml:space="preserve">29</w:t>
+            </w:r>
+          </w:p>
+        </w:tc>
+        <w:tc>
+          <w:tcPr>
+            <w:tcW w:w="1150" w:type="dxa"/>
+          </w:tcPr>
+          <w:p>
+            <w:pPr>
+              <w:pStyle w:val="af"/>
+              <w:spacing w:before="0" w:beforeAutospacing="0" w:after="0" w:afterAutospacing="0"/>
+              <w:jc w:val="center"/>
+            </w:pPr>
+            <w:r>
+              <w:rPr>
+                <w:color w:val="000000"/>
+                <w:sz w:val="22"/>
+              </w:rPr>
+              <w:t xml:space="preserve">6</w:t>
+            </w:r>
+          </w:p>
+        </w:tc>
+        <w:tc>
+          <w:tcPr>
+            <w:tcW w:w="2505" w:type="dxa"/>
+          </w:tcPr>
+          <w:p>
+            <w:pPr>
+              <w:pStyle w:val="af"/>
+              <w:spacing w:before="0" w:beforeAutospacing="0" w:after="0" w:afterAutospacing="0"/>
+              <w:jc w:val="left"/>
+            </w:pPr>
+            <w:r>
+              <w:rPr>
+                <w:color w:val="000000"/>
+                <w:sz w:val="22"/>
+              </w:rPr>
+              <w:t xml:space="preserve">4 сейфа</w:t>
+            </w:r>
+          </w:p>
+        </w:tc>
+        <w:tc>
+          <w:tcPr>
+            <w:tcW w:w="1350" w:type="dxa"/>
+          </w:tcPr>
+          <w:p>
+            <w:pPr>
+              <w:pStyle w:val="af"/>
+              <w:spacing w:before="0" w:beforeAutospacing="0" w:after="0" w:afterAutospacing="0"/>
+              <w:jc w:val="center"/>
+            </w:pPr>
+            <w:r>
+              <w:rPr>
+                <w:color w:val="000000"/>
+                <w:sz w:val="22"/>
+              </w:rPr>
+              <w:t xml:space="preserve">78</w:t>
+            </w:r>
+          </w:p>
+        </w:tc>
+        <w:tc>
+          <w:tcPr>
+            <w:tcW w:w="1100" w:type="dxa"/>
+          </w:tcPr>
+          <w:p>
+            <w:pPr>
+              <w:pStyle w:val="af"/>
+              <w:spacing w:before="0" w:beforeAutospacing="0" w:after="0" w:afterAutospacing="0"/>
+              <w:jc w:val="center"/>
+            </w:pPr>
+            <w:r>
+              <w:rPr>
+                <w:color w:val="000000"/>
+                <w:sz w:val="22"/>
+              </w:rPr>
+              <w:t xml:space="preserve">1:10</w:t>
+            </w:r>
+          </w:p>
+        </w:tc>
+        <w:tc>
+          <w:tcPr>
+            <w:tcW w:w="1100" w:type="dxa"/>
+          </w:tcPr>
+          <w:p>
+            <w:pPr>
+              <w:pStyle w:val="af"/>
+              <w:spacing w:before="0" w:beforeAutospacing="0" w:after="0" w:afterAutospacing="0"/>
+              <w:jc w:val="center"/>
+            </w:pPr>
+            <w:r>
+              <w:rPr>
+                <w:color w:val="000000"/>
+                <w:sz w:val="22"/>
+              </w:rPr>
+              <w:t xml:space="preserve">1:40</w:t>
+            </w:r>
+          </w:p>
+        </w:tc>
+        <w:tc>
+          <w:tcPr>
+            <w:tcW w:w="1000" w:type="dxa"/>
+          </w:tcPr>
+          <w:p>
+            <w:pPr>
+              <w:pStyle w:val="af"/>
+              <w:spacing w:before="0" w:beforeAutospacing="0" w:after="0" w:afterAutospacing="0"/>
+              <w:jc w:val="center"/>
+            </w:pPr>
+            <w:r>
+              <w:rPr>
+                <w:color w:val="000000"/>
+                <w:sz w:val="22"/>
+              </w:rPr>
+              <w:t xml:space="preserve">2:10</w:t>
+            </w:r>
+          </w:p>
+        </w:tc>
+      </w:tr>
+      <w:tr>
+        <w:trPr>
+          <w:cantSplit/>
+        </w:trPr>
+        <w:tc>
+          <w:tcPr>
+            <w:tcW w:w="1150" w:type="dxa"/>
+          </w:tcPr>
+          <w:p>
+            <w:pPr>
+              <w:pStyle w:val="af"/>
+              <w:spacing w:before="0" w:beforeAutospacing="0" w:after="0" w:afterAutospacing="0"/>
+              <w:jc w:val="center"/>
+            </w:pPr>
+            <w:r>
+              <w:rPr>
+                <w:color w:val="000000"/>
+                <w:sz w:val="22"/>
+              </w:rPr>
+              <w:t xml:space="preserve">30</w:t>
+            </w:r>
+          </w:p>
+        </w:tc>
+        <w:tc>
+          <w:tcPr>
+            <w:tcW w:w="1150" w:type="dxa"/>
+          </w:tcPr>
+          <w:p>
+            <w:pPr>
+              <w:pStyle w:val="af"/>
+              <w:spacing w:before="0" w:beforeAutospacing="0" w:after="0" w:afterAutospacing="0"/>
+              <w:jc w:val="center"/>
+            </w:pPr>
+            <w:r>
+              <w:rPr>
+                <w:color w:val="000000"/>
+                <w:sz w:val="22"/>
+              </w:rPr>
+              <w:t xml:space="preserve">6</w:t>
+            </w:r>
+          </w:p>
+        </w:tc>
+        <w:tc>
+          <w:tcPr>
+            <w:tcW w:w="2505" w:type="dxa"/>
+          </w:tcPr>
+          <w:p>
+            <w:pPr>
+              <w:pStyle w:val="af"/>
+              <w:spacing w:before="0" w:beforeAutospacing="0" w:after="0" w:afterAutospacing="0"/>
+              <w:jc w:val="left"/>
+            </w:pPr>
+            <w:r>
+              <w:rPr>
+                <w:color w:val="000000"/>
+                <w:sz w:val="22"/>
+              </w:rPr>
+              <w:t xml:space="preserve">4 сейфа</w:t>
+            </w:r>
+          </w:p>
+        </w:tc>
+        <w:tc>
+          <w:tcPr>
+            <w:tcW w:w="1350" w:type="dxa"/>
+          </w:tcPr>
+          <w:p>
+            <w:pPr>
+              <w:pStyle w:val="af"/>
+              <w:spacing w:before="0" w:beforeAutospacing="0" w:after="0" w:afterAutospacing="0"/>
+              <w:jc w:val="center"/>
+            </w:pPr>
+            <w:r>
+              <w:rPr>
+                <w:color w:val="000000"/>
+                <w:sz w:val="22"/>
+              </w:rPr>
+              <w:t xml:space="preserve">84</w:t>
+            </w:r>
+          </w:p>
+        </w:tc>
+        <w:tc>
+          <w:tcPr>
+            <w:tcW w:w="1100" w:type="dxa"/>
+          </w:tcPr>
+          <w:p>
+            <w:pPr>
+              <w:pStyle w:val="af"/>
+              <w:spacing w:before="0" w:beforeAutospacing="0" w:after="0" w:afterAutospacing="0"/>
+              <w:jc w:val="center"/>
+            </w:pPr>
+            <w:r>
+              <w:rPr>
+                <w:color w:val="000000"/>
+                <w:sz w:val="22"/>
+              </w:rPr>
+              <w:t xml:space="preserve">1:20</w:t>
+            </w:r>
+          </w:p>
+        </w:tc>
+        <w:tc>
+          <w:tcPr>
+            <w:tcW w:w="1100" w:type="dxa"/>
+          </w:tcPr>
+          <w:p>
+            <w:pPr>
+              <w:pStyle w:val="af"/>
+              <w:spacing w:before="0" w:beforeAutospacing="0" w:after="0" w:afterAutospacing="0"/>
+              <w:jc w:val="center"/>
+            </w:pPr>
+            <w:r>
+              <w:rPr>
+                <w:color w:val="000000"/>
+                <w:sz w:val="22"/>
+              </w:rPr>
+              <w:t xml:space="preserve">1:50</w:t>
+            </w:r>
+          </w:p>
+        </w:tc>
+        <w:tc>
+          <w:tcPr>
+            <w:tcW w:w="1000" w:type="dxa"/>
+          </w:tcPr>
+          <w:p>
+            <w:pPr>
+              <w:pStyle w:val="af"/>
+              <w:spacing w:before="0" w:beforeAutospacing="0" w:after="0" w:afterAutospacing="0"/>
+              <w:jc w:val="center"/>
+            </w:pPr>
+            <w:r>
+              <w:rPr>
+                <w:color w:val="000000"/>
+                <w:sz w:val="22"/>
+              </w:rPr>
+              <w:t xml:space="preserve">2:20</w:t>
+            </w:r>
+          </w:p>
+        </w:tc>
+      </w:tr>
+    </w:tbl>
+    <w:p>
+      <w:pPr>
+        <w:ind w:firstLine="0"/>
+        <w:jc w:val="center"/>
+      </w:pPr>
+      <w:r>
+        <w:t xml:space="preserve">Уровни кампании по главам</w:t>
+      </w:r>
+    </w:p>
+    <w:p>
+      <w:pPr>
+        <w:pStyle w:val="af"/>
+        <w:spacing w:before="0" w:beforeAutospacing="0" w:after="0" w:afterAutospacing="0"/>
+        <w:ind w:firstLine="709"/>
+        <w:jc w:val="both"/>
+      </w:pPr>
+      <w:r>
+        <w:rPr>
+          <w:color w:val="000000"/>
+        </w:rPr>
+        <w:t xml:space="preserve">Для уровней 11-15 указано стартовое количество предметов. Время на звезды для уровней 11-15 и 21-30 пересчитано вместе с лимитом и будет уточняться по плейтестам.</w:t>
       </w:r>
     </w:p>
     <w:sectPr>

</xml_diff>